<commit_message>
This is the good code as of february 2026
</commit_message>
<xml_diff>
--- a/Socio_and_Sagabz/Formats/socio_format_new.docx
+++ b/Socio_and_Sagabz/Formats/socio_format_new.docx
@@ -1,6 +1,6 @@
 
 <file path=word/document.xml><?xml version="1.0" encoding="utf-8"?>
-<w:document xmlns:wpc="http://schemas.microsoft.com/office/word/2010/wordprocessingCanvas" xmlns:cx="http://schemas.microsoft.com/office/drawing/2014/chartex" xmlns:cx1="http://schemas.microsoft.com/office/drawing/2015/9/8/chartex" xmlns:cx2="http://schemas.microsoft.com/office/drawing/2015/10/21/chartex" xmlns:cx3="http://schemas.microsoft.com/office/drawing/2016/5/9/chartex" xmlns:cx4="http://schemas.microsoft.com/office/drawing/2016/5/10/chartex" xmlns:cx5="http://schemas.microsoft.com/office/drawing/2016/5/11/chartex" xmlns:cx6="http://schemas.microsoft.com/office/drawing/2016/5/12/chartex" xmlns:cx7="http://schemas.microsoft.com/office/drawing/2016/5/13/chartex" xmlns:cx8="http://schemas.microsoft.com/office/drawing/2016/5/14/chartex" xmlns:mc="http://schemas.openxmlformats.org/markup-compatibility/2006" xmlns:aink="http://schemas.microsoft.com/office/drawing/2016/ink" xmlns:am3d="http://schemas.microsoft.com/office/drawing/2017/model3d" xmlns:o="urn:schemas-microsoft-com:office:office" xmlns:oel="http://schemas.microsoft.com/office/2019/extlst" xmlns:r="http://schemas.openxmlformats.org/officeDocument/2006/relationships" xmlns:m="http://schemas.openxmlformats.org/officeDocument/2006/math" xmlns:v="urn:schemas-microsoft-com:vml" xmlns:wp14="http://schemas.microsoft.com/office/word/2010/wordprocessingDrawing" xmlns:wp="http://schemas.openxmlformats.org/drawingml/2006/wordprocessingDrawing" xmlns:w10="urn:schemas-microsoft-com:office:word" xmlns:w="http://schemas.openxmlformats.org/wordprocessingml/2006/main" xmlns:w14="http://schemas.microsoft.com/office/word/2010/wordml" xmlns:w15="http://schemas.microsoft.com/office/word/2012/wordml" xmlns:w16cex="http://schemas.microsoft.com/office/word/2018/wordml/cex" xmlns:w16cid="http://schemas.microsoft.com/office/word/2016/wordml/cid" xmlns:w16="http://schemas.microsoft.com/office/word/2018/wordml" xmlns:w16du="http://schemas.microsoft.com/office/word/2023/wordml/word16du" xmlns:w16sdtdh="http://schemas.microsoft.com/office/word/2020/wordml/sdtdatahash" xmlns:w16sdtfl="http://schemas.microsoft.com/office/word/2024/wordml/sdtformatlock" xmlns:w16se="http://schemas.microsoft.com/office/word/2015/wordml/symex" xmlns:wpg="http://schemas.microsoft.com/office/word/2010/wordprocessingGroup" xmlns:wpi="http://schemas.microsoft.com/office/word/2010/wordprocessingInk" xmlns:wne="http://schemas.microsoft.com/office/word/2006/wordml" xmlns:wps="http://schemas.microsoft.com/office/word/2010/wordprocessingShape" mc:Ignorable="w14 w15 w16se w16cid w16 w16cex w16sdtdh w16sdtfl w16du wp14">
+<w:document xmlns:wpc="http://schemas.microsoft.com/office/word/2010/wordprocessingCanvas" xmlns:cx="http://schemas.microsoft.com/office/drawing/2014/chartex" xmlns:cx1="http://schemas.microsoft.com/office/drawing/2015/9/8/chartex" xmlns:cx2="http://schemas.microsoft.com/office/drawing/2015/10/21/chartex" xmlns:cx3="http://schemas.microsoft.com/office/drawing/2016/5/9/chartex" xmlns:cx4="http://schemas.microsoft.com/office/drawing/2016/5/10/chartex" xmlns:cx5="http://schemas.microsoft.com/office/drawing/2016/5/11/chartex" xmlns:cx6="http://schemas.microsoft.com/office/drawing/2016/5/12/chartex" xmlns:cx7="http://schemas.microsoft.com/office/drawing/2016/5/13/chartex" xmlns:cx8="http://schemas.microsoft.com/office/drawing/2016/5/14/chartex" xmlns:mc="http://schemas.openxmlformats.org/markup-compatibility/2006" xmlns:aink="http://schemas.microsoft.com/office/drawing/2016/ink" xmlns:am3d="http://schemas.microsoft.com/office/drawing/2017/model3d" xmlns:o="urn:schemas-microsoft-com:office:office" xmlns:r="http://schemas.openxmlformats.org/officeDocument/2006/relationships" xmlns:m="http://schemas.openxmlformats.org/officeDocument/2006/math" xmlns:v="urn:schemas-microsoft-com:vml" xmlns:wp14="http://schemas.microsoft.com/office/word/2010/wordprocessingDrawing" xmlns:wp="http://schemas.openxmlformats.org/drawingml/2006/wordprocessingDrawing" xmlns:w10="urn:schemas-microsoft-com:office:word" xmlns:w="http://schemas.openxmlformats.org/wordprocessingml/2006/main" xmlns:w14="http://schemas.microsoft.com/office/word/2010/wordml" xmlns:w15="http://schemas.microsoft.com/office/word/2012/wordml" xmlns:w16cid="http://schemas.microsoft.com/office/word/2016/wordml/cid" xmlns:w16se="http://schemas.microsoft.com/office/word/2015/wordml/symex" xmlns:wpg="http://schemas.microsoft.com/office/word/2010/wordprocessingGroup" xmlns:wpi="http://schemas.microsoft.com/office/word/2010/wordprocessingInk" xmlns:wne="http://schemas.microsoft.com/office/word/2006/wordml" xmlns:wps="http://schemas.microsoft.com/office/word/2010/wordprocessingShape" mc:Ignorable="w14 w15 w16se w16cid wp14">
   <w:body>
     <w:p>
       <w:pPr>
@@ -233,7 +233,7 @@
                                 <w:szCs w:val="22"/>
                                 <w:rtl/>
                               </w:rPr>
-                              <w:t>‏20 מאי 2025</w:t>
+                              <w:t>‏21 דצמבר 2025</w:t>
                             </w:r>
                             <w:r>
                               <w:rPr>
@@ -322,7 +322,7 @@
                                 <w:szCs w:val="22"/>
                                 <w:rtl/>
                               </w:rPr>
-                              <w:t>‏כ"ב אייר תשפ"ה</w:t>
+                              <w:t>‏א' טבת תשפ"ו</w:t>
                             </w:r>
                             <w:r>
                               <w:rPr>
@@ -360,7 +360,7 @@
                 <v:stroke joinstyle="miter"/>
                 <v:path gradientshapeok="t" o:connecttype="rect"/>
               </v:shapetype>
-              <v:shape id="Text Box 1" o:spid="_x0000_s1026" type="#_x0000_t202" style="position:absolute;left:0;text-align:left;margin-left:0;margin-top:-12.55pt;width:112.8pt;height:1in;z-index:251663360;visibility:visible;mso-wrap-style:square;mso-width-percent:0;mso-height-percent:0;mso-wrap-distance-left:9pt;mso-wrap-distance-top:0;mso-wrap-distance-right:9pt;mso-wrap-distance-bottom:0;mso-position-horizontal:left;mso-position-horizontal-relative:margin;mso-position-vertical:absolute;mso-position-vertical-relative:text;mso-width-percent:0;mso-height-percent:0;mso-width-relative:margin;mso-height-relative:margin;v-text-anchor:top" o:gfxdata="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" fillcolor="white [3201]" strokecolor="white [3212]" strokeweight=".5pt">
+              <v:shape id="Text Box 1" o:spid="_x0000_s1026" type="#_x0000_t202" style="position:absolute;left:0;text-align:left;margin-left:0;margin-top:-12.55pt;width:112.8pt;height:1in;z-index:251663360;visibility:visible;mso-wrap-style:square;mso-width-percent:0;mso-height-percent:0;mso-wrap-distance-left:9pt;mso-wrap-distance-top:0;mso-wrap-distance-right:9pt;mso-wrap-distance-bottom:0;mso-position-horizontal:left;mso-position-horizontal-relative:margin;mso-position-vertical:absolute;mso-position-vertical-relative:text;mso-width-percent:0;mso-height-percent:0;mso-width-relative:margin;mso-height-relative:margin;v-text-anchor:top" o:gfxdata="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" fillcolor="white [3201]" strokecolor="white [3212]" strokeweight=".5pt">
                 <v:textbox>
                   <w:txbxContent>
                     <w:p>
@@ -471,7 +471,7 @@
                           <w:szCs w:val="22"/>
                           <w:rtl/>
                         </w:rPr>
-                        <w:t>‏20 מאי 2025</w:t>
+                        <w:t>‏21 דצמבר 2025</w:t>
                       </w:r>
                       <w:r>
                         <w:rPr>
@@ -560,7 +560,7 @@
                           <w:szCs w:val="22"/>
                           <w:rtl/>
                         </w:rPr>
-                        <w:t>‏כ"ב אייר תשפ"ה</w:t>
+                        <w:t>‏א' טבת תשפ"ו</w:t>
                       </w:r>
                       <w:r>
                         <w:rPr>
@@ -759,10 +759,14 @@
       <w:tblGrid>
         <w:gridCol w:w="1239"/>
         <w:gridCol w:w="1170"/>
-        <w:gridCol w:w="1440"/>
-        <w:gridCol w:w="1325"/>
-        <w:gridCol w:w="1288"/>
-        <w:gridCol w:w="1620"/>
+        <w:gridCol w:w="1332"/>
+        <w:gridCol w:w="108"/>
+        <w:gridCol w:w="1224"/>
+        <w:gridCol w:w="101"/>
+        <w:gridCol w:w="1231"/>
+        <w:gridCol w:w="57"/>
+        <w:gridCol w:w="1275"/>
+        <w:gridCol w:w="345"/>
         <w:gridCol w:w="988"/>
       </w:tblGrid>
       <w:tr>
@@ -807,6 +811,7 @@
         <w:tc>
           <w:tcPr>
             <w:tcW w:w="1440" w:type="dxa"/>
+            <w:gridSpan w:val="2"/>
             <w:vAlign w:val="center"/>
           </w:tcPr>
           <w:p>
@@ -865,6 +870,7 @@
         <w:tc>
           <w:tcPr>
             <w:tcW w:w="1325" w:type="dxa"/>
+            <w:gridSpan w:val="2"/>
             <w:vAlign w:val="center"/>
           </w:tcPr>
           <w:p>
@@ -897,6 +903,7 @@
         <w:tc>
           <w:tcPr>
             <w:tcW w:w="1288" w:type="dxa"/>
+            <w:gridSpan w:val="2"/>
             <w:vAlign w:val="center"/>
           </w:tcPr>
           <w:p>
@@ -910,25 +917,25 @@
                 <w:bCs/>
                 <w:i w:val="0"/>
                 <w:iCs w:val="0"/>
-                <w:rtl/>
-              </w:rPr>
-            </w:pPr>
-            <w:r>
-              <w:rPr>
-                <w:rFonts w:ascii="David" w:hAnsi="David" w:cs="David"/>
+              </w:rPr>
+            </w:pPr>
+            <w:r>
+              <w:rPr>
+                <w:rFonts w:ascii="David" w:hAnsi="David" w:cs="David" w:hint="cs"/>
                 <w:b/>
                 <w:bCs/>
                 <w:i w:val="0"/>
                 <w:iCs w:val="0"/>
                 <w:rtl/>
               </w:rPr>
-              <w:t>פיזור</w:t>
+              <w:t>ממוצע מחזורי</w:t>
             </w:r>
           </w:p>
         </w:tc>
         <w:tc>
           <w:tcPr>
             <w:tcW w:w="1620" w:type="dxa"/>
+            <w:gridSpan w:val="2"/>
             <w:vAlign w:val="center"/>
           </w:tcPr>
           <w:p>
@@ -947,14 +954,14 @@
             </w:pPr>
             <w:r>
               <w:rPr>
-                <w:rFonts w:ascii="David" w:hAnsi="David" w:cs="David"/>
+                <w:rFonts w:ascii="David" w:hAnsi="David" w:cs="David" w:hint="cs"/>
                 <w:b/>
                 <w:bCs/>
                 <w:i w:val="0"/>
                 <w:iCs w:val="0"/>
                 <w:rtl/>
               </w:rPr>
-              <w:t>ממוצע מחזורי</w:t>
+              <w:t>פיזור</w:t>
             </w:r>
           </w:p>
         </w:tc>
@@ -1082,6 +1089,7 @@
         <w:tc>
           <w:tcPr>
             <w:tcW w:w="1440" w:type="dxa"/>
+            <w:gridSpan w:val="2"/>
             <w:vAlign w:val="center"/>
           </w:tcPr>
           <w:p>
@@ -1119,6 +1127,7 @@
         <w:tc>
           <w:tcPr>
             <w:tcW w:w="1325" w:type="dxa"/>
+            <w:gridSpan w:val="2"/>
             <w:vAlign w:val="center"/>
           </w:tcPr>
           <w:p>
@@ -1156,6 +1165,7 @@
         <w:tc>
           <w:tcPr>
             <w:tcW w:w="1288" w:type="dxa"/>
+            <w:gridSpan w:val="2"/>
             <w:vAlign w:val="center"/>
           </w:tcPr>
           <w:p>
@@ -1179,7 +1189,13 @@
               <w:rPr>
                 <w:rFonts w:ascii="David" w:hAnsi="David" w:cs="David"/>
               </w:rPr>
-              <w:t>std knowing</w:t>
+              <w:t>total</w:t>
+            </w:r>
+            <w:r>
+              <w:rPr>
+                <w:rFonts w:ascii="David" w:hAnsi="David" w:cs="David"/>
+              </w:rPr>
+              <w:t xml:space="preserve"> knowing</w:t>
             </w:r>
             <w:r>
               <w:rPr>
@@ -1193,6 +1209,7 @@
         <w:tc>
           <w:tcPr>
             <w:tcW w:w="1620" w:type="dxa"/>
+            <w:gridSpan w:val="2"/>
             <w:vAlign w:val="center"/>
           </w:tcPr>
           <w:p>
@@ -1216,7 +1233,13 @@
               <w:rPr>
                 <w:rFonts w:ascii="David" w:hAnsi="David" w:cs="David"/>
               </w:rPr>
-              <w:t>total knowing</w:t>
+              <w:t>std</w:t>
+            </w:r>
+            <w:r>
+              <w:rPr>
+                <w:rFonts w:ascii="David" w:hAnsi="David" w:cs="David"/>
+              </w:rPr>
+              <w:t xml:space="preserve"> knowing</w:t>
             </w:r>
             <w:r>
               <w:rPr>
@@ -1407,6 +1430,7 @@
         <w:tc>
           <w:tcPr>
             <w:tcW w:w="1440" w:type="dxa"/>
+            <w:gridSpan w:val="2"/>
             <w:vAlign w:val="center"/>
           </w:tcPr>
           <w:p>
@@ -1444,6 +1468,7 @@
         <w:tc>
           <w:tcPr>
             <w:tcW w:w="1325" w:type="dxa"/>
+            <w:gridSpan w:val="2"/>
             <w:vAlign w:val="center"/>
           </w:tcPr>
           <w:p>
@@ -1481,6 +1506,7 @@
         <w:tc>
           <w:tcPr>
             <w:tcW w:w="1288" w:type="dxa"/>
+            <w:gridSpan w:val="2"/>
             <w:vAlign w:val="center"/>
           </w:tcPr>
           <w:p>
@@ -1504,7 +1530,13 @@
               <w:rPr>
                 <w:rFonts w:ascii="David" w:hAnsi="David" w:cs="David"/>
               </w:rPr>
-              <w:t>std intrapersonal</w:t>
+              <w:t>total</w:t>
+            </w:r>
+            <w:r>
+              <w:rPr>
+                <w:rFonts w:ascii="David" w:hAnsi="David" w:cs="David"/>
+              </w:rPr>
+              <w:t xml:space="preserve"> intrapersonal</w:t>
             </w:r>
             <w:r>
               <w:rPr>
@@ -1518,6 +1550,7 @@
         <w:tc>
           <w:tcPr>
             <w:tcW w:w="1620" w:type="dxa"/>
+            <w:gridSpan w:val="2"/>
             <w:vAlign w:val="center"/>
           </w:tcPr>
           <w:p>
@@ -1541,7 +1574,19 @@
               <w:rPr>
                 <w:rFonts w:ascii="David" w:hAnsi="David" w:cs="David"/>
               </w:rPr>
-              <w:t>total intrapersonal</w:t>
+              <w:t xml:space="preserve"> std</w:t>
+            </w:r>
+            <w:r>
+              <w:rPr>
+                <w:rFonts w:ascii="David" w:hAnsi="David" w:cs="David"/>
+              </w:rPr>
+              <w:t xml:space="preserve"> </w:t>
+            </w:r>
+            <w:r>
+              <w:rPr>
+                <w:rFonts w:ascii="David" w:hAnsi="David" w:cs="David"/>
+              </w:rPr>
+              <w:t>intrapersonal</w:t>
             </w:r>
             <w:r>
               <w:rPr>
@@ -1642,7 +1687,7 @@
         <w:tc>
           <w:tcPr>
             <w:tcW w:w="6661" w:type="dxa"/>
-            <w:gridSpan w:val="5"/>
+            <w:gridSpan w:val="9"/>
             <w:vAlign w:val="center"/>
           </w:tcPr>
           <w:p>
@@ -1715,7 +1760,23 @@
                 <w:rFonts w:ascii="David" w:hAnsi="David" w:cs="David"/>
                 <w:rtl/>
               </w:rPr>
-              <w:t xml:space="preserve"> מודע לחוזקותיו וחולשותיו ושואף לשיפור עצמי מתמיד</w:t>
+              <w:t xml:space="preserve"> מודע </w:t>
+            </w:r>
+            <w:proofErr w:type="spellStart"/>
+            <w:r>
+              <w:rPr>
+                <w:rFonts w:ascii="David" w:hAnsi="David" w:cs="David"/>
+                <w:rtl/>
+              </w:rPr>
+              <w:t>לחוזקותיו</w:t>
+            </w:r>
+            <w:proofErr w:type="spellEnd"/>
+            <w:r>
+              <w:rPr>
+                <w:rFonts w:ascii="David" w:hAnsi="David" w:cs="David"/>
+                <w:rtl/>
+              </w:rPr>
+              <w:t xml:space="preserve"> וחולשותיו ושואף לשיפור עצמי מתמיד</w:t>
             </w:r>
             <w:r>
               <w:rPr>
@@ -1780,7 +1841,7 @@
                 <w:bCs/>
                 <w:rtl/>
               </w:rPr>
-              <w:t>תפקוד בחברה</w:t>
+              <w:t>יכולות בין אישיות</w:t>
             </w:r>
             <w:r>
               <w:rPr>
@@ -1848,6 +1909,7 @@
         <w:tc>
           <w:tcPr>
             <w:tcW w:w="1440" w:type="dxa"/>
+            <w:gridSpan w:val="2"/>
             <w:vAlign w:val="center"/>
           </w:tcPr>
           <w:p>
@@ -1885,6 +1947,7 @@
         <w:tc>
           <w:tcPr>
             <w:tcW w:w="1325" w:type="dxa"/>
+            <w:gridSpan w:val="2"/>
             <w:vAlign w:val="center"/>
           </w:tcPr>
           <w:p>
@@ -1922,6 +1985,7 @@
         <w:tc>
           <w:tcPr>
             <w:tcW w:w="1288" w:type="dxa"/>
+            <w:gridSpan w:val="2"/>
             <w:vAlign w:val="center"/>
           </w:tcPr>
           <w:p>
@@ -1945,7 +2009,19 @@
               <w:rPr>
                 <w:rFonts w:ascii="David" w:hAnsi="David" w:cs="David"/>
               </w:rPr>
-              <w:t>std functioning in society</w:t>
+              <w:t xml:space="preserve"> total</w:t>
+            </w:r>
+            <w:r>
+              <w:rPr>
+                <w:rFonts w:ascii="David" w:hAnsi="David" w:cs="David"/>
+              </w:rPr>
+              <w:t xml:space="preserve"> </w:t>
+            </w:r>
+            <w:r>
+              <w:rPr>
+                <w:rFonts w:ascii="David" w:hAnsi="David" w:cs="David"/>
+              </w:rPr>
+              <w:t>functioning in society</w:t>
             </w:r>
             <w:r>
               <w:rPr>
@@ -1959,6 +2035,7 @@
         <w:tc>
           <w:tcPr>
             <w:tcW w:w="1620" w:type="dxa"/>
+            <w:gridSpan w:val="2"/>
             <w:vAlign w:val="center"/>
           </w:tcPr>
           <w:p>
@@ -1982,7 +2059,19 @@
               <w:rPr>
                 <w:rFonts w:ascii="David" w:hAnsi="David" w:cs="David"/>
               </w:rPr>
-              <w:t>total functioning in society</w:t>
+              <w:t xml:space="preserve"> std</w:t>
+            </w:r>
+            <w:r>
+              <w:rPr>
+                <w:rFonts w:ascii="David" w:hAnsi="David" w:cs="David"/>
+              </w:rPr>
+              <w:t xml:space="preserve"> </w:t>
+            </w:r>
+            <w:r>
+              <w:rPr>
+                <w:rFonts w:ascii="David" w:hAnsi="David" w:cs="David"/>
+              </w:rPr>
+              <w:t>functioning in society</w:t>
             </w:r>
             <w:r>
               <w:rPr>
@@ -2083,7 +2172,7 @@
         <w:tc>
           <w:tcPr>
             <w:tcW w:w="6661" w:type="dxa"/>
-            <w:gridSpan w:val="5"/>
+            <w:gridSpan w:val="9"/>
             <w:vAlign w:val="center"/>
           </w:tcPr>
           <w:p>
@@ -2221,6 +2310,7 @@
         <w:tc>
           <w:tcPr>
             <w:tcW w:w="1440" w:type="dxa"/>
+            <w:gridSpan w:val="2"/>
             <w:vAlign w:val="center"/>
           </w:tcPr>
           <w:p>
@@ -2257,6 +2347,7 @@
         <w:tc>
           <w:tcPr>
             <w:tcW w:w="1325" w:type="dxa"/>
+            <w:gridSpan w:val="2"/>
             <w:vAlign w:val="center"/>
           </w:tcPr>
           <w:p>
@@ -2293,6 +2384,7 @@
         <w:tc>
           <w:tcPr>
             <w:tcW w:w="1288" w:type="dxa"/>
+            <w:gridSpan w:val="2"/>
             <w:vAlign w:val="center"/>
           </w:tcPr>
           <w:p>
@@ -2315,7 +2407,19 @@
               <w:rPr>
                 <w:rFonts w:ascii="David" w:hAnsi="David" w:cs="David"/>
               </w:rPr>
-              <w:t>std leadership</w:t>
+              <w:t xml:space="preserve"> total</w:t>
+            </w:r>
+            <w:r>
+              <w:rPr>
+                <w:rFonts w:ascii="David" w:hAnsi="David" w:cs="David"/>
+              </w:rPr>
+              <w:t xml:space="preserve"> </w:t>
+            </w:r>
+            <w:r>
+              <w:rPr>
+                <w:rFonts w:ascii="David" w:hAnsi="David" w:cs="David"/>
+              </w:rPr>
+              <w:t>leadership</w:t>
             </w:r>
             <w:r>
               <w:rPr>
@@ -2329,6 +2433,7 @@
         <w:tc>
           <w:tcPr>
             <w:tcW w:w="1620" w:type="dxa"/>
+            <w:gridSpan w:val="2"/>
             <w:vAlign w:val="center"/>
           </w:tcPr>
           <w:p>
@@ -2351,7 +2456,19 @@
               <w:rPr>
                 <w:rFonts w:ascii="David" w:hAnsi="David" w:cs="David"/>
               </w:rPr>
-              <w:t>total leadership</w:t>
+              <w:t xml:space="preserve"> std</w:t>
+            </w:r>
+            <w:r>
+              <w:rPr>
+                <w:rFonts w:ascii="David" w:hAnsi="David" w:cs="David"/>
+              </w:rPr>
+              <w:t xml:space="preserve"> </w:t>
+            </w:r>
+            <w:r>
+              <w:rPr>
+                <w:rFonts w:ascii="David" w:hAnsi="David" w:cs="David"/>
+              </w:rPr>
+              <w:t>leadership</w:t>
             </w:r>
             <w:r>
               <w:rPr>
@@ -2450,7 +2567,7 @@
         <w:tc>
           <w:tcPr>
             <w:tcW w:w="6661" w:type="dxa"/>
-            <w:gridSpan w:val="5"/>
+            <w:gridSpan w:val="9"/>
             <w:vAlign w:val="center"/>
           </w:tcPr>
           <w:p>
@@ -2656,6 +2773,7 @@
         <w:tc>
           <w:tcPr>
             <w:tcW w:w="1440" w:type="dxa"/>
+            <w:gridSpan w:val="2"/>
             <w:vAlign w:val="center"/>
           </w:tcPr>
           <w:p>
@@ -2693,6 +2811,7 @@
         <w:tc>
           <w:tcPr>
             <w:tcW w:w="1325" w:type="dxa"/>
+            <w:gridSpan w:val="2"/>
             <w:vAlign w:val="center"/>
           </w:tcPr>
           <w:p>
@@ -2730,6 +2849,7 @@
         <w:tc>
           <w:tcPr>
             <w:tcW w:w="1288" w:type="dxa"/>
+            <w:gridSpan w:val="2"/>
             <w:vAlign w:val="center"/>
           </w:tcPr>
           <w:p>
@@ -2753,7 +2873,19 @@
               <w:rPr>
                 <w:rFonts w:ascii="David" w:hAnsi="David" w:cs="David"/>
               </w:rPr>
-              <w:t>std conduct</w:t>
+              <w:t xml:space="preserve"> total</w:t>
+            </w:r>
+            <w:r>
+              <w:rPr>
+                <w:rFonts w:ascii="David" w:hAnsi="David" w:cs="David"/>
+              </w:rPr>
+              <w:t xml:space="preserve"> </w:t>
+            </w:r>
+            <w:r>
+              <w:rPr>
+                <w:rFonts w:ascii="David" w:hAnsi="David" w:cs="David"/>
+              </w:rPr>
+              <w:t>conduct</w:t>
             </w:r>
             <w:r>
               <w:rPr>
@@ -2767,6 +2899,7 @@
         <w:tc>
           <w:tcPr>
             <w:tcW w:w="1620" w:type="dxa"/>
+            <w:gridSpan w:val="2"/>
             <w:vAlign w:val="center"/>
           </w:tcPr>
           <w:p>
@@ -2790,7 +2923,19 @@
               <w:rPr>
                 <w:rFonts w:ascii="David" w:hAnsi="David" w:cs="David"/>
               </w:rPr>
-              <w:t>total conduct</w:t>
+              <w:t xml:space="preserve"> std</w:t>
+            </w:r>
+            <w:r>
+              <w:rPr>
+                <w:rFonts w:ascii="David" w:hAnsi="David" w:cs="David"/>
+              </w:rPr>
+              <w:t xml:space="preserve"> </w:t>
+            </w:r>
+            <w:r>
+              <w:rPr>
+                <w:rFonts w:ascii="David" w:hAnsi="David" w:cs="David"/>
+              </w:rPr>
+              <w:t>conduct</w:t>
             </w:r>
             <w:r>
               <w:rPr>
@@ -2889,7 +3034,7 @@
         <w:tc>
           <w:tcPr>
             <w:tcW w:w="6661" w:type="dxa"/>
-            <w:gridSpan w:val="5"/>
+            <w:gridSpan w:val="9"/>
             <w:vAlign w:val="center"/>
           </w:tcPr>
           <w:p>
@@ -3038,6 +3183,7 @@
         <w:tc>
           <w:tcPr>
             <w:tcW w:w="1440" w:type="dxa"/>
+            <w:gridSpan w:val="2"/>
             <w:vAlign w:val="center"/>
           </w:tcPr>
           <w:p>
@@ -3074,6 +3220,7 @@
         <w:tc>
           <w:tcPr>
             <w:tcW w:w="1325" w:type="dxa"/>
+            <w:gridSpan w:val="2"/>
             <w:vAlign w:val="center"/>
           </w:tcPr>
           <w:p>
@@ -3111,6 +3258,7 @@
         <w:tc>
           <w:tcPr>
             <w:tcW w:w="1288" w:type="dxa"/>
+            <w:gridSpan w:val="2"/>
             <w:vAlign w:val="center"/>
           </w:tcPr>
           <w:p>
@@ -3134,7 +3282,19 @@
               <w:rPr>
                 <w:rFonts w:ascii="David" w:hAnsi="David" w:cs="David"/>
               </w:rPr>
-              <w:t xml:space="preserve">std academy </w:t>
+              <w:t xml:space="preserve"> total</w:t>
+            </w:r>
+            <w:r>
+              <w:rPr>
+                <w:rFonts w:ascii="David" w:hAnsi="David" w:cs="David"/>
+              </w:rPr>
+              <w:t xml:space="preserve"> </w:t>
+            </w:r>
+            <w:r>
+              <w:rPr>
+                <w:rFonts w:ascii="David" w:hAnsi="David" w:cs="David"/>
+              </w:rPr>
+              <w:t xml:space="preserve">academy </w:t>
             </w:r>
             <w:r>
               <w:rPr>
@@ -3148,6 +3308,7 @@
         <w:tc>
           <w:tcPr>
             <w:tcW w:w="1620" w:type="dxa"/>
+            <w:gridSpan w:val="2"/>
             <w:vAlign w:val="center"/>
           </w:tcPr>
           <w:p>
@@ -3171,7 +3332,19 @@
               <w:rPr>
                 <w:rFonts w:ascii="David" w:hAnsi="David" w:cs="David"/>
               </w:rPr>
-              <w:t>total academy</w:t>
+              <w:t xml:space="preserve"> std</w:t>
+            </w:r>
+            <w:r>
+              <w:rPr>
+                <w:rFonts w:ascii="David" w:hAnsi="David" w:cs="David"/>
+              </w:rPr>
+              <w:t xml:space="preserve"> </w:t>
+            </w:r>
+            <w:r>
+              <w:rPr>
+                <w:rFonts w:ascii="David" w:hAnsi="David" w:cs="David"/>
+              </w:rPr>
+              <w:t>academy</w:t>
             </w:r>
             <w:r>
               <w:rPr>
@@ -3267,7 +3440,7 @@
         <w:tc>
           <w:tcPr>
             <w:tcW w:w="6661" w:type="dxa"/>
-            <w:gridSpan w:val="5"/>
+            <w:gridSpan w:val="9"/>
             <w:vAlign w:val="center"/>
           </w:tcPr>
           <w:p>
@@ -3414,6 +3587,7 @@
         <w:tc>
           <w:tcPr>
             <w:tcW w:w="1440" w:type="dxa"/>
+            <w:gridSpan w:val="2"/>
             <w:vAlign w:val="center"/>
           </w:tcPr>
           <w:p>
@@ -3449,6 +3623,7 @@
         <w:tc>
           <w:tcPr>
             <w:tcW w:w="1325" w:type="dxa"/>
+            <w:gridSpan w:val="2"/>
             <w:vAlign w:val="center"/>
           </w:tcPr>
           <w:p>
@@ -3485,6 +3660,7 @@
         <w:tc>
           <w:tcPr>
             <w:tcW w:w="1288" w:type="dxa"/>
+            <w:gridSpan w:val="2"/>
             <w:vAlign w:val="center"/>
           </w:tcPr>
           <w:p>
@@ -3507,7 +3683,19 @@
               <w:rPr>
                 <w:rFonts w:ascii="David" w:hAnsi="David" w:cs="David"/>
               </w:rPr>
-              <w:t>std applicative knowledge</w:t>
+              <w:t xml:space="preserve"> total</w:t>
+            </w:r>
+            <w:r>
+              <w:rPr>
+                <w:rFonts w:ascii="David" w:hAnsi="David" w:cs="David"/>
+              </w:rPr>
+              <w:t xml:space="preserve"> </w:t>
+            </w:r>
+            <w:r>
+              <w:rPr>
+                <w:rFonts w:ascii="David" w:hAnsi="David" w:cs="David"/>
+              </w:rPr>
+              <w:t>applicative knowledge</w:t>
             </w:r>
             <w:r>
               <w:rPr>
@@ -3521,6 +3709,7 @@
         <w:tc>
           <w:tcPr>
             <w:tcW w:w="1620" w:type="dxa"/>
+            <w:gridSpan w:val="2"/>
             <w:vAlign w:val="center"/>
           </w:tcPr>
           <w:p>
@@ -3543,7 +3732,19 @@
               <w:rPr>
                 <w:rFonts w:ascii="David" w:hAnsi="David" w:cs="David"/>
               </w:rPr>
-              <w:t>total applicative knowledge</w:t>
+              <w:t xml:space="preserve"> std</w:t>
+            </w:r>
+            <w:r>
+              <w:rPr>
+                <w:rFonts w:ascii="David" w:hAnsi="David" w:cs="David"/>
+              </w:rPr>
+              <w:t xml:space="preserve"> </w:t>
+            </w:r>
+            <w:r>
+              <w:rPr>
+                <w:rFonts w:ascii="David" w:hAnsi="David" w:cs="David"/>
+              </w:rPr>
+              <w:t>applicative knowledge</w:t>
             </w:r>
             <w:r>
               <w:rPr>
@@ -3638,7 +3839,7 @@
         <w:tc>
           <w:tcPr>
             <w:tcW w:w="6661" w:type="dxa"/>
-            <w:gridSpan w:val="5"/>
+            <w:gridSpan w:val="9"/>
             <w:vAlign w:val="center"/>
           </w:tcPr>
           <w:p>
@@ -3798,6 +3999,7 @@
         <w:tc>
           <w:tcPr>
             <w:tcW w:w="1440" w:type="dxa"/>
+            <w:gridSpan w:val="2"/>
             <w:vAlign w:val="center"/>
           </w:tcPr>
           <w:p>
@@ -3835,6 +4037,7 @@
         <w:tc>
           <w:tcPr>
             <w:tcW w:w="1325" w:type="dxa"/>
+            <w:gridSpan w:val="2"/>
             <w:vAlign w:val="center"/>
           </w:tcPr>
           <w:p>
@@ -3872,6 +4075,7 @@
         <w:tc>
           <w:tcPr>
             <w:tcW w:w="1288" w:type="dxa"/>
+            <w:gridSpan w:val="2"/>
             <w:vAlign w:val="center"/>
           </w:tcPr>
           <w:p>
@@ -3895,7 +4099,19 @@
               <w:rPr>
                 <w:rFonts w:ascii="David" w:hAnsi="David" w:cs="David"/>
               </w:rPr>
-              <w:t>std security</w:t>
+              <w:t xml:space="preserve"> total</w:t>
+            </w:r>
+            <w:r>
+              <w:rPr>
+                <w:rFonts w:ascii="David" w:hAnsi="David" w:cs="David"/>
+              </w:rPr>
+              <w:t xml:space="preserve"> </w:t>
+            </w:r>
+            <w:r>
+              <w:rPr>
+                <w:rFonts w:ascii="David" w:hAnsi="David" w:cs="David"/>
+              </w:rPr>
+              <w:t>security</w:t>
             </w:r>
             <w:r>
               <w:rPr>
@@ -3909,6 +4125,7 @@
         <w:tc>
           <w:tcPr>
             <w:tcW w:w="1620" w:type="dxa"/>
+            <w:gridSpan w:val="2"/>
             <w:vAlign w:val="center"/>
           </w:tcPr>
           <w:p>
@@ -3932,7 +4149,13 @@
               <w:rPr>
                 <w:rFonts w:ascii="David" w:hAnsi="David" w:cs="David"/>
               </w:rPr>
-              <w:t>total security</w:t>
+              <w:t>std</w:t>
+            </w:r>
+            <w:r>
+              <w:rPr>
+                <w:rFonts w:ascii="David" w:hAnsi="David" w:cs="David"/>
+              </w:rPr>
+              <w:t xml:space="preserve"> security</w:t>
             </w:r>
             <w:r>
               <w:rPr>
@@ -4027,7 +4250,7 @@
         <w:tc>
           <w:tcPr>
             <w:tcW w:w="6661" w:type="dxa"/>
-            <w:gridSpan w:val="5"/>
+            <w:gridSpan w:val="9"/>
             <w:vAlign w:val="center"/>
           </w:tcPr>
           <w:p>
@@ -4052,6 +4275,458 @@
                 <w:rtl/>
               </w:rPr>
               <w:t>.</w:t>
+            </w:r>
+          </w:p>
+        </w:tc>
+      </w:tr>
+      <w:tr>
+        <w:trPr>
+          <w:trHeight w:val="792"/>
+        </w:trPr>
+        <w:tc>
+          <w:tcPr>
+            <w:cnfStyle w:val="001000000000" w:firstRow="0" w:lastRow="0" w:firstColumn="1" w:lastColumn="0" w:oddVBand="0" w:evenVBand="0" w:oddHBand="0" w:evenHBand="0" w:firstRowFirstColumn="0" w:firstRowLastColumn="0" w:lastRowFirstColumn="0" w:lastRowLastColumn="0"/>
+            <w:tcW w:w="1239" w:type="dxa"/>
+            <w:vAlign w:val="center"/>
+          </w:tcPr>
+          <w:p>
+            <w:pPr>
+              <w:spacing w:after="240"/>
+              <w:jc w:val="center"/>
+              <w:rPr>
+                <w:rFonts w:ascii="David" w:hAnsi="David" w:cs="David"/>
+                <w:b/>
+                <w:bCs/>
+                <w:rtl/>
+              </w:rPr>
+            </w:pPr>
+            <w:r>
+              <w:rPr>
+                <w:rFonts w:ascii="David" w:hAnsi="David" w:cs="David"/>
+                <w:b/>
+                <w:bCs/>
+                <w:noProof/>
+                <w:rtl/>
+                <w:lang w:val="he-IL"/>
+              </w:rPr>
+              <mc:AlternateContent>
+                <mc:Choice Requires="wps">
+                  <w:drawing>
+                    <wp:anchor distT="0" distB="0" distL="114300" distR="114300" simplePos="0" relativeHeight="251672576" behindDoc="0" locked="0" layoutInCell="1" allowOverlap="1" wp14:anchorId="5FA88B14" wp14:editId="6380C8DC">
+                      <wp:simplePos x="0" y="0"/>
+                      <wp:positionH relativeFrom="column">
+                        <wp:posOffset>-66584</wp:posOffset>
+                      </wp:positionH>
+                      <wp:positionV relativeFrom="paragraph">
+                        <wp:posOffset>13900</wp:posOffset>
+                      </wp:positionV>
+                      <wp:extent cx="823965" cy="0"/>
+                      <wp:effectExtent l="0" t="0" r="0" b="0"/>
+                      <wp:wrapNone/>
+                      <wp:docPr id="2" name="Straight Connector 2"/>
+                      <wp:cNvGraphicFramePr/>
+                      <a:graphic xmlns:a="http://schemas.openxmlformats.org/drawingml/2006/main">
+                        <a:graphicData uri="http://schemas.microsoft.com/office/word/2010/wordprocessingShape">
+                          <wps:wsp>
+                            <wps:cNvCnPr/>
+                            <wps:spPr>
+                              <a:xfrm>
+                                <a:off x="0" y="0"/>
+                                <a:ext cx="823965" cy="0"/>
+                              </a:xfrm>
+                              <a:prstGeom prst="line">
+                                <a:avLst/>
+                              </a:prstGeom>
+                              <a:ln w="6350">
+                                <a:solidFill>
+                                  <a:schemeClr val="tx1"/>
+                                </a:solidFill>
+                              </a:ln>
+                            </wps:spPr>
+                            <wps:style>
+                              <a:lnRef idx="1">
+                                <a:schemeClr val="dk1"/>
+                              </a:lnRef>
+                              <a:fillRef idx="0">
+                                <a:schemeClr val="dk1"/>
+                              </a:fillRef>
+                              <a:effectRef idx="0">
+                                <a:schemeClr val="dk1"/>
+                              </a:effectRef>
+                              <a:fontRef idx="minor">
+                                <a:schemeClr val="tx1"/>
+                              </a:fontRef>
+                            </wps:style>
+                            <wps:bodyPr/>
+                          </wps:wsp>
+                        </a:graphicData>
+                      </a:graphic>
+                      <wp14:sizeRelH relativeFrom="margin">
+                        <wp14:pctWidth>0</wp14:pctWidth>
+                      </wp14:sizeRelH>
+                      <wp14:sizeRelV relativeFrom="margin">
+                        <wp14:pctHeight>0</wp14:pctHeight>
+                      </wp14:sizeRelV>
+                    </wp:anchor>
+                  </w:drawing>
+                </mc:Choice>
+                <mc:Fallback>
+                  <w:pict>
+                    <v:line w14:anchorId="06A2787D" id="Straight Connector 2" o:spid="_x0000_s1026" style="position:absolute;z-index:251672576;visibility:visible;mso-wrap-style:square;mso-width-percent:0;mso-height-percent:0;mso-wrap-distance-left:9pt;mso-wrap-distance-top:0;mso-wrap-distance-right:9pt;mso-wrap-distance-bottom:0;mso-position-horizontal:absolute;mso-position-horizontal-relative:text;mso-position-vertical:absolute;mso-position-vertical-relative:text;mso-width-percent:0;mso-height-percent:0;mso-width-relative:margin;mso-height-relative:margin" from="-5.25pt,1.1pt" to="59.65pt,1.1pt" o:gfxdata="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" strokecolor="black [3213]" strokeweight=".5pt"/>
+                  </w:pict>
+                </mc:Fallback>
+              </mc:AlternateContent>
+            </w:r>
+          </w:p>
+        </w:tc>
+        <w:tc>
+          <w:tcPr>
+            <w:tcW w:w="1170" w:type="dxa"/>
+            <w:vMerge w:val="restart"/>
+            <w:vAlign w:val="center"/>
+          </w:tcPr>
+          <w:p>
+            <w:pPr>
+              <w:spacing w:after="240"/>
+              <w:jc w:val="center"/>
+              <w:cnfStyle w:val="000000000000" w:firstRow="0" w:lastRow="0" w:firstColumn="0" w:lastColumn="0" w:oddVBand="0" w:evenVBand="0" w:oddHBand="0" w:evenHBand="0" w:firstRowFirstColumn="0" w:firstRowLastColumn="0" w:lastRowFirstColumn="0" w:lastRowLastColumn="0"/>
+              <w:rPr>
+                <w:rFonts w:ascii="David" w:hAnsi="David" w:cs="David"/>
+                <w:b/>
+                <w:bCs/>
+                <w:rtl/>
+              </w:rPr>
+            </w:pPr>
+            <w:r>
+              <w:rPr>
+                <w:rFonts w:ascii="David" w:hAnsi="David" w:cs="David" w:hint="cs"/>
+                <w:b/>
+                <w:bCs/>
+                <w:rtl/>
+              </w:rPr>
+              <w:t>ביקורתיות אפקטיבית</w:t>
+            </w:r>
+            <w:r>
+              <w:rPr>
+                <w:rFonts w:ascii="David" w:hAnsi="David" w:cs="David"/>
+                <w:b/>
+                <w:bCs/>
+              </w:rPr>
+              <w:t xml:space="preserve">(N={N </w:t>
+            </w:r>
+            <w:r>
+              <w:rPr>
+                <w:rFonts w:ascii="David" w:hAnsi="David" w:cs="David"/>
+              </w:rPr>
+              <w:t>commander</w:t>
+            </w:r>
+            <w:r>
+              <w:rPr>
+                <w:rFonts w:ascii="David" w:hAnsi="David" w:cs="David"/>
+              </w:rPr>
+              <w:t xml:space="preserve"> }</w:t>
+            </w:r>
+            <w:r>
+              <w:rPr>
+                <w:rFonts w:ascii="David" w:hAnsi="David" w:cs="David"/>
+                <w:b/>
+                <w:bCs/>
+              </w:rPr>
+              <w:t>)</w:t>
+            </w:r>
+          </w:p>
+        </w:tc>
+        <w:tc>
+          <w:tcPr>
+            <w:tcW w:w="1332" w:type="dxa"/>
+            <w:vAlign w:val="center"/>
+          </w:tcPr>
+          <w:p>
+            <w:pPr>
+              <w:spacing w:after="240"/>
+              <w:jc w:val="center"/>
+              <w:cnfStyle w:val="000000000000" w:firstRow="0" w:lastRow="0" w:firstColumn="0" w:lastColumn="0" w:oddVBand="0" w:evenVBand="0" w:oddHBand="0" w:evenHBand="0" w:firstRowFirstColumn="0" w:firstRowLastColumn="0" w:lastRowFirstColumn="0" w:lastRowLastColumn="0"/>
+              <w:rPr>
+                <w:rFonts w:ascii="David" w:hAnsi="David" w:cs="David"/>
+                <w:rtl/>
+              </w:rPr>
+            </w:pPr>
+            <w:r>
+              <w:rPr>
+                <w:rFonts w:ascii="David" w:hAnsi="David" w:cs="David"/>
+                <w:rtl/>
+              </w:rPr>
+              <w:t>{</w:t>
+            </w:r>
+            <w:r>
+              <w:rPr>
+                <w:rFonts w:ascii="David" w:hAnsi="David" w:cs="David"/>
+              </w:rPr>
+              <w:t xml:space="preserve">old </w:t>
+            </w:r>
+            <w:r>
+              <w:rPr>
+                <w:rFonts w:ascii="David" w:hAnsi="David" w:cs="David"/>
+              </w:rPr>
+              <w:t>commander</w:t>
+            </w:r>
+            <w:r>
+              <w:rPr>
+                <w:rFonts w:ascii="David" w:hAnsi="David" w:cs="David"/>
+                <w:rtl/>
+              </w:rPr>
+              <w:t>}</w:t>
+            </w:r>
+          </w:p>
+        </w:tc>
+        <w:tc>
+          <w:tcPr>
+            <w:tcW w:w="1332" w:type="dxa"/>
+            <w:gridSpan w:val="2"/>
+            <w:vAlign w:val="center"/>
+          </w:tcPr>
+          <w:p>
+            <w:pPr>
+              <w:spacing w:after="240"/>
+              <w:jc w:val="center"/>
+              <w:cnfStyle w:val="000000000000" w:firstRow="0" w:lastRow="0" w:firstColumn="0" w:lastColumn="0" w:oddVBand="0" w:evenVBand="0" w:oddHBand="0" w:evenHBand="0" w:firstRowFirstColumn="0" w:firstRowLastColumn="0" w:lastRowFirstColumn="0" w:lastRowLastColumn="0"/>
+              <w:rPr>
+                <w:rFonts w:ascii="David" w:hAnsi="David" w:cs="David"/>
+                <w:rtl/>
+              </w:rPr>
+            </w:pPr>
+            <w:r>
+              <w:rPr>
+                <w:rFonts w:ascii="David" w:hAnsi="David" w:cs="David"/>
+              </w:rPr>
+              <w:t>{new commander}</w:t>
+            </w:r>
+          </w:p>
+        </w:tc>
+        <w:tc>
+          <w:tcPr>
+            <w:tcW w:w="1332" w:type="dxa"/>
+            <w:gridSpan w:val="2"/>
+            <w:vAlign w:val="center"/>
+          </w:tcPr>
+          <w:p>
+            <w:pPr>
+              <w:spacing w:after="240"/>
+              <w:jc w:val="center"/>
+              <w:cnfStyle w:val="000000000000" w:firstRow="0" w:lastRow="0" w:firstColumn="0" w:lastColumn="0" w:oddVBand="0" w:evenVBand="0" w:oddHBand="0" w:evenHBand="0" w:firstRowFirstColumn="0" w:firstRowLastColumn="0" w:lastRowFirstColumn="0" w:lastRowLastColumn="0"/>
+              <w:rPr>
+                <w:rFonts w:ascii="David" w:hAnsi="David" w:cs="David"/>
+                <w:rtl/>
+              </w:rPr>
+            </w:pPr>
+            <w:r>
+              <w:rPr>
+                <w:rFonts w:ascii="David" w:hAnsi="David" w:cs="David"/>
+                <w:rtl/>
+              </w:rPr>
+              <w:t>{</w:t>
+            </w:r>
+            <w:r>
+              <w:rPr>
+                <w:rFonts w:ascii="David" w:hAnsi="David" w:cs="David"/>
+              </w:rPr>
+              <w:t xml:space="preserve"> total</w:t>
+            </w:r>
+            <w:r>
+              <w:rPr>
+                <w:rFonts w:ascii="David" w:hAnsi="David" w:cs="David"/>
+              </w:rPr>
+              <w:t xml:space="preserve"> </w:t>
+            </w:r>
+            <w:r>
+              <w:rPr>
+                <w:rFonts w:ascii="David" w:hAnsi="David" w:cs="David"/>
+              </w:rPr>
+              <w:t>commander</w:t>
+            </w:r>
+            <w:r>
+              <w:rPr>
+                <w:rFonts w:ascii="David" w:hAnsi="David" w:cs="David"/>
+                <w:rtl/>
+              </w:rPr>
+              <w:t>}</w:t>
+            </w:r>
+          </w:p>
+        </w:tc>
+        <w:tc>
+          <w:tcPr>
+            <w:tcW w:w="1332" w:type="dxa"/>
+            <w:gridSpan w:val="2"/>
+            <w:vAlign w:val="center"/>
+          </w:tcPr>
+          <w:p>
+            <w:pPr>
+              <w:spacing w:after="240"/>
+              <w:jc w:val="center"/>
+              <w:cnfStyle w:val="000000000000" w:firstRow="0" w:lastRow="0" w:firstColumn="0" w:lastColumn="0" w:oddVBand="0" w:evenVBand="0" w:oddHBand="0" w:evenHBand="0" w:firstRowFirstColumn="0" w:firstRowLastColumn="0" w:lastRowFirstColumn="0" w:lastRowLastColumn="0"/>
+              <w:rPr>
+                <w:rFonts w:ascii="David" w:hAnsi="David" w:cs="David"/>
+                <w:rtl/>
+              </w:rPr>
+            </w:pPr>
+            <w:r>
+              <w:rPr>
+                <w:rFonts w:ascii="David" w:hAnsi="David" w:cs="David"/>
+                <w:rtl/>
+              </w:rPr>
+              <w:t>{</w:t>
+            </w:r>
+            <w:r>
+              <w:rPr>
+                <w:rFonts w:ascii="David" w:hAnsi="David" w:cs="David"/>
+              </w:rPr>
+              <w:t>std</w:t>
+            </w:r>
+            <w:r>
+              <w:rPr>
+                <w:rFonts w:ascii="David" w:hAnsi="David" w:cs="David"/>
+              </w:rPr>
+              <w:t xml:space="preserve"> </w:t>
+            </w:r>
+            <w:r>
+              <w:rPr>
+                <w:rFonts w:ascii="David" w:hAnsi="David" w:cs="David"/>
+              </w:rPr>
+              <w:t>commander</w:t>
+            </w:r>
+            <w:r>
+              <w:rPr>
+                <w:rFonts w:ascii="David" w:hAnsi="David" w:cs="David"/>
+                <w:rtl/>
+              </w:rPr>
+              <w:t>}</w:t>
+            </w:r>
+          </w:p>
+        </w:tc>
+        <w:tc>
+          <w:tcPr>
+            <w:tcW w:w="1333" w:type="dxa"/>
+            <w:gridSpan w:val="2"/>
+            <w:vAlign w:val="center"/>
+          </w:tcPr>
+          <w:p>
+            <w:pPr>
+              <w:spacing w:after="240"/>
+              <w:jc w:val="center"/>
+              <w:cnfStyle w:val="000000000000" w:firstRow="0" w:lastRow="0" w:firstColumn="0" w:lastColumn="0" w:oddVBand="0" w:evenVBand="0" w:oddHBand="0" w:evenHBand="0" w:firstRowFirstColumn="0" w:firstRowLastColumn="0" w:lastRowFirstColumn="0" w:lastRowLastColumn="0"/>
+              <w:rPr>
+                <w:rFonts w:ascii="David" w:hAnsi="David" w:cs="David"/>
+                <w:rtl/>
+              </w:rPr>
+            </w:pPr>
+            <w:r>
+              <w:rPr>
+                <w:rFonts w:ascii="David" w:hAnsi="David" w:cs="David"/>
+                <w:rtl/>
+              </w:rPr>
+              <w:t>{</w:t>
+            </w:r>
+            <w:r>
+              <w:rPr>
+                <w:rFonts w:ascii="David" w:hAnsi="David" w:cs="David"/>
+              </w:rPr>
+              <w:t xml:space="preserve">range </w:t>
+            </w:r>
+            <w:r>
+              <w:rPr>
+                <w:rFonts w:ascii="David" w:hAnsi="David" w:cs="David"/>
+              </w:rPr>
+              <w:t>commander</w:t>
+            </w:r>
+            <w:r>
+              <w:rPr>
+                <w:rFonts w:ascii="David" w:hAnsi="David" w:cs="David"/>
+                <w:rtl/>
+              </w:rPr>
+              <w:t>}</w:t>
+            </w:r>
+          </w:p>
+        </w:tc>
+      </w:tr>
+      <w:tr>
+        <w:trPr>
+          <w:cnfStyle w:val="000000100000" w:firstRow="0" w:lastRow="0" w:firstColumn="0" w:lastColumn="0" w:oddVBand="0" w:evenVBand="0" w:oddHBand="1" w:evenHBand="0" w:firstRowFirstColumn="0" w:firstRowLastColumn="0" w:lastRowFirstColumn="0" w:lastRowLastColumn="0"/>
+          <w:trHeight w:val="1296"/>
+        </w:trPr>
+        <w:tc>
+          <w:tcPr>
+            <w:cnfStyle w:val="001000000000" w:firstRow="0" w:lastRow="0" w:firstColumn="1" w:lastColumn="0" w:oddVBand="0" w:evenVBand="0" w:oddHBand="0" w:evenHBand="0" w:firstRowFirstColumn="0" w:firstRowLastColumn="0" w:lastRowFirstColumn="0" w:lastRowLastColumn="0"/>
+            <w:tcW w:w="1239" w:type="dxa"/>
+            <w:vAlign w:val="center"/>
+          </w:tcPr>
+          <w:p>
+            <w:pPr>
+              <w:spacing w:after="240"/>
+              <w:jc w:val="center"/>
+              <w:rPr>
+                <w:rFonts w:ascii="David" w:hAnsi="David" w:cs="David"/>
+                <w:b/>
+                <w:bCs/>
+                <w:i w:val="0"/>
+                <w:iCs w:val="0"/>
+                <w:rtl/>
+              </w:rPr>
+            </w:pPr>
+            <w:r>
+              <w:rPr>
+                <w:rFonts w:ascii="David" w:hAnsi="David" w:cs="David" w:hint="cs"/>
+                <w:b/>
+                <w:bCs/>
+                <w:i w:val="0"/>
+                <w:iCs w:val="0"/>
+                <w:rtl/>
+              </w:rPr>
+              <w:t>מדד מפקד</w:t>
+            </w:r>
+          </w:p>
+        </w:tc>
+        <w:tc>
+          <w:tcPr>
+            <w:tcW w:w="1170" w:type="dxa"/>
+            <w:vMerge/>
+            <w:vAlign w:val="center"/>
+          </w:tcPr>
+          <w:p>
+            <w:pPr>
+              <w:spacing w:after="240"/>
+              <w:jc w:val="center"/>
+              <w:cnfStyle w:val="000000100000" w:firstRow="0" w:lastRow="0" w:firstColumn="0" w:lastColumn="0" w:oddVBand="0" w:evenVBand="0" w:oddHBand="1" w:evenHBand="0" w:firstRowFirstColumn="0" w:firstRowLastColumn="0" w:lastRowFirstColumn="0" w:lastRowLastColumn="0"/>
+              <w:rPr>
+                <w:rFonts w:ascii="David" w:hAnsi="David" w:cs="David"/>
+                <w:b/>
+                <w:bCs/>
+                <w:rtl/>
+              </w:rPr>
+            </w:pPr>
+          </w:p>
+        </w:tc>
+        <w:tc>
+          <w:tcPr>
+            <w:tcW w:w="6661" w:type="dxa"/>
+            <w:gridSpan w:val="9"/>
+            <w:vAlign w:val="center"/>
+          </w:tcPr>
+          <w:p>
+            <w:pPr>
+              <w:spacing w:after="240"/>
+              <w:jc w:val="center"/>
+              <w:cnfStyle w:val="000000100000" w:firstRow="0" w:lastRow="0" w:firstColumn="0" w:lastColumn="0" w:oddVBand="0" w:evenVBand="0" w:oddHBand="1" w:evenHBand="0" w:firstRowFirstColumn="0" w:firstRowLastColumn="0" w:lastRowFirstColumn="0" w:lastRowLastColumn="0"/>
+              <w:rPr>
+                <w:rFonts w:ascii="David" w:hAnsi="David" w:cs="David"/>
+                <w:rtl/>
+              </w:rPr>
+            </w:pPr>
+            <w:r>
+              <w:rPr>
+                <w:rFonts w:ascii="David" w:hAnsi="David" w:cs="David" w:hint="cs"/>
+                <w:rtl/>
+              </w:rPr>
+              <w:t>הצוער בוחן באופן מושכל ושקול את סביבתו ומבצע פעולות לשינוי בצורה יעילה וממוקדת, מתוך פרואקטיביות. הצוער מתייחס לשורש הבעיה, מציע כיווני שיפור ונותן אמון ביכולות השינוי. הביקורת מועברת בצורה מכבדת ויעילה, והסביבה מפיקה תועלת מתוך פעולותיו ודעותיו של הצוער.</w:t>
             </w:r>
           </w:p>
         </w:tc>
@@ -4103,7 +4778,7 @@
           <w:p>
             <w:pPr>
               <w:spacing w:after="240" w:line="360" w:lineRule="auto"/>
-              <w:jc w:val="both"/>
+              <w:jc w:val="center"/>
               <w:rPr>
                 <w:rFonts w:ascii="David" w:hAnsi="David" w:cs="David"/>
                 <w:rtl/>
@@ -4116,6 +4791,7 @@
               </w:rPr>
               <w:t>{</w:t>
             </w:r>
+            <w:proofErr w:type="spellStart"/>
             <w:r>
               <w:rPr>
                 <w:rFonts w:ascii="David" w:hAnsi="David" w:cs="David"/>
@@ -4152,6 +4828,7 @@
               </w:rPr>
               <w:t>sional</w:t>
             </w:r>
+            <w:proofErr w:type="spellEnd"/>
             <w:r>
               <w:rPr>
                 <w:rFonts w:ascii="David" w:hAnsi="David" w:cs="David"/>
@@ -4212,6 +4889,16 @@
         </w:tc>
       </w:tr>
     </w:tbl>
+    <w:p>
+      <w:r>
+        <w:rPr>
+          <w:b/>
+          <w:bCs/>
+          <w:caps/>
+        </w:rPr>
+        <w:br w:type="page"/>
+      </w:r>
+    </w:p>
     <w:tbl>
       <w:tblPr>
         <w:tblStyle w:val="PlainTable3"/>
@@ -4555,10 +5242,10 @@
             </w:pPr>
             <w:r>
               <w:rPr>
-                <w:rFonts w:ascii="David" w:hAnsi="David" w:cs="David"/>
-                <w:rtl/>
-              </w:rPr>
-              <w:t>דרך ארץ</w:t>
+                <w:rFonts w:ascii="David" w:hAnsi="David" w:cs="David" w:hint="cs"/>
+                <w:rtl/>
+              </w:rPr>
+              <w:t>ענווה</w:t>
             </w:r>
           </w:p>
         </w:tc>
@@ -4592,7 +5279,14 @@
                 <w:rFonts w:ascii="David" w:hAnsi="David" w:cs="David"/>
                 <w:color w:val="FF0000"/>
               </w:rPr>
-              <w:t>negative courtesy</w:t>
+              <w:t xml:space="preserve">negative </w:t>
+            </w:r>
+            <w:r>
+              <w:rPr>
+                <w:rFonts w:ascii="David" w:hAnsi="David" w:cs="David"/>
+                <w:color w:val="FF0000"/>
+              </w:rPr>
+              <w:t>humility</w:t>
             </w:r>
             <w:r>
               <w:rPr>
@@ -4631,7 +5325,13 @@
               <w:rPr>
                 <w:rFonts w:ascii="David" w:hAnsi="David" w:cs="David"/>
               </w:rPr>
-              <w:t>neutral courtesy</w:t>
+              <w:t xml:space="preserve">neutral </w:t>
+            </w:r>
+            <w:r>
+              <w:rPr>
+                <w:rFonts w:ascii="David" w:hAnsi="David" w:cs="David"/>
+              </w:rPr>
+              <w:t>humility</w:t>
             </w:r>
             <w:r>
               <w:rPr>
@@ -4672,21 +5372,21 @@
                 <w:rFonts w:ascii="David" w:hAnsi="David" w:cs="David"/>
                 <w:color w:val="00B050"/>
               </w:rPr>
-              <w:t xml:space="preserve"> positive courtesy</w:t>
+              <w:t xml:space="preserve"> positive </w:t>
             </w:r>
             <w:r>
               <w:rPr>
                 <w:rFonts w:ascii="David" w:hAnsi="David" w:cs="David"/>
                 <w:color w:val="00B050"/>
               </w:rPr>
-              <w:t>}</w:t>
+              <w:t>humility</w:t>
             </w:r>
             <w:r>
               <w:rPr>
                 <w:rFonts w:ascii="David" w:hAnsi="David" w:cs="David"/>
                 <w:color w:val="00B050"/>
               </w:rPr>
-              <w:t xml:space="preserve"> </w:t>
+              <w:t xml:space="preserve">} </w:t>
             </w:r>
           </w:p>
         </w:tc>
@@ -4727,21 +5427,15 @@
               <w:rPr>
                 <w:rFonts w:ascii="David" w:hAnsi="David" w:cs="David"/>
                 <w:color w:val="00B050"/>
-              </w:rPr>
-            </w:pPr>
-            <w:r>
-              <w:rPr>
-                <w:rFonts w:ascii="David" w:hAnsi="David" w:cs="David"/>
-                <w:rtl/>
-              </w:rPr>
-              <w:t>הצוער מתנהג בכבוד לסביבתו, מרגיש אחריות כלפי האדם האחר ודואג להוביל אל עבר התנהלות ערכית יותר בקרבתו</w:t>
-            </w:r>
-            <w:r>
-              <w:rPr>
-                <w:rFonts w:ascii="David" w:hAnsi="David" w:cs="David" w:hint="cs"/>
-                <w:rtl/>
-              </w:rPr>
-              <w:t>.</w:t>
+                <w:rtl/>
+              </w:rPr>
+            </w:pPr>
+            <w:r>
+              <w:rPr>
+                <w:rFonts w:ascii="David" w:hAnsi="David" w:cs="David"/>
+                <w:rtl/>
+              </w:rPr>
+              <w:t>הצוער רואה עצמו כשווה בין שווים, מכיר ביכולותיו וחסרונותיו כפי שמכיר באלו של סביבתו, הצוער פועל מתוך מטרה לבצע את המעשים הראויים והרצויים ולא מתוך רדיפת כבוד והערכה.</w:t>
             </w:r>
           </w:p>
         </w:tc>
@@ -4770,10 +5464,10 @@
             </w:pPr>
             <w:r>
               <w:rPr>
-                <w:rFonts w:ascii="David" w:hAnsi="David" w:cs="David"/>
-                <w:rtl/>
-              </w:rPr>
-              <w:t>מצוינות</w:t>
+                <w:rFonts w:ascii="David" w:hAnsi="David" w:cs="David" w:hint="cs"/>
+                <w:rtl/>
+              </w:rPr>
+              <w:t>רעות</w:t>
             </w:r>
           </w:p>
         </w:tc>
@@ -4790,15 +5484,16 @@
               <w:cnfStyle w:val="000000100000" w:firstRow="0" w:lastRow="0" w:firstColumn="0" w:lastColumn="0" w:oddVBand="0" w:evenVBand="0" w:oddHBand="1" w:evenHBand="0" w:firstRowFirstColumn="0" w:firstRowLastColumn="0" w:lastRowFirstColumn="0" w:lastRowLastColumn="0"/>
               <w:rPr>
                 <w:rFonts w:ascii="David" w:hAnsi="David" w:cs="David"/>
-                <w:rtl/>
-              </w:rPr>
-            </w:pPr>
-            <w:r>
-              <w:rPr>
-                <w:rFonts w:ascii="David" w:hAnsi="David" w:cs="David"/>
                 <w:color w:val="FF0000"/>
                 <w:rtl/>
               </w:rPr>
+            </w:pPr>
+            <w:r>
+              <w:rPr>
+                <w:rFonts w:ascii="David" w:hAnsi="David" w:cs="David"/>
+                <w:color w:val="FF0000"/>
+                <w:rtl/>
+              </w:rPr>
               <w:t>{</w:t>
             </w:r>
             <w:r>
@@ -4806,7 +5501,14 @@
                 <w:rFonts w:ascii="David" w:hAnsi="David" w:cs="David"/>
                 <w:color w:val="FF0000"/>
               </w:rPr>
-              <w:t>negative excellence</w:t>
+              <w:t xml:space="preserve">negative </w:t>
+            </w:r>
+            <w:r>
+              <w:rPr>
+                <w:rFonts w:ascii="David" w:hAnsi="David" w:cs="David"/>
+                <w:color w:val="FF0000"/>
+              </w:rPr>
+              <w:t>fellowship</w:t>
             </w:r>
             <w:r>
               <w:rPr>
@@ -4845,7 +5547,13 @@
               <w:rPr>
                 <w:rFonts w:ascii="David" w:hAnsi="David" w:cs="David"/>
               </w:rPr>
-              <w:t>neutral excellence</w:t>
+              <w:t xml:space="preserve">neutral </w:t>
+            </w:r>
+            <w:r>
+              <w:rPr>
+                <w:rFonts w:ascii="David" w:hAnsi="David" w:cs="David"/>
+              </w:rPr>
+              <w:t>fellowship</w:t>
             </w:r>
             <w:r>
               <w:rPr>
@@ -4869,15 +5577,16 @@
               <w:cnfStyle w:val="000000100000" w:firstRow="0" w:lastRow="0" w:firstColumn="0" w:lastColumn="0" w:oddVBand="0" w:evenVBand="0" w:oddHBand="1" w:evenHBand="0" w:firstRowFirstColumn="0" w:firstRowLastColumn="0" w:lastRowFirstColumn="0" w:lastRowLastColumn="0"/>
               <w:rPr>
                 <w:rFonts w:ascii="David" w:hAnsi="David" w:cs="David"/>
-                <w:rtl/>
-              </w:rPr>
-            </w:pPr>
-            <w:r>
-              <w:rPr>
-                <w:rFonts w:ascii="David" w:hAnsi="David" w:cs="David"/>
                 <w:color w:val="00B050"/>
                 <w:rtl/>
               </w:rPr>
+            </w:pPr>
+            <w:r>
+              <w:rPr>
+                <w:rFonts w:ascii="David" w:hAnsi="David" w:cs="David"/>
+                <w:color w:val="00B050"/>
+                <w:rtl/>
+              </w:rPr>
               <w:t>{</w:t>
             </w:r>
             <w:r>
@@ -4885,7 +5594,14 @@
                 <w:rFonts w:ascii="David" w:hAnsi="David" w:cs="David"/>
                 <w:color w:val="00B050"/>
               </w:rPr>
-              <w:t xml:space="preserve"> positive excellence</w:t>
+              <w:t xml:space="preserve"> positive </w:t>
+            </w:r>
+            <w:r>
+              <w:rPr>
+                <w:rFonts w:ascii="David" w:hAnsi="David" w:cs="David"/>
+                <w:color w:val="00B050"/>
+              </w:rPr>
+              <w:t>fellowship</w:t>
             </w:r>
             <w:r>
               <w:rPr>
@@ -4947,70 +5663,7 @@
                 <w:rFonts w:ascii="David" w:hAnsi="David" w:cs="David"/>
                 <w:rtl/>
               </w:rPr>
-              <w:t xml:space="preserve">הצוער </w:t>
-            </w:r>
-            <w:r>
-              <w:rPr>
-                <w:rFonts w:ascii="David" w:hAnsi="David" w:cs="David" w:hint="cs"/>
-                <w:rtl/>
-              </w:rPr>
-              <w:t>עושה את</w:t>
-            </w:r>
-            <w:r>
-              <w:rPr>
-                <w:rFonts w:ascii="David" w:hAnsi="David" w:cs="David"/>
-                <w:rtl/>
-              </w:rPr>
-              <w:t xml:space="preserve"> </w:t>
-            </w:r>
-            <w:r>
-              <w:rPr>
-                <w:rFonts w:ascii="David" w:hAnsi="David" w:cs="David" w:hint="cs"/>
-                <w:rtl/>
-              </w:rPr>
-              <w:t>שלל משימותיו הכי טוב שהוא יכול</w:t>
-            </w:r>
-            <w:r>
-              <w:rPr>
-                <w:rFonts w:ascii="David" w:hAnsi="David" w:cs="David"/>
-                <w:rtl/>
-              </w:rPr>
-              <w:t xml:space="preserve">, חותר לשיפור מתמיד ויודע להתנהל מול ריבוי משימות </w:t>
-            </w:r>
-            <w:r>
-              <w:rPr>
-                <w:rFonts w:ascii="David" w:hAnsi="David" w:cs="David" w:hint="cs"/>
-                <w:rtl/>
-              </w:rPr>
-              <w:t>ו</w:t>
-            </w:r>
-            <w:r>
-              <w:rPr>
-                <w:rFonts w:ascii="David" w:hAnsi="David" w:cs="David"/>
-                <w:rtl/>
-              </w:rPr>
-              <w:t xml:space="preserve">גם למקד את כוחותיו </w:t>
-            </w:r>
-            <w:r>
-              <w:rPr>
-                <w:rFonts w:ascii="David" w:hAnsi="David" w:cs="David" w:hint="cs"/>
-                <w:rtl/>
-              </w:rPr>
-              <w:t>ע</w:t>
-            </w:r>
-            <w:r>
-              <w:rPr>
-                <w:rFonts w:ascii="David" w:hAnsi="David" w:cs="David"/>
-                <w:rtl/>
-              </w:rPr>
-              <w:t>ל משימה אחת</w:t>
-            </w:r>
-            <w:r>
-              <w:rPr>
-                <w:rFonts w:ascii="David" w:hAnsi="David" w:cs="David" w:hint="cs"/>
-                <w:rtl/>
-              </w:rPr>
-              <w:t>.</w:t>
+              <w:t>הצוער תורם מעצמו למען המחזור, רואה בעיות של הסובבים לו כבעיות של עצמו, ומקריב מעצמו בשביל לעזור לזולת</w:t>
             </w:r>
           </w:p>
         </w:tc>
@@ -5042,7 +5695,7 @@
                 <w:rFonts w:ascii="David" w:hAnsi="David" w:cs="David"/>
                 <w:rtl/>
               </w:rPr>
-              <w:t>אחריות</w:t>
+              <w:t>מצוינות</w:t>
             </w:r>
           </w:p>
         </w:tc>
@@ -5059,23 +5712,23 @@
               <w:cnfStyle w:val="000000100000" w:firstRow="0" w:lastRow="0" w:firstColumn="0" w:lastColumn="0" w:oddVBand="0" w:evenVBand="0" w:oddHBand="1" w:evenHBand="0" w:firstRowFirstColumn="0" w:firstRowLastColumn="0" w:lastRowFirstColumn="0" w:lastRowLastColumn="0"/>
               <w:rPr>
                 <w:rFonts w:ascii="David" w:hAnsi="David" w:cs="David"/>
+                <w:rtl/>
+              </w:rPr>
+            </w:pPr>
+            <w:r>
+              <w:rPr>
+                <w:rFonts w:ascii="David" w:hAnsi="David" w:cs="David"/>
                 <w:color w:val="FF0000"/>
-              </w:rPr>
-            </w:pPr>
+                <w:rtl/>
+              </w:rPr>
+              <w:t>{</w:t>
+            </w:r>
             <w:r>
               <w:rPr>
                 <w:rFonts w:ascii="David" w:hAnsi="David" w:cs="David"/>
                 <w:color w:val="FF0000"/>
-                <w:rtl/>
-              </w:rPr>
-              <w:t>{</w:t>
-            </w:r>
-            <w:r>
-              <w:rPr>
-                <w:rFonts w:ascii="David" w:hAnsi="David" w:cs="David"/>
-                <w:color w:val="FF0000"/>
-              </w:rPr>
-              <w:t>negative responsibility</w:t>
+              </w:rPr>
+              <w:t>negative excellence</w:t>
             </w:r>
             <w:r>
               <w:rPr>
@@ -5100,6 +5753,7 @@
               <w:cnfStyle w:val="000000100000" w:firstRow="0" w:lastRow="0" w:firstColumn="0" w:lastColumn="0" w:oddVBand="0" w:evenVBand="0" w:oddHBand="1" w:evenHBand="0" w:firstRowFirstColumn="0" w:firstRowLastColumn="0" w:lastRowFirstColumn="0" w:lastRowLastColumn="0"/>
               <w:rPr>
                 <w:rFonts w:ascii="David" w:hAnsi="David" w:cs="David"/>
+                <w:rtl/>
               </w:rPr>
             </w:pPr>
             <w:r>
@@ -5113,7 +5767,7 @@
               <w:rPr>
                 <w:rFonts w:ascii="David" w:hAnsi="David" w:cs="David"/>
               </w:rPr>
-              <w:t>neutral responsibility</w:t>
+              <w:t>neutral excellence</w:t>
             </w:r>
             <w:r>
               <w:rPr>
@@ -5137,23 +5791,23 @@
               <w:cnfStyle w:val="000000100000" w:firstRow="0" w:lastRow="0" w:firstColumn="0" w:lastColumn="0" w:oddVBand="0" w:evenVBand="0" w:oddHBand="1" w:evenHBand="0" w:firstRowFirstColumn="0" w:firstRowLastColumn="0" w:lastRowFirstColumn="0" w:lastRowLastColumn="0"/>
               <w:rPr>
                 <w:rFonts w:ascii="David" w:hAnsi="David" w:cs="David"/>
+                <w:rtl/>
+              </w:rPr>
+            </w:pPr>
+            <w:r>
+              <w:rPr>
+                <w:rFonts w:ascii="David" w:hAnsi="David" w:cs="David"/>
                 <w:color w:val="00B050"/>
-              </w:rPr>
-            </w:pPr>
+                <w:rtl/>
+              </w:rPr>
+              <w:t>{</w:t>
+            </w:r>
             <w:r>
               <w:rPr>
                 <w:rFonts w:ascii="David" w:hAnsi="David" w:cs="David"/>
                 <w:color w:val="00B050"/>
-                <w:rtl/>
-              </w:rPr>
-              <w:t>{</w:t>
-            </w:r>
-            <w:r>
-              <w:rPr>
-                <w:rFonts w:ascii="David" w:hAnsi="David" w:cs="David"/>
-                <w:color w:val="00B050"/>
-              </w:rPr>
-              <w:t xml:space="preserve"> positive responsibility</w:t>
+              </w:rPr>
+              <w:t xml:space="preserve"> positive excellence</w:t>
             </w:r>
             <w:r>
               <w:rPr>
@@ -5215,21 +5869,63 @@
                 <w:rFonts w:ascii="David" w:hAnsi="David" w:cs="David"/>
                 <w:rtl/>
               </w:rPr>
-              <w:t>הצוער מחויב כלפי משימותיו, מבין את המטרות מאחוריהן ופועל לאורן</w:t>
+              <w:t xml:space="preserve">הצוער </w:t>
             </w:r>
             <w:r>
               <w:rPr>
                 <w:rFonts w:ascii="David" w:hAnsi="David" w:cs="David" w:hint="cs"/>
                 <w:rtl/>
               </w:rPr>
-              <w:t xml:space="preserve">. </w:t>
-            </w:r>
-            <w:r>
-              <w:rPr>
-                <w:rFonts w:ascii="David" w:hAnsi="David" w:cs="David"/>
-                <w:rtl/>
-              </w:rPr>
-              <w:t>הצוער יודע לקחת אחריות על נושאים שאינם באחריותו הטבעית</w:t>
+              <w:t>עושה את</w:t>
+            </w:r>
+            <w:r>
+              <w:rPr>
+                <w:rFonts w:ascii="David" w:hAnsi="David" w:cs="David"/>
+                <w:rtl/>
+              </w:rPr>
+              <w:t xml:space="preserve"> </w:t>
+            </w:r>
+            <w:r>
+              <w:rPr>
+                <w:rFonts w:ascii="David" w:hAnsi="David" w:cs="David" w:hint="cs"/>
+                <w:rtl/>
+              </w:rPr>
+              <w:t>שלל משימותיו הכי טוב שהוא יכול</w:t>
+            </w:r>
+            <w:r>
+              <w:rPr>
+                <w:rFonts w:ascii="David" w:hAnsi="David" w:cs="David"/>
+                <w:rtl/>
+              </w:rPr>
+              <w:t xml:space="preserve">, חותר לשיפור מתמיד ויודע להתנהל מול ריבוי משימות </w:t>
+            </w:r>
+            <w:r>
+              <w:rPr>
+                <w:rFonts w:ascii="David" w:hAnsi="David" w:cs="David" w:hint="cs"/>
+                <w:rtl/>
+              </w:rPr>
+              <w:t>ו</w:t>
+            </w:r>
+            <w:r>
+              <w:rPr>
+                <w:rFonts w:ascii="David" w:hAnsi="David" w:cs="David"/>
+                <w:rtl/>
+              </w:rPr>
+              <w:t xml:space="preserve">גם למקד את כוחותיו </w:t>
+            </w:r>
+            <w:r>
+              <w:rPr>
+                <w:rFonts w:ascii="David" w:hAnsi="David" w:cs="David" w:hint="cs"/>
+                <w:rtl/>
+              </w:rPr>
+              <w:t>ע</w:t>
+            </w:r>
+            <w:r>
+              <w:rPr>
+                <w:rFonts w:ascii="David" w:hAnsi="David" w:cs="David"/>
+                <w:rtl/>
+              </w:rPr>
+              <w:t>ל משימה אחת</w:t>
             </w:r>
             <w:r>
               <w:rPr>
@@ -5268,8 +5964,7 @@
                 <w:rFonts w:ascii="David" w:hAnsi="David" w:cs="David"/>
                 <w:rtl/>
               </w:rPr>
-              <w:lastRenderedPageBreak/>
-              <w:t>העזה</w:t>
+              <w:t>אחריות</w:t>
             </w:r>
           </w:p>
         </w:tc>
@@ -5302,7 +5997,7 @@
                 <w:rFonts w:ascii="David" w:hAnsi="David" w:cs="David"/>
                 <w:color w:val="FF0000"/>
               </w:rPr>
-              <w:t>negative daring</w:t>
+              <w:t>negative responsibility</w:t>
             </w:r>
             <w:r>
               <w:rPr>
@@ -5340,7 +6035,7 @@
               <w:rPr>
                 <w:rFonts w:ascii="David" w:hAnsi="David" w:cs="David"/>
               </w:rPr>
-              <w:t>neutral daring</w:t>
+              <w:t>neutral responsibility</w:t>
             </w:r>
             <w:r>
               <w:rPr>
@@ -5380,7 +6075,7 @@
                 <w:rFonts w:ascii="David" w:hAnsi="David" w:cs="David"/>
                 <w:color w:val="00B050"/>
               </w:rPr>
-              <w:t xml:space="preserve"> positive daring</w:t>
+              <w:t xml:space="preserve"> positive responsibility</w:t>
             </w:r>
             <w:r>
               <w:rPr>
@@ -5442,28 +6137,21 @@
                 <w:rFonts w:ascii="David" w:hAnsi="David" w:cs="David"/>
                 <w:rtl/>
               </w:rPr>
-              <w:t xml:space="preserve">הצוער מסוגל להתמודד עם סיכון וחוסר וודאות על מנת </w:t>
+              <w:t>הצוער מחויב כלפי משימותיו, מבין את המטרות מאחוריהן ופועל לאורן</w:t>
             </w:r>
             <w:r>
               <w:rPr>
                 <w:rFonts w:ascii="David" w:hAnsi="David" w:cs="David" w:hint="cs"/>
                 <w:rtl/>
               </w:rPr>
-              <w:t xml:space="preserve">להשיג את </w:t>
-            </w:r>
-            <w:r>
-              <w:rPr>
-                <w:rFonts w:ascii="David" w:hAnsi="David" w:cs="David"/>
-                <w:rtl/>
-              </w:rPr>
-              <w:t xml:space="preserve">מטרותיו, </w:t>
-            </w:r>
-            <w:r>
-              <w:rPr>
-                <w:rFonts w:ascii="David" w:hAnsi="David" w:cs="David" w:hint="cs"/>
-                <w:rtl/>
-              </w:rPr>
-              <w:t>ובעל יכולת ורצון לפעול מחוץ לאזור הנוחות</w:t>
+              <w:t xml:space="preserve">. </w:t>
+            </w:r>
+            <w:r>
+              <w:rPr>
+                <w:rFonts w:ascii="David" w:hAnsi="David" w:cs="David"/>
+                <w:rtl/>
+              </w:rPr>
+              <w:t>הצוער יודע לקחת אחריות על נושאים שאינם באחריותו הטבעית</w:t>
             </w:r>
             <w:r>
               <w:rPr>
@@ -5502,6 +6190,239 @@
                 <w:rFonts w:ascii="David" w:hAnsi="David" w:cs="David"/>
                 <w:rtl/>
               </w:rPr>
+              <w:t>העזה</w:t>
+            </w:r>
+          </w:p>
+        </w:tc>
+        <w:tc>
+          <w:tcPr>
+            <w:tcW w:w="3188" w:type="dxa"/>
+          </w:tcPr>
+          <w:p>
+            <w:pPr>
+              <w:pStyle w:val="ListParagraph"/>
+              <w:spacing w:after="240" w:line="360" w:lineRule="auto"/>
+              <w:ind w:left="0"/>
+              <w:jc w:val="center"/>
+              <w:cnfStyle w:val="000000100000" w:firstRow="0" w:lastRow="0" w:firstColumn="0" w:lastColumn="0" w:oddVBand="0" w:evenVBand="0" w:oddHBand="1" w:evenHBand="0" w:firstRowFirstColumn="0" w:firstRowLastColumn="0" w:lastRowFirstColumn="0" w:lastRowLastColumn="0"/>
+              <w:rPr>
+                <w:rFonts w:ascii="David" w:hAnsi="David" w:cs="David"/>
+                <w:color w:val="FF0000"/>
+              </w:rPr>
+            </w:pPr>
+            <w:r>
+              <w:rPr>
+                <w:rFonts w:ascii="David" w:hAnsi="David" w:cs="David"/>
+                <w:color w:val="FF0000"/>
+                <w:rtl/>
+              </w:rPr>
+              <w:t>{</w:t>
+            </w:r>
+            <w:r>
+              <w:rPr>
+                <w:rFonts w:ascii="David" w:hAnsi="David" w:cs="David"/>
+                <w:color w:val="FF0000"/>
+              </w:rPr>
+              <w:t>negative daring</w:t>
+            </w:r>
+            <w:r>
+              <w:rPr>
+                <w:rFonts w:ascii="David" w:hAnsi="David" w:cs="David"/>
+                <w:color w:val="FF0000"/>
+                <w:rtl/>
+              </w:rPr>
+              <w:t>}</w:t>
+            </w:r>
+          </w:p>
+        </w:tc>
+        <w:tc>
+          <w:tcPr>
+            <w:tcW w:w="1754" w:type="dxa"/>
+          </w:tcPr>
+          <w:p>
+            <w:pPr>
+              <w:pStyle w:val="ListParagraph"/>
+              <w:spacing w:after="240" w:line="360" w:lineRule="auto"/>
+              <w:ind w:left="0"/>
+              <w:jc w:val="center"/>
+              <w:cnfStyle w:val="000000100000" w:firstRow="0" w:lastRow="0" w:firstColumn="0" w:lastColumn="0" w:oddVBand="0" w:evenVBand="0" w:oddHBand="1" w:evenHBand="0" w:firstRowFirstColumn="0" w:firstRowLastColumn="0" w:lastRowFirstColumn="0" w:lastRowLastColumn="0"/>
+              <w:rPr>
+                <w:rFonts w:ascii="David" w:hAnsi="David" w:cs="David"/>
+              </w:rPr>
+            </w:pPr>
+            <w:r>
+              <w:rPr>
+                <w:rFonts w:ascii="David" w:hAnsi="David" w:cs="David"/>
+                <w:rtl/>
+              </w:rPr>
+              <w:t>{</w:t>
+            </w:r>
+            <w:r>
+              <w:rPr>
+                <w:rFonts w:ascii="David" w:hAnsi="David" w:cs="David"/>
+              </w:rPr>
+              <w:t>neutral daring</w:t>
+            </w:r>
+            <w:r>
+              <w:rPr>
+                <w:rFonts w:ascii="David" w:hAnsi="David" w:cs="David"/>
+                <w:rtl/>
+              </w:rPr>
+              <w:t>}</w:t>
+            </w:r>
+          </w:p>
+        </w:tc>
+        <w:tc>
+          <w:tcPr>
+            <w:tcW w:w="2796" w:type="dxa"/>
+          </w:tcPr>
+          <w:p>
+            <w:pPr>
+              <w:pStyle w:val="ListParagraph"/>
+              <w:spacing w:after="240" w:line="360" w:lineRule="auto"/>
+              <w:ind w:left="0"/>
+              <w:jc w:val="center"/>
+              <w:cnfStyle w:val="000000100000" w:firstRow="0" w:lastRow="0" w:firstColumn="0" w:lastColumn="0" w:oddVBand="0" w:evenVBand="0" w:oddHBand="1" w:evenHBand="0" w:firstRowFirstColumn="0" w:firstRowLastColumn="0" w:lastRowFirstColumn="0" w:lastRowLastColumn="0"/>
+              <w:rPr>
+                <w:rFonts w:ascii="David" w:hAnsi="David" w:cs="David"/>
+                <w:color w:val="00B050"/>
+              </w:rPr>
+            </w:pPr>
+            <w:r>
+              <w:rPr>
+                <w:rFonts w:ascii="David" w:hAnsi="David" w:cs="David"/>
+                <w:color w:val="00B050"/>
+                <w:rtl/>
+              </w:rPr>
+              <w:t>{</w:t>
+            </w:r>
+            <w:r>
+              <w:rPr>
+                <w:rFonts w:ascii="David" w:hAnsi="David" w:cs="David"/>
+                <w:color w:val="00B050"/>
+              </w:rPr>
+              <w:t xml:space="preserve"> positive daring</w:t>
+            </w:r>
+            <w:r>
+              <w:rPr>
+                <w:rFonts w:ascii="David" w:hAnsi="David" w:cs="David"/>
+                <w:color w:val="00B050"/>
+              </w:rPr>
+              <w:t>}</w:t>
+            </w:r>
+            <w:r>
+              <w:rPr>
+                <w:rFonts w:ascii="David" w:hAnsi="David" w:cs="David"/>
+                <w:color w:val="00B050"/>
+              </w:rPr>
+              <w:t xml:space="preserve"> </w:t>
+            </w:r>
+          </w:p>
+        </w:tc>
+      </w:tr>
+      <w:tr>
+        <w:tc>
+          <w:tcPr>
+            <w:cnfStyle w:val="001000000000" w:firstRow="0" w:lastRow="0" w:firstColumn="1" w:lastColumn="0" w:oddVBand="0" w:evenVBand="0" w:oddHBand="0" w:evenHBand="0" w:firstRowFirstColumn="0" w:firstRowLastColumn="0" w:lastRowFirstColumn="0" w:lastRowLastColumn="0"/>
+            <w:tcW w:w="1264" w:type="dxa"/>
+            <w:vMerge/>
+            <w:vAlign w:val="center"/>
+          </w:tcPr>
+          <w:p>
+            <w:pPr>
+              <w:pStyle w:val="ListParagraph"/>
+              <w:spacing w:after="240" w:line="360" w:lineRule="auto"/>
+              <w:ind w:left="0"/>
+              <w:jc w:val="center"/>
+              <w:rPr>
+                <w:rFonts w:ascii="David" w:hAnsi="David" w:cs="David"/>
+                <w:rtl/>
+              </w:rPr>
+            </w:pPr>
+          </w:p>
+        </w:tc>
+        <w:tc>
+          <w:tcPr>
+            <w:tcW w:w="7738" w:type="dxa"/>
+            <w:gridSpan w:val="3"/>
+          </w:tcPr>
+          <w:p>
+            <w:pPr>
+              <w:pStyle w:val="ListParagraph"/>
+              <w:spacing w:after="240" w:line="360" w:lineRule="auto"/>
+              <w:ind w:left="0"/>
+              <w:jc w:val="center"/>
+              <w:cnfStyle w:val="000000000000" w:firstRow="0" w:lastRow="0" w:firstColumn="0" w:lastColumn="0" w:oddVBand="0" w:evenVBand="0" w:oddHBand="0" w:evenHBand="0" w:firstRowFirstColumn="0" w:firstRowLastColumn="0" w:lastRowFirstColumn="0" w:lastRowLastColumn="0"/>
+              <w:rPr>
+                <w:rFonts w:ascii="David" w:hAnsi="David" w:cs="David"/>
+                <w:color w:val="00B050"/>
+              </w:rPr>
+            </w:pPr>
+            <w:r>
+              <w:rPr>
+                <w:rFonts w:ascii="David" w:hAnsi="David" w:cs="David"/>
+                <w:rtl/>
+              </w:rPr>
+              <w:t xml:space="preserve">הצוער מסוגל להתמודד עם סיכון וחוסר וודאות על מנת </w:t>
+            </w:r>
+            <w:r>
+              <w:rPr>
+                <w:rFonts w:ascii="David" w:hAnsi="David" w:cs="David" w:hint="cs"/>
+                <w:rtl/>
+              </w:rPr>
+              <w:t xml:space="preserve">להשיג את </w:t>
+            </w:r>
+            <w:r>
+              <w:rPr>
+                <w:rFonts w:ascii="David" w:hAnsi="David" w:cs="David"/>
+                <w:rtl/>
+              </w:rPr>
+              <w:t xml:space="preserve">מטרותיו, </w:t>
+            </w:r>
+            <w:r>
+              <w:rPr>
+                <w:rFonts w:ascii="David" w:hAnsi="David" w:cs="David" w:hint="cs"/>
+                <w:rtl/>
+              </w:rPr>
+              <w:t>ובעל יכולת ורצון לפעול מחוץ לאזור הנוחות</w:t>
+            </w:r>
+            <w:r>
+              <w:rPr>
+                <w:rFonts w:ascii="David" w:hAnsi="David" w:cs="David" w:hint="cs"/>
+                <w:rtl/>
+              </w:rPr>
+              <w:t>.</w:t>
+            </w:r>
+          </w:p>
+        </w:tc>
+      </w:tr>
+      <w:tr>
+        <w:trPr>
+          <w:cnfStyle w:val="000000100000" w:firstRow="0" w:lastRow="0" w:firstColumn="0" w:lastColumn="0" w:oddVBand="0" w:evenVBand="0" w:oddHBand="1" w:evenHBand="0" w:firstRowFirstColumn="0" w:firstRowLastColumn="0" w:lastRowFirstColumn="0" w:lastRowLastColumn="0"/>
+        </w:trPr>
+        <w:tc>
+          <w:tcPr>
+            <w:cnfStyle w:val="001000000000" w:firstRow="0" w:lastRow="0" w:firstColumn="1" w:lastColumn="0" w:oddVBand="0" w:evenVBand="0" w:oddHBand="0" w:evenHBand="0" w:firstRowFirstColumn="0" w:firstRowLastColumn="0" w:lastRowFirstColumn="0" w:lastRowLastColumn="0"/>
+            <w:tcW w:w="1264" w:type="dxa"/>
+            <w:vMerge w:val="restart"/>
+            <w:vAlign w:val="center"/>
+          </w:tcPr>
+          <w:p>
+            <w:pPr>
+              <w:pStyle w:val="ListParagraph"/>
+              <w:spacing w:after="240" w:line="360" w:lineRule="auto"/>
+              <w:ind w:left="0"/>
+              <w:jc w:val="center"/>
+              <w:rPr>
+                <w:rFonts w:ascii="David" w:hAnsi="David" w:cs="David"/>
+                <w:rtl/>
+              </w:rPr>
+            </w:pPr>
+            <w:r>
+              <w:rPr>
+                <w:rFonts w:ascii="David" w:hAnsi="David" w:cs="David"/>
+                <w:rtl/>
+              </w:rPr>
               <w:t>שליחות</w:t>
             </w:r>
           </w:p>
@@ -5716,13 +6637,20 @@
     </w:p>
     <w:p>
       <w:pPr>
-        <w:spacing w:line="360" w:lineRule="auto"/>
-        <w:jc w:val="both"/>
+        <w:bidi w:val="0"/>
+        <w:spacing w:after="200" w:line="276" w:lineRule="auto"/>
         <w:rPr>
           <w:rFonts w:ascii="David" w:hAnsi="David" w:cs="David"/>
           <w:rtl/>
         </w:rPr>
       </w:pPr>
+      <w:r>
+        <w:rPr>
+          <w:rFonts w:ascii="David" w:hAnsi="David" w:cs="David"/>
+          <w:rtl/>
+        </w:rPr>
+        <w:br w:type="page"/>
+      </w:r>
     </w:p>
     <w:p>
       <w:pPr>
@@ -5746,22 +6674,36 @@
           <w:szCs w:val="28"/>
           <w:rtl/>
         </w:rPr>
+        <w:lastRenderedPageBreak/>
         <w:t>טבלה מסכמת</w:t>
       </w:r>
+    </w:p>
+    <w:p>
+      <w:pPr>
+        <w:spacing w:line="360" w:lineRule="auto"/>
+        <w:jc w:val="both"/>
+        <w:rPr>
+          <w:rFonts w:ascii="David" w:hAnsi="David" w:cs="David"/>
+          <w:b/>
+          <w:bCs/>
+          <w:sz w:val="28"/>
+          <w:szCs w:val="28"/>
+          <w:rtl/>
+        </w:rPr>
+      </w:pPr>
     </w:p>
     <w:tbl>
       <w:tblPr>
         <w:tblStyle w:val="PlainTable5"/>
         <w:bidiVisual/>
-        <w:tblW w:w="9165" w:type="dxa"/>
+        <w:tblW w:w="7064" w:type="dxa"/>
         <w:tblInd w:w="506" w:type="dxa"/>
         <w:tblLook w:val="04A0" w:firstRow="1" w:lastRow="0" w:firstColumn="1" w:lastColumn="0" w:noHBand="0" w:noVBand="1"/>
       </w:tblPr>
       <w:tblGrid>
-        <w:gridCol w:w="1270"/>
-        <w:gridCol w:w="1148"/>
-        <w:gridCol w:w="1756"/>
-        <w:gridCol w:w="1821"/>
+        <w:gridCol w:w="1216"/>
+        <w:gridCol w:w="1093"/>
+        <w:gridCol w:w="1585"/>
         <w:gridCol w:w="1585"/>
         <w:gridCol w:w="1585"/>
       </w:tblGrid>
@@ -5773,7 +6715,7 @@
         <w:tc>
           <w:tcPr>
             <w:cnfStyle w:val="001000000100" w:firstRow="0" w:lastRow="0" w:firstColumn="1" w:lastColumn="0" w:oddVBand="0" w:evenVBand="0" w:oddHBand="0" w:evenHBand="0" w:firstRowFirstColumn="1" w:firstRowLastColumn="0" w:lastRowFirstColumn="0" w:lastRowLastColumn="0"/>
-            <w:tcW w:w="1270" w:type="dxa"/>
+            <w:tcW w:w="1216" w:type="dxa"/>
             <w:tcBorders>
               <w:bottom w:val="single" w:sz="4" w:space="0" w:color="auto"/>
             </w:tcBorders>
@@ -5792,7 +6734,7 @@
         </w:tc>
         <w:tc>
           <w:tcPr>
-            <w:tcW w:w="1148" w:type="dxa"/>
+            <w:tcW w:w="1093" w:type="dxa"/>
             <w:vAlign w:val="center"/>
           </w:tcPr>
           <w:p>
@@ -5809,7 +6751,7 @@
         </w:tc>
         <w:tc>
           <w:tcPr>
-            <w:tcW w:w="1756" w:type="dxa"/>
+            <w:tcW w:w="1585" w:type="dxa"/>
             <w:vAlign w:val="center"/>
           </w:tcPr>
           <w:p>
@@ -5839,7 +6781,7 @@
         </w:tc>
         <w:tc>
           <w:tcPr>
-            <w:tcW w:w="1821" w:type="dxa"/>
+            <w:tcW w:w="1585" w:type="dxa"/>
             <w:vAlign w:val="center"/>
           </w:tcPr>
           <w:p>
@@ -5929,58 +6871,6 @@
                 <w:rtl/>
               </w:rPr>
               <w:t>ג</w:t>
-            </w:r>
-            <w:r>
-              <w:rPr>
-                <w:rFonts w:ascii="David" w:hAnsi="David" w:cs="David"/>
-                <w:b/>
-                <w:bCs/>
-                <w:i w:val="0"/>
-                <w:iCs w:val="0"/>
-                <w:rtl/>
-              </w:rPr>
-              <w:t>׳</w:t>
-            </w:r>
-          </w:p>
-        </w:tc>
-        <w:tc>
-          <w:tcPr>
-            <w:tcW w:w="1585" w:type="dxa"/>
-            <w:vAlign w:val="center"/>
-          </w:tcPr>
-          <w:p>
-            <w:pPr>
-              <w:spacing w:after="240"/>
-              <w:jc w:val="center"/>
-              <w:cnfStyle w:val="100000000000" w:firstRow="1" w:lastRow="0" w:firstColumn="0" w:lastColumn="0" w:oddVBand="0" w:evenVBand="0" w:oddHBand="0" w:evenHBand="0" w:firstRowFirstColumn="0" w:firstRowLastColumn="0" w:lastRowFirstColumn="0" w:lastRowLastColumn="0"/>
-              <w:rPr>
-                <w:rFonts w:ascii="David" w:hAnsi="David" w:cs="David"/>
-                <w:b/>
-                <w:bCs/>
-                <w:rtl/>
-              </w:rPr>
-            </w:pPr>
-            <w:r>
-              <w:rPr>
-                <w:rFonts w:ascii="David" w:hAnsi="David" w:cs="David"/>
-                <w:b/>
-                <w:bCs/>
-                <w:i w:val="0"/>
-                <w:iCs w:val="0"/>
-                <w:rtl/>
-              </w:rPr>
-              <w:t xml:space="preserve">סמסטר </w:t>
-            </w:r>
-            <w:r>
-              <w:rPr>
-                <w:rFonts w:ascii="David" w:hAnsi="David" w:cs="David" w:hint="cs"/>
-                <w:b/>
-                <w:bCs/>
-                <w:i w:val="0"/>
-                <w:iCs w:val="0"/>
-                <w:rtl/>
-              </w:rPr>
-              <w:t>ד</w:t>
             </w:r>
             <w:r>
               <w:rPr>
@@ -6004,7 +6894,7 @@
         <w:tc>
           <w:tcPr>
             <w:cnfStyle w:val="001000000000" w:firstRow="0" w:lastRow="0" w:firstColumn="1" w:lastColumn="0" w:oddVBand="0" w:evenVBand="0" w:oddHBand="0" w:evenHBand="0" w:firstRowFirstColumn="0" w:firstRowLastColumn="0" w:lastRowFirstColumn="0" w:lastRowLastColumn="0"/>
-            <w:tcW w:w="1270" w:type="dxa"/>
+            <w:tcW w:w="1216" w:type="dxa"/>
             <w:tcBorders>
               <w:top w:val="single" w:sz="4" w:space="0" w:color="auto"/>
               <w:bottom w:val="single" w:sz="4" w:space="0" w:color="auto"/>
@@ -6028,7 +6918,7 @@
         </w:tc>
         <w:tc>
           <w:tcPr>
-            <w:tcW w:w="1148" w:type="dxa"/>
+            <w:tcW w:w="1093" w:type="dxa"/>
             <w:tcBorders>
               <w:top w:val="single" w:sz="4" w:space="0" w:color="7F7F7F" w:themeColor="text1" w:themeTint="80"/>
               <w:left w:val="single" w:sz="4" w:space="0" w:color="auto"/>
@@ -6060,7 +6950,7 @@
         </w:tc>
         <w:tc>
           <w:tcPr>
-            <w:tcW w:w="1756" w:type="dxa"/>
+            <w:tcW w:w="1585" w:type="dxa"/>
             <w:vAlign w:val="center"/>
           </w:tcPr>
           <w:p>
@@ -6097,7 +6987,7 @@
         </w:tc>
         <w:tc>
           <w:tcPr>
-            <w:tcW w:w="1821" w:type="dxa"/>
+            <w:tcW w:w="1585" w:type="dxa"/>
             <w:vAlign w:val="center"/>
           </w:tcPr>
           <w:p>
@@ -6159,49 +7049,6 @@
                 <w:rFonts w:ascii="David" w:hAnsi="David" w:cs="David"/>
               </w:rPr>
               <w:t>3</w:t>
-            </w:r>
-            <w:r>
-              <w:rPr>
-                <w:rFonts w:ascii="David" w:hAnsi="David" w:cs="David"/>
-              </w:rPr>
-              <w:t xml:space="preserve"> knowing</w:t>
-            </w:r>
-            <w:r>
-              <w:rPr>
-                <w:rFonts w:ascii="David" w:hAnsi="David" w:cs="David"/>
-                <w:rtl/>
-              </w:rPr>
-              <w:t>}</w:t>
-            </w:r>
-          </w:p>
-        </w:tc>
-        <w:tc>
-          <w:tcPr>
-            <w:tcW w:w="1585" w:type="dxa"/>
-            <w:vAlign w:val="center"/>
-          </w:tcPr>
-          <w:p>
-            <w:pPr>
-              <w:spacing w:after="240"/>
-              <w:jc w:val="center"/>
-              <w:cnfStyle w:val="000000100000" w:firstRow="0" w:lastRow="0" w:firstColumn="0" w:lastColumn="0" w:oddVBand="0" w:evenVBand="0" w:oddHBand="1" w:evenHBand="0" w:firstRowFirstColumn="0" w:firstRowLastColumn="0" w:lastRowFirstColumn="0" w:lastRowLastColumn="0"/>
-              <w:rPr>
-                <w:rFonts w:ascii="David" w:hAnsi="David" w:cs="David"/>
-                <w:rtl/>
-              </w:rPr>
-            </w:pPr>
-            <w:r>
-              <w:rPr>
-                <w:rFonts w:ascii="David" w:hAnsi="David" w:cs="David"/>
-                <w:rtl/>
-              </w:rPr>
-              <w:t>{</w:t>
-            </w:r>
-            <w:r>
-              <w:rPr>
-                <w:rFonts w:ascii="David" w:hAnsi="David" w:cs="David"/>
-              </w:rPr>
-              <w:t>4</w:t>
             </w:r>
             <w:r>
               <w:rPr>
@@ -6226,7 +7073,7 @@
         <w:tc>
           <w:tcPr>
             <w:cnfStyle w:val="001000000000" w:firstRow="0" w:lastRow="0" w:firstColumn="1" w:lastColumn="0" w:oddVBand="0" w:evenVBand="0" w:oddHBand="0" w:evenHBand="0" w:firstRowFirstColumn="0" w:firstRowLastColumn="0" w:lastRowFirstColumn="0" w:lastRowLastColumn="0"/>
-            <w:tcW w:w="1270" w:type="dxa"/>
+            <w:tcW w:w="1216" w:type="dxa"/>
             <w:vMerge w:val="restart"/>
             <w:tcBorders>
               <w:top w:val="single" w:sz="4" w:space="0" w:color="auto"/>
@@ -6292,7 +7139,7 @@
         </w:tc>
         <w:tc>
           <w:tcPr>
-            <w:tcW w:w="1148" w:type="dxa"/>
+            <w:tcW w:w="1093" w:type="dxa"/>
             <w:vAlign w:val="center"/>
           </w:tcPr>
           <w:p>
@@ -6319,7 +7166,7 @@
         </w:tc>
         <w:tc>
           <w:tcPr>
-            <w:tcW w:w="1756" w:type="dxa"/>
+            <w:tcW w:w="1585" w:type="dxa"/>
             <w:vAlign w:val="center"/>
           </w:tcPr>
           <w:p>
@@ -6356,7 +7203,7 @@
         </w:tc>
         <w:tc>
           <w:tcPr>
-            <w:tcW w:w="1821" w:type="dxa"/>
+            <w:tcW w:w="1585" w:type="dxa"/>
             <w:vAlign w:val="center"/>
           </w:tcPr>
           <w:p>
@@ -6418,49 +7265,6 @@
                 <w:rFonts w:ascii="David" w:hAnsi="David" w:cs="David"/>
               </w:rPr>
               <w:t>3</w:t>
-            </w:r>
-            <w:r>
-              <w:rPr>
-                <w:rFonts w:ascii="David" w:hAnsi="David" w:cs="David"/>
-              </w:rPr>
-              <w:t xml:space="preserve"> intrapersonal</w:t>
-            </w:r>
-            <w:r>
-              <w:rPr>
-                <w:rFonts w:ascii="David" w:hAnsi="David" w:cs="David"/>
-                <w:rtl/>
-              </w:rPr>
-              <w:t>}</w:t>
-            </w:r>
-          </w:p>
-        </w:tc>
-        <w:tc>
-          <w:tcPr>
-            <w:tcW w:w="1585" w:type="dxa"/>
-            <w:vAlign w:val="center"/>
-          </w:tcPr>
-          <w:p>
-            <w:pPr>
-              <w:spacing w:after="240"/>
-              <w:jc w:val="center"/>
-              <w:cnfStyle w:val="000000000000" w:firstRow="0" w:lastRow="0" w:firstColumn="0" w:lastColumn="0" w:oddVBand="0" w:evenVBand="0" w:oddHBand="0" w:evenHBand="0" w:firstRowFirstColumn="0" w:firstRowLastColumn="0" w:lastRowFirstColumn="0" w:lastRowLastColumn="0"/>
-              <w:rPr>
-                <w:rFonts w:ascii="David" w:hAnsi="David" w:cs="David"/>
-                <w:rtl/>
-              </w:rPr>
-            </w:pPr>
-            <w:r>
-              <w:rPr>
-                <w:rFonts w:ascii="David" w:hAnsi="David" w:cs="David"/>
-                <w:rtl/>
-              </w:rPr>
-              <w:t>{</w:t>
-            </w:r>
-            <w:r>
-              <w:rPr>
-                <w:rFonts w:ascii="David" w:hAnsi="David" w:cs="David"/>
-              </w:rPr>
-              <w:t>4</w:t>
             </w:r>
             <w:r>
               <w:rPr>
@@ -6486,7 +7290,7 @@
         <w:tc>
           <w:tcPr>
             <w:cnfStyle w:val="001000000000" w:firstRow="0" w:lastRow="0" w:firstColumn="1" w:lastColumn="0" w:oddVBand="0" w:evenVBand="0" w:oddHBand="0" w:evenHBand="0" w:firstRowFirstColumn="0" w:firstRowLastColumn="0" w:lastRowFirstColumn="0" w:lastRowLastColumn="0"/>
-            <w:tcW w:w="1270" w:type="dxa"/>
+            <w:tcW w:w="1216" w:type="dxa"/>
             <w:vMerge/>
             <w:tcBorders>
               <w:top w:val="single" w:sz="4" w:space="0" w:color="auto"/>
@@ -6509,7 +7313,7 @@
         </w:tc>
         <w:tc>
           <w:tcPr>
-            <w:tcW w:w="1148" w:type="dxa"/>
+            <w:tcW w:w="1093" w:type="dxa"/>
             <w:vAlign w:val="center"/>
           </w:tcPr>
           <w:p>
@@ -6526,18 +7330,27 @@
             </w:pPr>
             <w:r>
               <w:rPr>
-                <w:rFonts w:ascii="David" w:hAnsi="David" w:cs="David"/>
-                <w:b/>
-                <w:bCs/>
-                <w:rtl/>
-              </w:rPr>
-              <w:t xml:space="preserve">תפקוד בחברה </w:t>
-            </w:r>
-          </w:p>
-        </w:tc>
-        <w:tc>
-          <w:tcPr>
-            <w:tcW w:w="1756" w:type="dxa"/>
+                <w:rFonts w:ascii="David" w:hAnsi="David" w:cs="David" w:hint="cs"/>
+                <w:b/>
+                <w:bCs/>
+                <w:rtl/>
+              </w:rPr>
+              <w:t>יכולות בין אישיות</w:t>
+            </w:r>
+            <w:r>
+              <w:rPr>
+                <w:rFonts w:ascii="David" w:hAnsi="David" w:cs="David"/>
+                <w:b/>
+                <w:bCs/>
+                <w:rtl/>
+              </w:rPr>
+              <w:t xml:space="preserve"> </w:t>
+            </w:r>
+          </w:p>
+        </w:tc>
+        <w:tc>
+          <w:tcPr>
+            <w:tcW w:w="1585" w:type="dxa"/>
             <w:vAlign w:val="center"/>
           </w:tcPr>
           <w:p>
@@ -6574,7 +7387,7 @@
         </w:tc>
         <w:tc>
           <w:tcPr>
-            <w:tcW w:w="1821" w:type="dxa"/>
+            <w:tcW w:w="1585" w:type="dxa"/>
             <w:vAlign w:val="center"/>
           </w:tcPr>
           <w:p>
@@ -6636,49 +7449,6 @@
                 <w:rFonts w:ascii="David" w:hAnsi="David" w:cs="David"/>
               </w:rPr>
               <w:t>3</w:t>
-            </w:r>
-            <w:r>
-              <w:rPr>
-                <w:rFonts w:ascii="David" w:hAnsi="David" w:cs="David"/>
-              </w:rPr>
-              <w:t xml:space="preserve"> functioning in society</w:t>
-            </w:r>
-            <w:r>
-              <w:rPr>
-                <w:rFonts w:ascii="David" w:hAnsi="David" w:cs="David"/>
-                <w:rtl/>
-              </w:rPr>
-              <w:t>}</w:t>
-            </w:r>
-          </w:p>
-        </w:tc>
-        <w:tc>
-          <w:tcPr>
-            <w:tcW w:w="1585" w:type="dxa"/>
-            <w:vAlign w:val="center"/>
-          </w:tcPr>
-          <w:p>
-            <w:pPr>
-              <w:spacing w:after="240"/>
-              <w:jc w:val="center"/>
-              <w:cnfStyle w:val="000000100000" w:firstRow="0" w:lastRow="0" w:firstColumn="0" w:lastColumn="0" w:oddVBand="0" w:evenVBand="0" w:oddHBand="1" w:evenHBand="0" w:firstRowFirstColumn="0" w:firstRowLastColumn="0" w:lastRowFirstColumn="0" w:lastRowLastColumn="0"/>
-              <w:rPr>
-                <w:rFonts w:ascii="David" w:hAnsi="David" w:cs="David"/>
-                <w:rtl/>
-              </w:rPr>
-            </w:pPr>
-            <w:r>
-              <w:rPr>
-                <w:rFonts w:ascii="David" w:hAnsi="David" w:cs="David"/>
-                <w:rtl/>
-              </w:rPr>
-              <w:t>{</w:t>
-            </w:r>
-            <w:r>
-              <w:rPr>
-                <w:rFonts w:ascii="David" w:hAnsi="David" w:cs="David"/>
-              </w:rPr>
-              <w:t>4</w:t>
             </w:r>
             <w:r>
               <w:rPr>
@@ -6703,7 +7473,7 @@
         <w:tc>
           <w:tcPr>
             <w:cnfStyle w:val="001000000000" w:firstRow="0" w:lastRow="0" w:firstColumn="1" w:lastColumn="0" w:oddVBand="0" w:evenVBand="0" w:oddHBand="0" w:evenHBand="0" w:firstRowFirstColumn="0" w:firstRowLastColumn="0" w:lastRowFirstColumn="0" w:lastRowLastColumn="0"/>
-            <w:tcW w:w="1270" w:type="dxa"/>
+            <w:tcW w:w="1216" w:type="dxa"/>
             <w:vMerge/>
             <w:tcBorders>
               <w:top w:val="single" w:sz="4" w:space="0" w:color="auto"/>
@@ -6726,7 +7496,7 @@
         </w:tc>
         <w:tc>
           <w:tcPr>
-            <w:tcW w:w="1148" w:type="dxa"/>
+            <w:tcW w:w="1093" w:type="dxa"/>
             <w:vAlign w:val="center"/>
           </w:tcPr>
           <w:p>
@@ -6754,7 +7524,7 @@
         </w:tc>
         <w:tc>
           <w:tcPr>
-            <w:tcW w:w="1756" w:type="dxa"/>
+            <w:tcW w:w="1585" w:type="dxa"/>
             <w:vAlign w:val="center"/>
           </w:tcPr>
           <w:p>
@@ -6791,7 +7561,7 @@
         </w:tc>
         <w:tc>
           <w:tcPr>
-            <w:tcW w:w="1821" w:type="dxa"/>
+            <w:tcW w:w="1585" w:type="dxa"/>
             <w:vAlign w:val="center"/>
           </w:tcPr>
           <w:p>
@@ -6853,49 +7623,6 @@
                 <w:rFonts w:ascii="David" w:hAnsi="David" w:cs="David"/>
               </w:rPr>
               <w:t>3</w:t>
-            </w:r>
-            <w:r>
-              <w:rPr>
-                <w:rFonts w:ascii="David" w:hAnsi="David" w:cs="David"/>
-              </w:rPr>
-              <w:t xml:space="preserve"> leadership</w:t>
-            </w:r>
-            <w:r>
-              <w:rPr>
-                <w:rFonts w:ascii="David" w:hAnsi="David" w:cs="David"/>
-                <w:rtl/>
-              </w:rPr>
-              <w:t>}</w:t>
-            </w:r>
-          </w:p>
-        </w:tc>
-        <w:tc>
-          <w:tcPr>
-            <w:tcW w:w="1585" w:type="dxa"/>
-            <w:vAlign w:val="center"/>
-          </w:tcPr>
-          <w:p>
-            <w:pPr>
-              <w:spacing w:after="240"/>
-              <w:jc w:val="center"/>
-              <w:cnfStyle w:val="000000000000" w:firstRow="0" w:lastRow="0" w:firstColumn="0" w:lastColumn="0" w:oddVBand="0" w:evenVBand="0" w:oddHBand="0" w:evenHBand="0" w:firstRowFirstColumn="0" w:firstRowLastColumn="0" w:lastRowFirstColumn="0" w:lastRowLastColumn="0"/>
-              <w:rPr>
-                <w:rFonts w:ascii="David" w:hAnsi="David" w:cs="David"/>
-                <w:rtl/>
-              </w:rPr>
-            </w:pPr>
-            <w:r>
-              <w:rPr>
-                <w:rFonts w:ascii="David" w:hAnsi="David" w:cs="David"/>
-                <w:rtl/>
-              </w:rPr>
-              <w:t>{</w:t>
-            </w:r>
-            <w:r>
-              <w:rPr>
-                <w:rFonts w:ascii="David" w:hAnsi="David" w:cs="David"/>
-              </w:rPr>
-              <w:t>4</w:t>
             </w:r>
             <w:r>
               <w:rPr>
@@ -6921,7 +7648,7 @@
         <w:tc>
           <w:tcPr>
             <w:cnfStyle w:val="001000000000" w:firstRow="0" w:lastRow="0" w:firstColumn="1" w:lastColumn="0" w:oddVBand="0" w:evenVBand="0" w:oddHBand="0" w:evenHBand="0" w:firstRowFirstColumn="0" w:firstRowLastColumn="0" w:lastRowFirstColumn="0" w:lastRowLastColumn="0"/>
-            <w:tcW w:w="1270" w:type="dxa"/>
+            <w:tcW w:w="1216" w:type="dxa"/>
             <w:vMerge w:val="restart"/>
             <w:tcBorders>
               <w:top w:val="single" w:sz="4" w:space="0" w:color="auto"/>
@@ -6970,7 +7697,7 @@
         </w:tc>
         <w:tc>
           <w:tcPr>
-            <w:tcW w:w="1148" w:type="dxa"/>
+            <w:tcW w:w="1093" w:type="dxa"/>
             <w:vAlign w:val="center"/>
           </w:tcPr>
           <w:p>
@@ -6998,7 +7725,7 @@
         </w:tc>
         <w:tc>
           <w:tcPr>
-            <w:tcW w:w="1756" w:type="dxa"/>
+            <w:tcW w:w="1585" w:type="dxa"/>
             <w:vAlign w:val="center"/>
           </w:tcPr>
           <w:p>
@@ -7035,7 +7762,7 @@
         </w:tc>
         <w:tc>
           <w:tcPr>
-            <w:tcW w:w="1821" w:type="dxa"/>
+            <w:tcW w:w="1585" w:type="dxa"/>
             <w:vAlign w:val="center"/>
           </w:tcPr>
           <w:p>
@@ -7097,49 +7824,6 @@
                 <w:rFonts w:ascii="David" w:hAnsi="David" w:cs="David"/>
               </w:rPr>
               <w:t>3</w:t>
-            </w:r>
-            <w:r>
-              <w:rPr>
-                <w:rFonts w:ascii="David" w:hAnsi="David" w:cs="David"/>
-              </w:rPr>
-              <w:t xml:space="preserve"> conduct</w:t>
-            </w:r>
-            <w:r>
-              <w:rPr>
-                <w:rFonts w:ascii="David" w:hAnsi="David" w:cs="David"/>
-                <w:rtl/>
-              </w:rPr>
-              <w:t>}</w:t>
-            </w:r>
-          </w:p>
-        </w:tc>
-        <w:tc>
-          <w:tcPr>
-            <w:tcW w:w="1585" w:type="dxa"/>
-            <w:vAlign w:val="center"/>
-          </w:tcPr>
-          <w:p>
-            <w:pPr>
-              <w:spacing w:after="240"/>
-              <w:jc w:val="center"/>
-              <w:cnfStyle w:val="000000100000" w:firstRow="0" w:lastRow="0" w:firstColumn="0" w:lastColumn="0" w:oddVBand="0" w:evenVBand="0" w:oddHBand="1" w:evenHBand="0" w:firstRowFirstColumn="0" w:firstRowLastColumn="0" w:lastRowFirstColumn="0" w:lastRowLastColumn="0"/>
-              <w:rPr>
-                <w:rFonts w:ascii="David" w:hAnsi="David" w:cs="David"/>
-                <w:rtl/>
-              </w:rPr>
-            </w:pPr>
-            <w:r>
-              <w:rPr>
-                <w:rFonts w:ascii="David" w:hAnsi="David" w:cs="David"/>
-                <w:rtl/>
-              </w:rPr>
-              <w:t>{</w:t>
-            </w:r>
-            <w:r>
-              <w:rPr>
-                <w:rFonts w:ascii="David" w:hAnsi="David" w:cs="David"/>
-              </w:rPr>
-              <w:t>4</w:t>
             </w:r>
             <w:r>
               <w:rPr>
@@ -7164,7 +7848,7 @@
         <w:tc>
           <w:tcPr>
             <w:cnfStyle w:val="001000000000" w:firstRow="0" w:lastRow="0" w:firstColumn="1" w:lastColumn="0" w:oddVBand="0" w:evenVBand="0" w:oddHBand="0" w:evenHBand="0" w:firstRowFirstColumn="0" w:firstRowLastColumn="0" w:lastRowFirstColumn="0" w:lastRowLastColumn="0"/>
-            <w:tcW w:w="1270" w:type="dxa"/>
+            <w:tcW w:w="1216" w:type="dxa"/>
             <w:vMerge/>
             <w:vAlign w:val="center"/>
           </w:tcPr>
@@ -7183,7 +7867,7 @@
         </w:tc>
         <w:tc>
           <w:tcPr>
-            <w:tcW w:w="1148" w:type="dxa"/>
+            <w:tcW w:w="1093" w:type="dxa"/>
             <w:vAlign w:val="center"/>
           </w:tcPr>
           <w:p>
@@ -7211,7 +7895,7 @@
         </w:tc>
         <w:tc>
           <w:tcPr>
-            <w:tcW w:w="1756" w:type="dxa"/>
+            <w:tcW w:w="1585" w:type="dxa"/>
             <w:vAlign w:val="center"/>
           </w:tcPr>
           <w:p>
@@ -7248,7 +7932,7 @@
         </w:tc>
         <w:tc>
           <w:tcPr>
-            <w:tcW w:w="1821" w:type="dxa"/>
+            <w:tcW w:w="1585" w:type="dxa"/>
             <w:vAlign w:val="center"/>
           </w:tcPr>
           <w:p>
@@ -7310,49 +7994,6 @@
                 <w:rFonts w:ascii="David" w:hAnsi="David" w:cs="David"/>
               </w:rPr>
               <w:t>3</w:t>
-            </w:r>
-            <w:r>
-              <w:rPr>
-                <w:rFonts w:ascii="David" w:hAnsi="David" w:cs="David"/>
-              </w:rPr>
-              <w:t xml:space="preserve"> academy </w:t>
-            </w:r>
-            <w:r>
-              <w:rPr>
-                <w:rFonts w:ascii="David" w:hAnsi="David" w:cs="David"/>
-                <w:rtl/>
-              </w:rPr>
-              <w:t>}</w:t>
-            </w:r>
-          </w:p>
-        </w:tc>
-        <w:tc>
-          <w:tcPr>
-            <w:tcW w:w="1585" w:type="dxa"/>
-            <w:vAlign w:val="center"/>
-          </w:tcPr>
-          <w:p>
-            <w:pPr>
-              <w:spacing w:after="240"/>
-              <w:jc w:val="center"/>
-              <w:cnfStyle w:val="000000000000" w:firstRow="0" w:lastRow="0" w:firstColumn="0" w:lastColumn="0" w:oddVBand="0" w:evenVBand="0" w:oddHBand="0" w:evenHBand="0" w:firstRowFirstColumn="0" w:firstRowLastColumn="0" w:lastRowFirstColumn="0" w:lastRowLastColumn="0"/>
-              <w:rPr>
-                <w:rFonts w:ascii="David" w:hAnsi="David" w:cs="David"/>
-                <w:rtl/>
-              </w:rPr>
-            </w:pPr>
-            <w:r>
-              <w:rPr>
-                <w:rFonts w:ascii="David" w:hAnsi="David" w:cs="David"/>
-                <w:rtl/>
-              </w:rPr>
-              <w:t>{</w:t>
-            </w:r>
-            <w:r>
-              <w:rPr>
-                <w:rFonts w:ascii="David" w:hAnsi="David" w:cs="David"/>
-              </w:rPr>
-              <w:t>4</w:t>
             </w:r>
             <w:r>
               <w:rPr>
@@ -7378,7 +8019,7 @@
         <w:tc>
           <w:tcPr>
             <w:cnfStyle w:val="001000000000" w:firstRow="0" w:lastRow="0" w:firstColumn="1" w:lastColumn="0" w:oddVBand="0" w:evenVBand="0" w:oddHBand="0" w:evenHBand="0" w:firstRowFirstColumn="0" w:firstRowLastColumn="0" w:lastRowFirstColumn="0" w:lastRowLastColumn="0"/>
-            <w:tcW w:w="1270" w:type="dxa"/>
+            <w:tcW w:w="1216" w:type="dxa"/>
             <w:vMerge/>
             <w:vAlign w:val="center"/>
           </w:tcPr>
@@ -7397,7 +8038,7 @@
         </w:tc>
         <w:tc>
           <w:tcPr>
-            <w:tcW w:w="1148" w:type="dxa"/>
+            <w:tcW w:w="1093" w:type="dxa"/>
             <w:vAlign w:val="center"/>
           </w:tcPr>
           <w:p>
@@ -7425,7 +8066,7 @@
         </w:tc>
         <w:tc>
           <w:tcPr>
-            <w:tcW w:w="1756" w:type="dxa"/>
+            <w:tcW w:w="1585" w:type="dxa"/>
             <w:vAlign w:val="center"/>
           </w:tcPr>
           <w:p>
@@ -7461,7 +8102,7 @@
         </w:tc>
         <w:tc>
           <w:tcPr>
-            <w:tcW w:w="1821" w:type="dxa"/>
+            <w:tcW w:w="1585" w:type="dxa"/>
             <w:vAlign w:val="center"/>
           </w:tcPr>
           <w:p>
@@ -7522,49 +8163,6 @@
                 <w:rFonts w:ascii="David" w:hAnsi="David" w:cs="David"/>
               </w:rPr>
               <w:t>3</w:t>
-            </w:r>
-            <w:r>
-              <w:rPr>
-                <w:rFonts w:ascii="David" w:hAnsi="David" w:cs="David"/>
-              </w:rPr>
-              <w:t xml:space="preserve"> applicative knowledge</w:t>
-            </w:r>
-            <w:r>
-              <w:rPr>
-                <w:rFonts w:ascii="David" w:hAnsi="David" w:cs="David"/>
-                <w:rtl/>
-              </w:rPr>
-              <w:t>}</w:t>
-            </w:r>
-          </w:p>
-        </w:tc>
-        <w:tc>
-          <w:tcPr>
-            <w:tcW w:w="1585" w:type="dxa"/>
-            <w:vAlign w:val="center"/>
-          </w:tcPr>
-          <w:p>
-            <w:pPr>
-              <w:spacing w:after="240"/>
-              <w:jc w:val="center"/>
-              <w:cnfStyle w:val="000000100000" w:firstRow="0" w:lastRow="0" w:firstColumn="0" w:lastColumn="0" w:oddVBand="0" w:evenVBand="0" w:oddHBand="1" w:evenHBand="0" w:firstRowFirstColumn="0" w:firstRowLastColumn="0" w:lastRowFirstColumn="0" w:lastRowLastColumn="0"/>
-              <w:rPr>
-                <w:rFonts w:ascii="David" w:hAnsi="David" w:cs="David"/>
-                <w:rtl/>
-              </w:rPr>
-            </w:pPr>
-            <w:r>
-              <w:rPr>
-                <w:rFonts w:ascii="David" w:hAnsi="David" w:cs="David"/>
-                <w:rtl/>
-              </w:rPr>
-              <w:t>{</w:t>
-            </w:r>
-            <w:r>
-              <w:rPr>
-                <w:rFonts w:ascii="David" w:hAnsi="David" w:cs="David"/>
-              </w:rPr>
-              <w:t>4</w:t>
             </w:r>
             <w:r>
               <w:rPr>
@@ -7589,7 +8187,7 @@
         <w:tc>
           <w:tcPr>
             <w:cnfStyle w:val="001000000000" w:firstRow="0" w:lastRow="0" w:firstColumn="1" w:lastColumn="0" w:oddVBand="0" w:evenVBand="0" w:oddHBand="0" w:evenHBand="0" w:firstRowFirstColumn="0" w:firstRowLastColumn="0" w:lastRowFirstColumn="0" w:lastRowLastColumn="0"/>
-            <w:tcW w:w="1270" w:type="dxa"/>
+            <w:tcW w:w="1216" w:type="dxa"/>
             <w:vMerge/>
             <w:vAlign w:val="center"/>
           </w:tcPr>
@@ -7608,7 +8206,7 @@
         </w:tc>
         <w:tc>
           <w:tcPr>
-            <w:tcW w:w="1148" w:type="dxa"/>
+            <w:tcW w:w="1093" w:type="dxa"/>
             <w:vAlign w:val="center"/>
           </w:tcPr>
           <w:p>
@@ -7636,7 +8234,7 @@
         </w:tc>
         <w:tc>
           <w:tcPr>
-            <w:tcW w:w="1756" w:type="dxa"/>
+            <w:tcW w:w="1585" w:type="dxa"/>
             <w:vAlign w:val="center"/>
           </w:tcPr>
           <w:p>
@@ -7673,7 +8271,7 @@
         </w:tc>
         <w:tc>
           <w:tcPr>
-            <w:tcW w:w="1821" w:type="dxa"/>
+            <w:tcW w:w="1585" w:type="dxa"/>
             <w:vAlign w:val="center"/>
           </w:tcPr>
           <w:p>
@@ -7735,49 +8333,6 @@
                 <w:rFonts w:ascii="David" w:hAnsi="David" w:cs="David"/>
               </w:rPr>
               <w:t>3</w:t>
-            </w:r>
-            <w:r>
-              <w:rPr>
-                <w:rFonts w:ascii="David" w:hAnsi="David" w:cs="David"/>
-              </w:rPr>
-              <w:t xml:space="preserve"> security</w:t>
-            </w:r>
-            <w:r>
-              <w:rPr>
-                <w:rFonts w:ascii="David" w:hAnsi="David" w:cs="David"/>
-                <w:rtl/>
-              </w:rPr>
-              <w:t>}</w:t>
-            </w:r>
-          </w:p>
-        </w:tc>
-        <w:tc>
-          <w:tcPr>
-            <w:tcW w:w="1585" w:type="dxa"/>
-            <w:vAlign w:val="center"/>
-          </w:tcPr>
-          <w:p>
-            <w:pPr>
-              <w:spacing w:after="240"/>
-              <w:jc w:val="center"/>
-              <w:cnfStyle w:val="000000000000" w:firstRow="0" w:lastRow="0" w:firstColumn="0" w:lastColumn="0" w:oddVBand="0" w:evenVBand="0" w:oddHBand="0" w:evenHBand="0" w:firstRowFirstColumn="0" w:firstRowLastColumn="0" w:lastRowFirstColumn="0" w:lastRowLastColumn="0"/>
-              <w:rPr>
-                <w:rFonts w:ascii="David" w:hAnsi="David" w:cs="David"/>
-                <w:rtl/>
-              </w:rPr>
-            </w:pPr>
-            <w:r>
-              <w:rPr>
-                <w:rFonts w:ascii="David" w:hAnsi="David" w:cs="David"/>
-                <w:rtl/>
-              </w:rPr>
-              <w:t>{</w:t>
-            </w:r>
-            <w:r>
-              <w:rPr>
-                <w:rFonts w:ascii="David" w:hAnsi="David" w:cs="David"/>
-              </w:rPr>
-              <w:t>4</w:t>
             </w:r>
             <w:r>
               <w:rPr>
@@ -7853,16 +8408,24 @@
             <w:r>
               <w:rPr>
                 <w:rFonts w:ascii="David" w:hAnsi="David" w:cs="David"/>
+              </w:rPr>
+              <w:t xml:space="preserve">  </w:t>
+            </w:r>
+            <w:r>
+              <w:rPr>
+                <w:rFonts w:ascii="David" w:hAnsi="David" w:cs="David"/>
                 <w:rtl/>
               </w:rPr>
               <w:t>{</w:t>
             </w:r>
+            <w:proofErr w:type="spellStart"/>
             <w:r>
               <w:rPr>
                 <w:rFonts w:ascii="David" w:hAnsi="David" w:cs="David"/>
               </w:rPr>
               <w:t>progress_graph</w:t>
             </w:r>
+            <w:proofErr w:type="spellEnd"/>
             <w:r>
               <w:rPr>
                 <w:rFonts w:ascii="David" w:hAnsi="David" w:cs="David"/>
@@ -7908,7 +8471,6 @@
           <w:szCs w:val="22"/>
           <w:rtl/>
         </w:rPr>
-        <w:lastRenderedPageBreak/>
         <w:t>בגרף מוצג</w:t>
       </w:r>
       <w:r>
@@ -8332,8 +8894,17 @@
               <w:rPr>
                 <w:rFonts w:ascii="David" w:eastAsia="Arial" w:hAnsi="David" w:cs="David"/>
                 <w:u w:val="single"/>
-              </w:rPr>
-              <w:t>{box}</w:t>
+                <w:rtl/>
+              </w:rPr>
+              <w:br/>
+            </w:r>
+            <w:r>
+              <w:rPr>
+                <w:rFonts w:ascii="David" w:eastAsia="Arial" w:hAnsi="David" w:cs="David" w:hint="cs"/>
+                <w:u w:val="single"/>
+                <w:rtl/>
+              </w:rPr>
+              <w:t>יכולות תוך-אישיות ():</w:t>
             </w:r>
             <w:r>
               <w:rPr>
@@ -8349,14 +8920,23 @@
                 <w:u w:val="single"/>
                 <w:rtl/>
               </w:rPr>
-              <w:t>יכולות תוך-אישיות ():</w:t>
+              <w:t>מנהיגות ():</w:t>
             </w:r>
             <w:r>
               <w:rPr>
                 <w:rFonts w:ascii="David" w:eastAsia="Arial" w:hAnsi="David" w:cs="David"/>
                 <w:u w:val="single"/>
-              </w:rPr>
-              <w:t>{box}</w:t>
+                <w:rtl/>
+              </w:rPr>
+              <w:br/>
+            </w:r>
+            <w:r>
+              <w:rPr>
+                <w:rFonts w:ascii="David" w:eastAsia="Arial" w:hAnsi="David" w:cs="David" w:hint="cs"/>
+                <w:u w:val="single"/>
+                <w:rtl/>
+              </w:rPr>
+              <w:t>מקצועיות ():</w:t>
             </w:r>
             <w:r>
               <w:rPr>
@@ -8372,19 +8952,12 @@
                 <w:u w:val="single"/>
                 <w:rtl/>
               </w:rPr>
-              <w:t>מנהיגות ():</w:t>
+              <w:t>ניהול והתנהלות ():</w:t>
             </w:r>
             <w:r>
               <w:rPr>
                 <w:rFonts w:ascii="David" w:eastAsia="Arial" w:hAnsi="David" w:cs="David"/>
                 <w:u w:val="single"/>
-              </w:rPr>
-              <w:t>{box}</w:t>
-            </w:r>
-            <w:r>
-              <w:rPr>
-                <w:rFonts w:ascii="David" w:eastAsia="Arial" w:hAnsi="David" w:cs="David"/>
-                <w:u w:val="single"/>
                 <w:rtl/>
               </w:rPr>
               <w:br/>
@@ -8395,65 +8968,33 @@
                 <w:u w:val="single"/>
                 <w:rtl/>
               </w:rPr>
-              <w:t>מקצועיות ():</w:t>
+              <w:t>אחר ():</w:t>
             </w:r>
             <w:r>
               <w:rPr>
                 <w:rFonts w:ascii="David" w:eastAsia="Arial" w:hAnsi="David" w:cs="David"/>
-                <w:u w:val="single"/>
-              </w:rPr>
-              <w:t>{box}</w:t>
+              </w:rPr>
+              <w:br/>
             </w:r>
             <w:r>
               <w:rPr>
                 <w:rFonts w:ascii="David" w:eastAsia="Arial" w:hAnsi="David" w:cs="David"/>
-                <w:u w:val="single"/>
-                <w:rtl/>
-              </w:rPr>
-              <w:br/>
-            </w:r>
-            <w:r>
-              <w:rPr>
-                <w:rFonts w:ascii="David" w:eastAsia="Arial" w:hAnsi="David" w:cs="David" w:hint="cs"/>
-                <w:u w:val="single"/>
-                <w:rtl/>
-              </w:rPr>
-              <w:t>ניהול והתנהלות ():</w:t>
-            </w:r>
+              </w:rPr>
+              <w:t xml:space="preserve">{% for point in </w:t>
+            </w:r>
+            <w:proofErr w:type="spellStart"/>
             <w:r>
               <w:rPr>
                 <w:rFonts w:ascii="David" w:eastAsia="Arial" w:hAnsi="David" w:cs="David"/>
-                <w:u w:val="single"/>
-              </w:rPr>
-              <w:t>{box}</w:t>
-            </w:r>
+              </w:rPr>
+              <w:t>conserve.points</w:t>
+            </w:r>
+            <w:proofErr w:type="spellEnd"/>
             <w:r>
               <w:rPr>
                 <w:rFonts w:ascii="David" w:eastAsia="Arial" w:hAnsi="David" w:cs="David"/>
-                <w:u w:val="single"/>
-                <w:rtl/>
-              </w:rPr>
-              <w:br/>
-            </w:r>
-            <w:r>
-              <w:rPr>
-                <w:rFonts w:ascii="David" w:eastAsia="Arial" w:hAnsi="David" w:cs="David" w:hint="cs"/>
-                <w:u w:val="single"/>
-                <w:rtl/>
-              </w:rPr>
-              <w:t>אחר ():</w:t>
-            </w:r>
-            <w:r>
-              <w:rPr>
-                <w:rFonts w:ascii="David" w:eastAsia="Arial" w:hAnsi="David" w:cs="David"/>
-              </w:rPr>
-              <w:br/>
-            </w:r>
-            <w:r>
-              <w:rPr>
-                <w:rFonts w:ascii="David" w:eastAsia="Arial" w:hAnsi="David" w:cs="David"/>
-              </w:rPr>
-              <w:t>{% for point in conserve.points %}</w:t>
+              </w:rPr>
+              <w:t xml:space="preserve"> %}</w:t>
             </w:r>
           </w:p>
           <w:p>
@@ -8471,7 +9012,35 @@
               <w:rPr>
                 <w:rFonts w:ascii="David" w:eastAsia="Arial" w:hAnsi="David" w:cs="David"/>
               </w:rPr>
-              <w:t>{{point}}{% endfor %}</w:t>
+              <w:t>{{point</w:t>
+            </w:r>
+            <w:proofErr w:type="gramStart"/>
+            <w:r>
+              <w:rPr>
+                <w:rFonts w:ascii="David" w:eastAsia="Arial" w:hAnsi="David" w:cs="David"/>
+              </w:rPr>
+              <w:t>}}{</w:t>
+            </w:r>
+            <w:proofErr w:type="gramEnd"/>
+            <w:r>
+              <w:rPr>
+                <w:rFonts w:ascii="David" w:eastAsia="Arial" w:hAnsi="David" w:cs="David"/>
+              </w:rPr>
+              <w:t xml:space="preserve">% </w:t>
+            </w:r>
+            <w:proofErr w:type="spellStart"/>
+            <w:r>
+              <w:rPr>
+                <w:rFonts w:ascii="David" w:eastAsia="Arial" w:hAnsi="David" w:cs="David"/>
+              </w:rPr>
+              <w:t>endfor</w:t>
+            </w:r>
+            <w:proofErr w:type="spellEnd"/>
+            <w:r>
+              <w:rPr>
+                <w:rFonts w:ascii="David" w:eastAsia="Arial" w:hAnsi="David" w:cs="David"/>
+              </w:rPr>
+              <w:t xml:space="preserve"> %}</w:t>
             </w:r>
           </w:p>
         </w:tc>
@@ -8672,8 +9241,17 @@
               <w:rPr>
                 <w:rFonts w:ascii="David" w:eastAsia="Arial" w:hAnsi="David" w:cs="David"/>
                 <w:u w:val="single"/>
-              </w:rPr>
-              <w:t>{box}</w:t>
+                <w:rtl/>
+              </w:rPr>
+              <w:br/>
+            </w:r>
+            <w:r>
+              <w:rPr>
+                <w:rFonts w:ascii="David" w:eastAsia="Arial" w:hAnsi="David" w:cs="David" w:hint="cs"/>
+                <w:u w:val="single"/>
+                <w:rtl/>
+              </w:rPr>
+              <w:t>יכולות תוך-אישיות ():</w:t>
             </w:r>
             <w:r>
               <w:rPr>
@@ -8689,14 +9267,23 @@
                 <w:u w:val="single"/>
                 <w:rtl/>
               </w:rPr>
-              <w:t>יכולות תוך-אישיות ():</w:t>
+              <w:t>מנהיגות ():</w:t>
             </w:r>
             <w:r>
               <w:rPr>
                 <w:rFonts w:ascii="David" w:eastAsia="Arial" w:hAnsi="David" w:cs="David"/>
                 <w:u w:val="single"/>
-              </w:rPr>
-              <w:t>{box}</w:t>
+                <w:rtl/>
+              </w:rPr>
+              <w:br/>
+            </w:r>
+            <w:r>
+              <w:rPr>
+                <w:rFonts w:ascii="David" w:eastAsia="Arial" w:hAnsi="David" w:cs="David" w:hint="cs"/>
+                <w:u w:val="single"/>
+                <w:rtl/>
+              </w:rPr>
+              <w:t>מקצועיות ():</w:t>
             </w:r>
             <w:r>
               <w:rPr>
@@ -8712,19 +9299,12 @@
                 <w:u w:val="single"/>
                 <w:rtl/>
               </w:rPr>
-              <w:t>מנהיגות ():</w:t>
+              <w:t>ניהול והתנהלות ():</w:t>
             </w:r>
             <w:r>
               <w:rPr>
                 <w:rFonts w:ascii="David" w:eastAsia="Arial" w:hAnsi="David" w:cs="David"/>
                 <w:u w:val="single"/>
-              </w:rPr>
-              <w:t>{box}</w:t>
-            </w:r>
-            <w:r>
-              <w:rPr>
-                <w:rFonts w:ascii="David" w:eastAsia="Arial" w:hAnsi="David" w:cs="David"/>
-                <w:u w:val="single"/>
                 <w:rtl/>
               </w:rPr>
               <w:br/>
@@ -8735,73 +9315,34 @@
                 <w:u w:val="single"/>
                 <w:rtl/>
               </w:rPr>
-              <w:t>מקצועיות ():</w:t>
+              <w:t>אחר ():</w:t>
             </w:r>
             <w:r>
               <w:rPr>
                 <w:rFonts w:ascii="David" w:eastAsia="Arial" w:hAnsi="David" w:cs="David"/>
-                <w:u w:val="single"/>
-              </w:rPr>
-              <w:t>{box}</w:t>
+                <w:rtl/>
+              </w:rPr>
+              <w:br/>
             </w:r>
             <w:r>
               <w:rPr>
                 <w:rFonts w:ascii="David" w:eastAsia="Arial" w:hAnsi="David" w:cs="David"/>
-                <w:u w:val="single"/>
-                <w:rtl/>
-              </w:rPr>
-              <w:br/>
-            </w:r>
-            <w:r>
-              <w:rPr>
-                <w:rFonts w:ascii="David" w:eastAsia="Arial" w:hAnsi="David" w:cs="David" w:hint="cs"/>
-                <w:u w:val="single"/>
-                <w:rtl/>
-              </w:rPr>
-              <w:t>ניהול והתנהלות ():</w:t>
-            </w:r>
+              </w:rPr>
+              <w:t xml:space="preserve">{% for point in </w:t>
+            </w:r>
+            <w:proofErr w:type="spellStart"/>
             <w:r>
               <w:rPr>
                 <w:rFonts w:ascii="David" w:eastAsia="Arial" w:hAnsi="David" w:cs="David"/>
-                <w:u w:val="single"/>
-              </w:rPr>
-              <w:t>{box}</w:t>
-            </w:r>
+              </w:rPr>
+              <w:t>improve.points</w:t>
+            </w:r>
+            <w:proofErr w:type="spellEnd"/>
             <w:r>
               <w:rPr>
                 <w:rFonts w:ascii="David" w:eastAsia="Arial" w:hAnsi="David" w:cs="David"/>
-                <w:u w:val="single"/>
-                <w:rtl/>
-              </w:rPr>
-              <w:br/>
-            </w:r>
-            <w:r>
-              <w:rPr>
-                <w:rFonts w:ascii="David" w:eastAsia="Arial" w:hAnsi="David" w:cs="David" w:hint="cs"/>
-                <w:u w:val="single"/>
-                <w:rtl/>
-              </w:rPr>
-              <w:t>אחר ():</w:t>
-            </w:r>
-            <w:r>
-              <w:rPr>
-                <w:rFonts w:ascii="David" w:eastAsia="Arial" w:hAnsi="David" w:cs="David"/>
-                <w:u w:val="single"/>
-              </w:rPr>
-              <w:t>{box}</w:t>
-            </w:r>
-            <w:r>
-              <w:rPr>
-                <w:rFonts w:ascii="David" w:eastAsia="Arial" w:hAnsi="David" w:cs="David"/>
-                <w:rtl/>
-              </w:rPr>
-              <w:br/>
-            </w:r>
-            <w:r>
-              <w:rPr>
-                <w:rFonts w:ascii="David" w:eastAsia="Arial" w:hAnsi="David" w:cs="David"/>
-              </w:rPr>
-              <w:t>{% for point in improve.points %}</w:t>
+              </w:rPr>
+              <w:t xml:space="preserve"> %}</w:t>
             </w:r>
           </w:p>
           <w:p>
@@ -8819,7 +9360,35 @@
               <w:rPr>
                 <w:rFonts w:ascii="David" w:eastAsia="Arial" w:hAnsi="David" w:cs="David"/>
               </w:rPr>
-              <w:t>{{point}}{% endfor %}</w:t>
+              <w:t>{{point</w:t>
+            </w:r>
+            <w:proofErr w:type="gramStart"/>
+            <w:r>
+              <w:rPr>
+                <w:rFonts w:ascii="David" w:eastAsia="Arial" w:hAnsi="David" w:cs="David"/>
+              </w:rPr>
+              <w:t>}}{</w:t>
+            </w:r>
+            <w:proofErr w:type="gramEnd"/>
+            <w:r>
+              <w:rPr>
+                <w:rFonts w:ascii="David" w:eastAsia="Arial" w:hAnsi="David" w:cs="David"/>
+              </w:rPr>
+              <w:t xml:space="preserve">% </w:t>
+            </w:r>
+            <w:proofErr w:type="spellStart"/>
+            <w:r>
+              <w:rPr>
+                <w:rFonts w:ascii="David" w:eastAsia="Arial" w:hAnsi="David" w:cs="David"/>
+              </w:rPr>
+              <w:t>endfor</w:t>
+            </w:r>
+            <w:proofErr w:type="spellEnd"/>
+            <w:r>
+              <w:rPr>
+                <w:rFonts w:ascii="David" w:eastAsia="Arial" w:hAnsi="David" w:cs="David"/>
+              </w:rPr>
+              <w:t xml:space="preserve"> %}</w:t>
             </w:r>
           </w:p>
         </w:tc>
@@ -8857,7 +9426,29 @@
           <w:szCs w:val="22"/>
           <w:rtl/>
         </w:rPr>
-        <w:t>איסוף ועיבוד הנתונים בוצע על ידי גף מא"ה. בניתוח ההערות המילוליות בוצעה חלוקה לקטגוריות על פי מדדי ההערכה, פיצול הערות ועריכה לשמירה על אנונימיות מקסימלית של המעריך</w:t>
+        <w:t xml:space="preserve">איסוף ועיבוד הנתונים בוצע על ידי גף </w:t>
+      </w:r>
+      <w:proofErr w:type="spellStart"/>
+      <w:r>
+        <w:rPr>
+          <w:rFonts w:ascii="David" w:hAnsi="David" w:cs="David"/>
+          <w:color w:val="000000" w:themeColor="text1"/>
+          <w:sz w:val="22"/>
+          <w:szCs w:val="22"/>
+          <w:rtl/>
+        </w:rPr>
+        <w:t>מא"ה</w:t>
+      </w:r>
+      <w:proofErr w:type="spellEnd"/>
+      <w:r>
+        <w:rPr>
+          <w:rFonts w:ascii="David" w:hAnsi="David" w:cs="David"/>
+          <w:color w:val="000000" w:themeColor="text1"/>
+          <w:sz w:val="22"/>
+          <w:szCs w:val="22"/>
+          <w:rtl/>
+        </w:rPr>
+        <w:t>. בניתוח ההערות המילוליות בוצעה חלוקה לקטגוריות על פי מדדי ההערכה, פיצול הערות ועריכה לשמירה על אנונימיות מקסימלית של המעריך</w:t>
       </w:r>
       <w:r>
         <w:rPr>
@@ -8967,7 +9558,7 @@
           <w:p>
             <w:pPr>
               <w:spacing w:line="360" w:lineRule="auto"/>
-              <w:jc w:val="both"/>
+              <w:jc w:val="center"/>
               <w:rPr>
                 <w:rFonts w:ascii="David" w:hAnsi="David" w:cs="David"/>
                 <w:b/>
@@ -8987,6 +9578,7 @@
               </w:rPr>
               <w:t>{</w:t>
             </w:r>
+            <w:proofErr w:type="spellStart"/>
             <w:r>
               <w:rPr>
                 <w:rFonts w:ascii="David" w:hAnsi="David" w:cs="David"/>
@@ -8995,6 +9587,7 @@
               </w:rPr>
               <w:t>knowing_graph</w:t>
             </w:r>
+            <w:proofErr w:type="spellEnd"/>
             <w:r>
               <w:rPr>
                 <w:rFonts w:ascii="David" w:hAnsi="David" w:cs="David"/>
@@ -9033,7 +9626,19 @@
           <w:szCs w:val="22"/>
           <w:rtl/>
         </w:rPr>
-        <w:t>בגרף מוצגת השוואה בין ממוצע ההערכות של מעריכים המכירים את הצוער במידה גבוהה (</w:t>
+        <w:t xml:space="preserve">בגרף מוצגת השוואה בין ממוצע ההערכות של </w:t>
+      </w:r>
+      <w:bookmarkStart w:id="0" w:name="_GoBack"/>
+      <w:bookmarkEnd w:id="0"/>
+      <w:r>
+        <w:rPr>
+          <w:rFonts w:ascii="David" w:hAnsi="David" w:cs="David"/>
+          <w:color w:val="95B3D7" w:themeColor="accent1" w:themeTint="99"/>
+          <w:sz w:val="22"/>
+          <w:szCs w:val="22"/>
+          <w:rtl/>
+        </w:rPr>
+        <w:t>מעריכים המכירים את הצוער במידה גבוהה (</w:t>
       </w:r>
       <w:r>
         <w:rPr>
@@ -9095,7 +9700,7 @@
 </file>
 
 <file path=word/endnotes.xml><?xml version="1.0" encoding="utf-8"?>
-<w:endnotes xmlns:wpc="http://schemas.microsoft.com/office/word/2010/wordprocessingCanvas" xmlns:cx="http://schemas.microsoft.com/office/drawing/2014/chartex" xmlns:cx1="http://schemas.microsoft.com/office/drawing/2015/9/8/chartex" xmlns:cx2="http://schemas.microsoft.com/office/drawing/2015/10/21/chartex" xmlns:cx3="http://schemas.microsoft.com/office/drawing/2016/5/9/chartex" xmlns:cx4="http://schemas.microsoft.com/office/drawing/2016/5/10/chartex" xmlns:cx5="http://schemas.microsoft.com/office/drawing/2016/5/11/chartex" xmlns:cx6="http://schemas.microsoft.com/office/drawing/2016/5/12/chartex" xmlns:cx7="http://schemas.microsoft.com/office/drawing/2016/5/13/chartex" xmlns:cx8="http://schemas.microsoft.com/office/drawing/2016/5/14/chartex" xmlns:mc="http://schemas.openxmlformats.org/markup-compatibility/2006" xmlns:aink="http://schemas.microsoft.com/office/drawing/2016/ink" xmlns:am3d="http://schemas.microsoft.com/office/drawing/2017/model3d" xmlns:o="urn:schemas-microsoft-com:office:office" xmlns:oel="http://schemas.microsoft.com/office/2019/extlst" xmlns:r="http://schemas.openxmlformats.org/officeDocument/2006/relationships" xmlns:m="http://schemas.openxmlformats.org/officeDocument/2006/math" xmlns:v="urn:schemas-microsoft-com:vml" xmlns:wp14="http://schemas.microsoft.com/office/word/2010/wordprocessingDrawing" xmlns:wp="http://schemas.openxmlformats.org/drawingml/2006/wordprocessingDrawing" xmlns:w10="urn:schemas-microsoft-com:office:word" xmlns:w="http://schemas.openxmlformats.org/wordprocessingml/2006/main" xmlns:w14="http://schemas.microsoft.com/office/word/2010/wordml" xmlns:w15="http://schemas.microsoft.com/office/word/2012/wordml" xmlns:w16cex="http://schemas.microsoft.com/office/word/2018/wordml/cex" xmlns:w16cid="http://schemas.microsoft.com/office/word/2016/wordml/cid" xmlns:w16="http://schemas.microsoft.com/office/word/2018/wordml" xmlns:w16du="http://schemas.microsoft.com/office/word/2023/wordml/word16du" xmlns:w16sdtdh="http://schemas.microsoft.com/office/word/2020/wordml/sdtdatahash" xmlns:w16sdtfl="http://schemas.microsoft.com/office/word/2024/wordml/sdtformatlock" xmlns:w16se="http://schemas.microsoft.com/office/word/2015/wordml/symex" xmlns:wpg="http://schemas.microsoft.com/office/word/2010/wordprocessingGroup" xmlns:wpi="http://schemas.microsoft.com/office/word/2010/wordprocessingInk" xmlns:wne="http://schemas.microsoft.com/office/word/2006/wordml" xmlns:wps="http://schemas.microsoft.com/office/word/2010/wordprocessingShape" mc:Ignorable="w14 w15 w16se w16cid w16 w16cex w16sdtdh w16sdtfl w16du wp14">
+<w:endnotes xmlns:wpc="http://schemas.microsoft.com/office/word/2010/wordprocessingCanvas" xmlns:cx="http://schemas.microsoft.com/office/drawing/2014/chartex" xmlns:cx1="http://schemas.microsoft.com/office/drawing/2015/9/8/chartex" xmlns:cx2="http://schemas.microsoft.com/office/drawing/2015/10/21/chartex" xmlns:cx3="http://schemas.microsoft.com/office/drawing/2016/5/9/chartex" xmlns:cx4="http://schemas.microsoft.com/office/drawing/2016/5/10/chartex" xmlns:cx5="http://schemas.microsoft.com/office/drawing/2016/5/11/chartex" xmlns:cx6="http://schemas.microsoft.com/office/drawing/2016/5/12/chartex" xmlns:cx7="http://schemas.microsoft.com/office/drawing/2016/5/13/chartex" xmlns:cx8="http://schemas.microsoft.com/office/drawing/2016/5/14/chartex" xmlns:mc="http://schemas.openxmlformats.org/markup-compatibility/2006" xmlns:aink="http://schemas.microsoft.com/office/drawing/2016/ink" xmlns:am3d="http://schemas.microsoft.com/office/drawing/2017/model3d" xmlns:o="urn:schemas-microsoft-com:office:office" xmlns:r="http://schemas.openxmlformats.org/officeDocument/2006/relationships" xmlns:m="http://schemas.openxmlformats.org/officeDocument/2006/math" xmlns:v="urn:schemas-microsoft-com:vml" xmlns:wp14="http://schemas.microsoft.com/office/word/2010/wordprocessingDrawing" xmlns:wp="http://schemas.openxmlformats.org/drawingml/2006/wordprocessingDrawing" xmlns:w10="urn:schemas-microsoft-com:office:word" xmlns:w="http://schemas.openxmlformats.org/wordprocessingml/2006/main" xmlns:w14="http://schemas.microsoft.com/office/word/2010/wordml" xmlns:w15="http://schemas.microsoft.com/office/word/2012/wordml" xmlns:w16cid="http://schemas.microsoft.com/office/word/2016/wordml/cid" xmlns:w16se="http://schemas.microsoft.com/office/word/2015/wordml/symex" xmlns:wpg="http://schemas.microsoft.com/office/word/2010/wordprocessingGroup" xmlns:wpi="http://schemas.microsoft.com/office/word/2010/wordprocessingInk" xmlns:wne="http://schemas.microsoft.com/office/word/2006/wordml" xmlns:wps="http://schemas.microsoft.com/office/word/2010/wordprocessingShape" mc:Ignorable="w14 w15 w16se w16cid wp14">
   <w:endnote w:type="separator" w:id="-1">
     <w:p>
       <w:r>
@@ -9114,7 +9719,7 @@
 </file>
 
 <file path=word/footer1.xml><?xml version="1.0" encoding="utf-8"?>
-<w:ftr xmlns:wpc="http://schemas.microsoft.com/office/word/2010/wordprocessingCanvas" xmlns:cx="http://schemas.microsoft.com/office/drawing/2014/chartex" xmlns:cx1="http://schemas.microsoft.com/office/drawing/2015/9/8/chartex" xmlns:cx2="http://schemas.microsoft.com/office/drawing/2015/10/21/chartex" xmlns:cx3="http://schemas.microsoft.com/office/drawing/2016/5/9/chartex" xmlns:cx4="http://schemas.microsoft.com/office/drawing/2016/5/10/chartex" xmlns:cx5="http://schemas.microsoft.com/office/drawing/2016/5/11/chartex" xmlns:cx6="http://schemas.microsoft.com/office/drawing/2016/5/12/chartex" xmlns:cx7="http://schemas.microsoft.com/office/drawing/2016/5/13/chartex" xmlns:cx8="http://schemas.microsoft.com/office/drawing/2016/5/14/chartex" xmlns:mc="http://schemas.openxmlformats.org/markup-compatibility/2006" xmlns:aink="http://schemas.microsoft.com/office/drawing/2016/ink" xmlns:am3d="http://schemas.microsoft.com/office/drawing/2017/model3d" xmlns:o="urn:schemas-microsoft-com:office:office" xmlns:oel="http://schemas.microsoft.com/office/2019/extlst" xmlns:r="http://schemas.openxmlformats.org/officeDocument/2006/relationships" xmlns:m="http://schemas.openxmlformats.org/officeDocument/2006/math" xmlns:v="urn:schemas-microsoft-com:vml" xmlns:wp14="http://schemas.microsoft.com/office/word/2010/wordprocessingDrawing" xmlns:wp="http://schemas.openxmlformats.org/drawingml/2006/wordprocessingDrawing" xmlns:w10="urn:schemas-microsoft-com:office:word" xmlns:w="http://schemas.openxmlformats.org/wordprocessingml/2006/main" xmlns:w14="http://schemas.microsoft.com/office/word/2010/wordml" xmlns:w15="http://schemas.microsoft.com/office/word/2012/wordml" xmlns:w16cex="http://schemas.microsoft.com/office/word/2018/wordml/cex" xmlns:w16cid="http://schemas.microsoft.com/office/word/2016/wordml/cid" xmlns:w16="http://schemas.microsoft.com/office/word/2018/wordml" xmlns:w16du="http://schemas.microsoft.com/office/word/2023/wordml/word16du" xmlns:w16sdtdh="http://schemas.microsoft.com/office/word/2020/wordml/sdtdatahash" xmlns:w16sdtfl="http://schemas.microsoft.com/office/word/2024/wordml/sdtformatlock" xmlns:w16se="http://schemas.microsoft.com/office/word/2015/wordml/symex" xmlns:wpg="http://schemas.microsoft.com/office/word/2010/wordprocessingGroup" xmlns:wpi="http://schemas.microsoft.com/office/word/2010/wordprocessingInk" xmlns:wne="http://schemas.microsoft.com/office/word/2006/wordml" xmlns:wps="http://schemas.microsoft.com/office/word/2010/wordprocessingShape" mc:Ignorable="w14 w15 w16se w16cid w16 w16cex w16sdtdh w16sdtfl w16du wp14">
+<w:ftr xmlns:wpc="http://schemas.microsoft.com/office/word/2010/wordprocessingCanvas" xmlns:cx="http://schemas.microsoft.com/office/drawing/2014/chartex" xmlns:cx1="http://schemas.microsoft.com/office/drawing/2015/9/8/chartex" xmlns:cx2="http://schemas.microsoft.com/office/drawing/2015/10/21/chartex" xmlns:cx3="http://schemas.microsoft.com/office/drawing/2016/5/9/chartex" xmlns:cx4="http://schemas.microsoft.com/office/drawing/2016/5/10/chartex" xmlns:cx5="http://schemas.microsoft.com/office/drawing/2016/5/11/chartex" xmlns:cx6="http://schemas.microsoft.com/office/drawing/2016/5/12/chartex" xmlns:cx7="http://schemas.microsoft.com/office/drawing/2016/5/13/chartex" xmlns:cx8="http://schemas.microsoft.com/office/drawing/2016/5/14/chartex" xmlns:mc="http://schemas.openxmlformats.org/markup-compatibility/2006" xmlns:aink="http://schemas.microsoft.com/office/drawing/2016/ink" xmlns:am3d="http://schemas.microsoft.com/office/drawing/2017/model3d" xmlns:o="urn:schemas-microsoft-com:office:office" xmlns:r="http://schemas.openxmlformats.org/officeDocument/2006/relationships" xmlns:m="http://schemas.openxmlformats.org/officeDocument/2006/math" xmlns:v="urn:schemas-microsoft-com:vml" xmlns:wp14="http://schemas.microsoft.com/office/word/2010/wordprocessingDrawing" xmlns:wp="http://schemas.openxmlformats.org/drawingml/2006/wordprocessingDrawing" xmlns:w10="urn:schemas-microsoft-com:office:word" xmlns:w="http://schemas.openxmlformats.org/wordprocessingml/2006/main" xmlns:w14="http://schemas.microsoft.com/office/word/2010/wordml" xmlns:w15="http://schemas.microsoft.com/office/word/2012/wordml" xmlns:w16cid="http://schemas.microsoft.com/office/word/2016/wordml/cid" xmlns:w16se="http://schemas.microsoft.com/office/word/2015/wordml/symex" xmlns:wpg="http://schemas.microsoft.com/office/word/2010/wordprocessingGroup" xmlns:wpi="http://schemas.microsoft.com/office/word/2010/wordprocessingInk" xmlns:wne="http://schemas.microsoft.com/office/word/2006/wordml" xmlns:wps="http://schemas.microsoft.com/office/word/2010/wordprocessingShape" mc:Ignorable="w14 w15 w16se w16cid wp14">
   <w:p>
     <w:pPr>
       <w:pStyle w:val="Footer"/>
@@ -9141,7 +9746,7 @@
 </file>
 
 <file path=word/footer2.xml><?xml version="1.0" encoding="utf-8"?>
-<w:ftr xmlns:wpc="http://schemas.microsoft.com/office/word/2010/wordprocessingCanvas" xmlns:cx="http://schemas.microsoft.com/office/drawing/2014/chartex" xmlns:cx1="http://schemas.microsoft.com/office/drawing/2015/9/8/chartex" xmlns:cx2="http://schemas.microsoft.com/office/drawing/2015/10/21/chartex" xmlns:cx3="http://schemas.microsoft.com/office/drawing/2016/5/9/chartex" xmlns:cx4="http://schemas.microsoft.com/office/drawing/2016/5/10/chartex" xmlns:cx5="http://schemas.microsoft.com/office/drawing/2016/5/11/chartex" xmlns:cx6="http://schemas.microsoft.com/office/drawing/2016/5/12/chartex" xmlns:cx7="http://schemas.microsoft.com/office/drawing/2016/5/13/chartex" xmlns:cx8="http://schemas.microsoft.com/office/drawing/2016/5/14/chartex" xmlns:mc="http://schemas.openxmlformats.org/markup-compatibility/2006" xmlns:aink="http://schemas.microsoft.com/office/drawing/2016/ink" xmlns:am3d="http://schemas.microsoft.com/office/drawing/2017/model3d" xmlns:o="urn:schemas-microsoft-com:office:office" xmlns:oel="http://schemas.microsoft.com/office/2019/extlst" xmlns:r="http://schemas.openxmlformats.org/officeDocument/2006/relationships" xmlns:m="http://schemas.openxmlformats.org/officeDocument/2006/math" xmlns:v="urn:schemas-microsoft-com:vml" xmlns:wp14="http://schemas.microsoft.com/office/word/2010/wordprocessingDrawing" xmlns:wp="http://schemas.openxmlformats.org/drawingml/2006/wordprocessingDrawing" xmlns:w10="urn:schemas-microsoft-com:office:word" xmlns:w="http://schemas.openxmlformats.org/wordprocessingml/2006/main" xmlns:w14="http://schemas.microsoft.com/office/word/2010/wordml" xmlns:w15="http://schemas.microsoft.com/office/word/2012/wordml" xmlns:w16cex="http://schemas.microsoft.com/office/word/2018/wordml/cex" xmlns:w16cid="http://schemas.microsoft.com/office/word/2016/wordml/cid" xmlns:w16="http://schemas.microsoft.com/office/word/2018/wordml" xmlns:w16du="http://schemas.microsoft.com/office/word/2023/wordml/word16du" xmlns:w16sdtdh="http://schemas.microsoft.com/office/word/2020/wordml/sdtdatahash" xmlns:w16sdtfl="http://schemas.microsoft.com/office/word/2024/wordml/sdtformatlock" xmlns:w16se="http://schemas.microsoft.com/office/word/2015/wordml/symex" xmlns:wpg="http://schemas.microsoft.com/office/word/2010/wordprocessingGroup" xmlns:wpi="http://schemas.microsoft.com/office/word/2010/wordprocessingInk" xmlns:wne="http://schemas.microsoft.com/office/word/2006/wordml" xmlns:wps="http://schemas.microsoft.com/office/word/2010/wordprocessingShape" mc:Ignorable="w14 w15 w16se w16cid w16 w16cex w16sdtdh w16sdtfl w16du wp14">
+<w:ftr xmlns:wpc="http://schemas.microsoft.com/office/word/2010/wordprocessingCanvas" xmlns:cx="http://schemas.microsoft.com/office/drawing/2014/chartex" xmlns:cx1="http://schemas.microsoft.com/office/drawing/2015/9/8/chartex" xmlns:cx2="http://schemas.microsoft.com/office/drawing/2015/10/21/chartex" xmlns:cx3="http://schemas.microsoft.com/office/drawing/2016/5/9/chartex" xmlns:cx4="http://schemas.microsoft.com/office/drawing/2016/5/10/chartex" xmlns:cx5="http://schemas.microsoft.com/office/drawing/2016/5/11/chartex" xmlns:cx6="http://schemas.microsoft.com/office/drawing/2016/5/12/chartex" xmlns:cx7="http://schemas.microsoft.com/office/drawing/2016/5/13/chartex" xmlns:cx8="http://schemas.microsoft.com/office/drawing/2016/5/14/chartex" xmlns:mc="http://schemas.openxmlformats.org/markup-compatibility/2006" xmlns:aink="http://schemas.microsoft.com/office/drawing/2016/ink" xmlns:am3d="http://schemas.microsoft.com/office/drawing/2017/model3d" xmlns:o="urn:schemas-microsoft-com:office:office" xmlns:r="http://schemas.openxmlformats.org/officeDocument/2006/relationships" xmlns:m="http://schemas.openxmlformats.org/officeDocument/2006/math" xmlns:v="urn:schemas-microsoft-com:vml" xmlns:wp14="http://schemas.microsoft.com/office/word/2010/wordprocessingDrawing" xmlns:wp="http://schemas.openxmlformats.org/drawingml/2006/wordprocessingDrawing" xmlns:w10="urn:schemas-microsoft-com:office:word" xmlns:w="http://schemas.openxmlformats.org/wordprocessingml/2006/main" xmlns:w14="http://schemas.microsoft.com/office/word/2010/wordml" xmlns:w15="http://schemas.microsoft.com/office/word/2012/wordml" xmlns:w16cid="http://schemas.microsoft.com/office/word/2016/wordml/cid" xmlns:w16se="http://schemas.microsoft.com/office/word/2015/wordml/symex" xmlns:wpg="http://schemas.microsoft.com/office/word/2010/wordprocessingGroup" xmlns:wpi="http://schemas.microsoft.com/office/word/2010/wordprocessingInk" xmlns:wne="http://schemas.microsoft.com/office/word/2006/wordml" xmlns:wps="http://schemas.microsoft.com/office/word/2010/wordprocessingShape" mc:Ignorable="w14 w15 w16se w16cid wp14">
   <w:p>
     <w:pPr>
       <w:pStyle w:val="Footer"/>
@@ -9168,7 +9773,7 @@
 </file>
 
 <file path=word/footnotes.xml><?xml version="1.0" encoding="utf-8"?>
-<w:footnotes xmlns:wpc="http://schemas.microsoft.com/office/word/2010/wordprocessingCanvas" xmlns:cx="http://schemas.microsoft.com/office/drawing/2014/chartex" xmlns:cx1="http://schemas.microsoft.com/office/drawing/2015/9/8/chartex" xmlns:cx2="http://schemas.microsoft.com/office/drawing/2015/10/21/chartex" xmlns:cx3="http://schemas.microsoft.com/office/drawing/2016/5/9/chartex" xmlns:cx4="http://schemas.microsoft.com/office/drawing/2016/5/10/chartex" xmlns:cx5="http://schemas.microsoft.com/office/drawing/2016/5/11/chartex" xmlns:cx6="http://schemas.microsoft.com/office/drawing/2016/5/12/chartex" xmlns:cx7="http://schemas.microsoft.com/office/drawing/2016/5/13/chartex" xmlns:cx8="http://schemas.microsoft.com/office/drawing/2016/5/14/chartex" xmlns:mc="http://schemas.openxmlformats.org/markup-compatibility/2006" xmlns:aink="http://schemas.microsoft.com/office/drawing/2016/ink" xmlns:am3d="http://schemas.microsoft.com/office/drawing/2017/model3d" xmlns:o="urn:schemas-microsoft-com:office:office" xmlns:oel="http://schemas.microsoft.com/office/2019/extlst" xmlns:r="http://schemas.openxmlformats.org/officeDocument/2006/relationships" xmlns:m="http://schemas.openxmlformats.org/officeDocument/2006/math" xmlns:v="urn:schemas-microsoft-com:vml" xmlns:wp14="http://schemas.microsoft.com/office/word/2010/wordprocessingDrawing" xmlns:wp="http://schemas.openxmlformats.org/drawingml/2006/wordprocessingDrawing" xmlns:w10="urn:schemas-microsoft-com:office:word" xmlns:w="http://schemas.openxmlformats.org/wordprocessingml/2006/main" xmlns:w14="http://schemas.microsoft.com/office/word/2010/wordml" xmlns:w15="http://schemas.microsoft.com/office/word/2012/wordml" xmlns:w16cex="http://schemas.microsoft.com/office/word/2018/wordml/cex" xmlns:w16cid="http://schemas.microsoft.com/office/word/2016/wordml/cid" xmlns:w16="http://schemas.microsoft.com/office/word/2018/wordml" xmlns:w16du="http://schemas.microsoft.com/office/word/2023/wordml/word16du" xmlns:w16sdtdh="http://schemas.microsoft.com/office/word/2020/wordml/sdtdatahash" xmlns:w16sdtfl="http://schemas.microsoft.com/office/word/2024/wordml/sdtformatlock" xmlns:w16se="http://schemas.microsoft.com/office/word/2015/wordml/symex" xmlns:wpg="http://schemas.microsoft.com/office/word/2010/wordprocessingGroup" xmlns:wpi="http://schemas.microsoft.com/office/word/2010/wordprocessingInk" xmlns:wne="http://schemas.microsoft.com/office/word/2006/wordml" xmlns:wps="http://schemas.microsoft.com/office/word/2010/wordprocessingShape" mc:Ignorable="w14 w15 w16se w16cid w16 w16cex w16sdtdh w16sdtfl w16du wp14">
+<w:footnotes xmlns:wpc="http://schemas.microsoft.com/office/word/2010/wordprocessingCanvas" xmlns:cx="http://schemas.microsoft.com/office/drawing/2014/chartex" xmlns:cx1="http://schemas.microsoft.com/office/drawing/2015/9/8/chartex" xmlns:cx2="http://schemas.microsoft.com/office/drawing/2015/10/21/chartex" xmlns:cx3="http://schemas.microsoft.com/office/drawing/2016/5/9/chartex" xmlns:cx4="http://schemas.microsoft.com/office/drawing/2016/5/10/chartex" xmlns:cx5="http://schemas.microsoft.com/office/drawing/2016/5/11/chartex" xmlns:cx6="http://schemas.microsoft.com/office/drawing/2016/5/12/chartex" xmlns:cx7="http://schemas.microsoft.com/office/drawing/2016/5/13/chartex" xmlns:cx8="http://schemas.microsoft.com/office/drawing/2016/5/14/chartex" xmlns:mc="http://schemas.openxmlformats.org/markup-compatibility/2006" xmlns:aink="http://schemas.microsoft.com/office/drawing/2016/ink" xmlns:am3d="http://schemas.microsoft.com/office/drawing/2017/model3d" xmlns:o="urn:schemas-microsoft-com:office:office" xmlns:r="http://schemas.openxmlformats.org/officeDocument/2006/relationships" xmlns:m="http://schemas.openxmlformats.org/officeDocument/2006/math" xmlns:v="urn:schemas-microsoft-com:vml" xmlns:wp14="http://schemas.microsoft.com/office/word/2010/wordprocessingDrawing" xmlns:wp="http://schemas.openxmlformats.org/drawingml/2006/wordprocessingDrawing" xmlns:w10="urn:schemas-microsoft-com:office:word" xmlns:w="http://schemas.openxmlformats.org/wordprocessingml/2006/main" xmlns:w14="http://schemas.microsoft.com/office/word/2010/wordml" xmlns:w15="http://schemas.microsoft.com/office/word/2012/wordml" xmlns:w16cid="http://schemas.microsoft.com/office/word/2016/wordml/cid" xmlns:w16se="http://schemas.microsoft.com/office/word/2015/wordml/symex" xmlns:wpg="http://schemas.microsoft.com/office/word/2010/wordprocessingGroup" xmlns:wpi="http://schemas.microsoft.com/office/word/2010/wordprocessingInk" xmlns:wne="http://schemas.microsoft.com/office/word/2006/wordml" xmlns:wps="http://schemas.microsoft.com/office/word/2010/wordprocessingShape" mc:Ignorable="w14 w15 w16se w16cid wp14">
   <w:footnote w:type="separator" w:id="-1">
     <w:p>
       <w:r>
@@ -9187,7 +9792,7 @@
 </file>
 
 <file path=word/header1.xml><?xml version="1.0" encoding="utf-8"?>
-<w:hdr xmlns:wpc="http://schemas.microsoft.com/office/word/2010/wordprocessingCanvas" xmlns:cx="http://schemas.microsoft.com/office/drawing/2014/chartex" xmlns:cx1="http://schemas.microsoft.com/office/drawing/2015/9/8/chartex" xmlns:cx2="http://schemas.microsoft.com/office/drawing/2015/10/21/chartex" xmlns:cx3="http://schemas.microsoft.com/office/drawing/2016/5/9/chartex" xmlns:cx4="http://schemas.microsoft.com/office/drawing/2016/5/10/chartex" xmlns:cx5="http://schemas.microsoft.com/office/drawing/2016/5/11/chartex" xmlns:cx6="http://schemas.microsoft.com/office/drawing/2016/5/12/chartex" xmlns:cx7="http://schemas.microsoft.com/office/drawing/2016/5/13/chartex" xmlns:cx8="http://schemas.microsoft.com/office/drawing/2016/5/14/chartex" xmlns:mc="http://schemas.openxmlformats.org/markup-compatibility/2006" xmlns:aink="http://schemas.microsoft.com/office/drawing/2016/ink" xmlns:am3d="http://schemas.microsoft.com/office/drawing/2017/model3d" xmlns:o="urn:schemas-microsoft-com:office:office" xmlns:oel="http://schemas.microsoft.com/office/2019/extlst" xmlns:r="http://schemas.openxmlformats.org/officeDocument/2006/relationships" xmlns:m="http://schemas.openxmlformats.org/officeDocument/2006/math" xmlns:v="urn:schemas-microsoft-com:vml" xmlns:wp14="http://schemas.microsoft.com/office/word/2010/wordprocessingDrawing" xmlns:wp="http://schemas.openxmlformats.org/drawingml/2006/wordprocessingDrawing" xmlns:w10="urn:schemas-microsoft-com:office:word" xmlns:w="http://schemas.openxmlformats.org/wordprocessingml/2006/main" xmlns:w14="http://schemas.microsoft.com/office/word/2010/wordml" xmlns:w15="http://schemas.microsoft.com/office/word/2012/wordml" xmlns:w16cex="http://schemas.microsoft.com/office/word/2018/wordml/cex" xmlns:w16cid="http://schemas.microsoft.com/office/word/2016/wordml/cid" xmlns:w16="http://schemas.microsoft.com/office/word/2018/wordml" xmlns:w16du="http://schemas.microsoft.com/office/word/2023/wordml/word16du" xmlns:w16sdtdh="http://schemas.microsoft.com/office/word/2020/wordml/sdtdatahash" xmlns:w16sdtfl="http://schemas.microsoft.com/office/word/2024/wordml/sdtformatlock" xmlns:w16se="http://schemas.microsoft.com/office/word/2015/wordml/symex" xmlns:wpg="http://schemas.microsoft.com/office/word/2010/wordprocessingGroup" xmlns:wpi="http://schemas.microsoft.com/office/word/2010/wordprocessingInk" xmlns:wne="http://schemas.microsoft.com/office/word/2006/wordml" xmlns:wps="http://schemas.microsoft.com/office/word/2010/wordprocessingShape" mc:Ignorable="w14 w15 w16se w16cid w16 w16cex w16sdtdh w16sdtfl w16du wp14">
+<w:hdr xmlns:wpc="http://schemas.microsoft.com/office/word/2010/wordprocessingCanvas" xmlns:cx="http://schemas.microsoft.com/office/drawing/2014/chartex" xmlns:cx1="http://schemas.microsoft.com/office/drawing/2015/9/8/chartex" xmlns:cx2="http://schemas.microsoft.com/office/drawing/2015/10/21/chartex" xmlns:cx3="http://schemas.microsoft.com/office/drawing/2016/5/9/chartex" xmlns:cx4="http://schemas.microsoft.com/office/drawing/2016/5/10/chartex" xmlns:cx5="http://schemas.microsoft.com/office/drawing/2016/5/11/chartex" xmlns:cx6="http://schemas.microsoft.com/office/drawing/2016/5/12/chartex" xmlns:cx7="http://schemas.microsoft.com/office/drawing/2016/5/13/chartex" xmlns:cx8="http://schemas.microsoft.com/office/drawing/2016/5/14/chartex" xmlns:mc="http://schemas.openxmlformats.org/markup-compatibility/2006" xmlns:aink="http://schemas.microsoft.com/office/drawing/2016/ink" xmlns:am3d="http://schemas.microsoft.com/office/drawing/2017/model3d" xmlns:o="urn:schemas-microsoft-com:office:office" xmlns:r="http://schemas.openxmlformats.org/officeDocument/2006/relationships" xmlns:m="http://schemas.openxmlformats.org/officeDocument/2006/math" xmlns:v="urn:schemas-microsoft-com:vml" xmlns:wp14="http://schemas.microsoft.com/office/word/2010/wordprocessingDrawing" xmlns:wp="http://schemas.openxmlformats.org/drawingml/2006/wordprocessingDrawing" xmlns:w10="urn:schemas-microsoft-com:office:word" xmlns:w="http://schemas.openxmlformats.org/wordprocessingml/2006/main" xmlns:w14="http://schemas.microsoft.com/office/word/2010/wordml" xmlns:w15="http://schemas.microsoft.com/office/word/2012/wordml" xmlns:w16cid="http://schemas.microsoft.com/office/word/2016/wordml/cid" xmlns:w16se="http://schemas.microsoft.com/office/word/2015/wordml/symex" xmlns:wpg="http://schemas.microsoft.com/office/word/2010/wordprocessingGroup" xmlns:wpi="http://schemas.microsoft.com/office/word/2010/wordprocessingInk" xmlns:wne="http://schemas.microsoft.com/office/word/2006/wordml" xmlns:wps="http://schemas.microsoft.com/office/word/2010/wordprocessingShape" mc:Ignorable="w14 w15 w16se w16cid wp14">
   <w:p>
     <w:pPr>
       <w:pStyle w:val="Header"/>
@@ -9240,7 +9845,7 @@
 </file>
 
 <file path=word/header2.xml><?xml version="1.0" encoding="utf-8"?>
-<w:hdr xmlns:wpc="http://schemas.microsoft.com/office/word/2010/wordprocessingCanvas" xmlns:cx="http://schemas.microsoft.com/office/drawing/2014/chartex" xmlns:cx1="http://schemas.microsoft.com/office/drawing/2015/9/8/chartex" xmlns:cx2="http://schemas.microsoft.com/office/drawing/2015/10/21/chartex" xmlns:cx3="http://schemas.microsoft.com/office/drawing/2016/5/9/chartex" xmlns:cx4="http://schemas.microsoft.com/office/drawing/2016/5/10/chartex" xmlns:cx5="http://schemas.microsoft.com/office/drawing/2016/5/11/chartex" xmlns:cx6="http://schemas.microsoft.com/office/drawing/2016/5/12/chartex" xmlns:cx7="http://schemas.microsoft.com/office/drawing/2016/5/13/chartex" xmlns:cx8="http://schemas.microsoft.com/office/drawing/2016/5/14/chartex" xmlns:mc="http://schemas.openxmlformats.org/markup-compatibility/2006" xmlns:aink="http://schemas.microsoft.com/office/drawing/2016/ink" xmlns:am3d="http://schemas.microsoft.com/office/drawing/2017/model3d" xmlns:o="urn:schemas-microsoft-com:office:office" xmlns:oel="http://schemas.microsoft.com/office/2019/extlst" xmlns:r="http://schemas.openxmlformats.org/officeDocument/2006/relationships" xmlns:m="http://schemas.openxmlformats.org/officeDocument/2006/math" xmlns:v="urn:schemas-microsoft-com:vml" xmlns:wp14="http://schemas.microsoft.com/office/word/2010/wordprocessingDrawing" xmlns:wp="http://schemas.openxmlformats.org/drawingml/2006/wordprocessingDrawing" xmlns:w10="urn:schemas-microsoft-com:office:word" xmlns:w="http://schemas.openxmlformats.org/wordprocessingml/2006/main" xmlns:w14="http://schemas.microsoft.com/office/word/2010/wordml" xmlns:w15="http://schemas.microsoft.com/office/word/2012/wordml" xmlns:w16cex="http://schemas.microsoft.com/office/word/2018/wordml/cex" xmlns:w16cid="http://schemas.microsoft.com/office/word/2016/wordml/cid" xmlns:w16="http://schemas.microsoft.com/office/word/2018/wordml" xmlns:w16du="http://schemas.microsoft.com/office/word/2023/wordml/word16du" xmlns:w16sdtdh="http://schemas.microsoft.com/office/word/2020/wordml/sdtdatahash" xmlns:w16sdtfl="http://schemas.microsoft.com/office/word/2024/wordml/sdtformatlock" xmlns:w16se="http://schemas.microsoft.com/office/word/2015/wordml/symex" xmlns:wpg="http://schemas.microsoft.com/office/word/2010/wordprocessingGroup" xmlns:wpi="http://schemas.microsoft.com/office/word/2010/wordprocessingInk" xmlns:wne="http://schemas.microsoft.com/office/word/2006/wordml" xmlns:wps="http://schemas.microsoft.com/office/word/2010/wordprocessingShape" mc:Ignorable="w14 w15 w16se w16cid w16 w16cex w16sdtdh w16sdtfl w16du wp14">
+<w:hdr xmlns:wpc="http://schemas.microsoft.com/office/word/2010/wordprocessingCanvas" xmlns:cx="http://schemas.microsoft.com/office/drawing/2014/chartex" xmlns:cx1="http://schemas.microsoft.com/office/drawing/2015/9/8/chartex" xmlns:cx2="http://schemas.microsoft.com/office/drawing/2015/10/21/chartex" xmlns:cx3="http://schemas.microsoft.com/office/drawing/2016/5/9/chartex" xmlns:cx4="http://schemas.microsoft.com/office/drawing/2016/5/10/chartex" xmlns:cx5="http://schemas.microsoft.com/office/drawing/2016/5/11/chartex" xmlns:cx6="http://schemas.microsoft.com/office/drawing/2016/5/12/chartex" xmlns:cx7="http://schemas.microsoft.com/office/drawing/2016/5/13/chartex" xmlns:cx8="http://schemas.microsoft.com/office/drawing/2016/5/14/chartex" xmlns:mc="http://schemas.openxmlformats.org/markup-compatibility/2006" xmlns:aink="http://schemas.microsoft.com/office/drawing/2016/ink" xmlns:am3d="http://schemas.microsoft.com/office/drawing/2017/model3d" xmlns:o="urn:schemas-microsoft-com:office:office" xmlns:r="http://schemas.openxmlformats.org/officeDocument/2006/relationships" xmlns:m="http://schemas.openxmlformats.org/officeDocument/2006/math" xmlns:v="urn:schemas-microsoft-com:vml" xmlns:wp14="http://schemas.microsoft.com/office/word/2010/wordprocessingDrawing" xmlns:wp="http://schemas.openxmlformats.org/drawingml/2006/wordprocessingDrawing" xmlns:w10="urn:schemas-microsoft-com:office:word" xmlns:w="http://schemas.openxmlformats.org/wordprocessingml/2006/main" xmlns:w14="http://schemas.microsoft.com/office/word/2010/wordml" xmlns:w15="http://schemas.microsoft.com/office/word/2012/wordml" xmlns:w16cid="http://schemas.microsoft.com/office/word/2016/wordml/cid" xmlns:w16se="http://schemas.microsoft.com/office/word/2015/wordml/symex" xmlns:wpg="http://schemas.microsoft.com/office/word/2010/wordprocessingGroup" xmlns:wpi="http://schemas.microsoft.com/office/word/2010/wordprocessingInk" xmlns:wne="http://schemas.microsoft.com/office/word/2006/wordml" xmlns:wps="http://schemas.microsoft.com/office/word/2010/wordprocessingShape" mc:Ignorable="w14 w15 w16se w16cid wp14">
   <w:p>
     <w:pPr>
       <w:pStyle w:val="Footer"/>
@@ -9368,7 +9973,7 @@
 </file>
 
 <file path=word/header3.xml><?xml version="1.0" encoding="utf-8"?>
-<w:hdr xmlns:wpc="http://schemas.microsoft.com/office/word/2010/wordprocessingCanvas" xmlns:cx="http://schemas.microsoft.com/office/drawing/2014/chartex" xmlns:cx1="http://schemas.microsoft.com/office/drawing/2015/9/8/chartex" xmlns:cx2="http://schemas.microsoft.com/office/drawing/2015/10/21/chartex" xmlns:cx3="http://schemas.microsoft.com/office/drawing/2016/5/9/chartex" xmlns:cx4="http://schemas.microsoft.com/office/drawing/2016/5/10/chartex" xmlns:cx5="http://schemas.microsoft.com/office/drawing/2016/5/11/chartex" xmlns:cx6="http://schemas.microsoft.com/office/drawing/2016/5/12/chartex" xmlns:cx7="http://schemas.microsoft.com/office/drawing/2016/5/13/chartex" xmlns:cx8="http://schemas.microsoft.com/office/drawing/2016/5/14/chartex" xmlns:mc="http://schemas.openxmlformats.org/markup-compatibility/2006" xmlns:aink="http://schemas.microsoft.com/office/drawing/2016/ink" xmlns:am3d="http://schemas.microsoft.com/office/drawing/2017/model3d" xmlns:o="urn:schemas-microsoft-com:office:office" xmlns:oel="http://schemas.microsoft.com/office/2019/extlst" xmlns:r="http://schemas.openxmlformats.org/officeDocument/2006/relationships" xmlns:m="http://schemas.openxmlformats.org/officeDocument/2006/math" xmlns:v="urn:schemas-microsoft-com:vml" xmlns:wp14="http://schemas.microsoft.com/office/word/2010/wordprocessingDrawing" xmlns:wp="http://schemas.openxmlformats.org/drawingml/2006/wordprocessingDrawing" xmlns:w10="urn:schemas-microsoft-com:office:word" xmlns:w="http://schemas.openxmlformats.org/wordprocessingml/2006/main" xmlns:w14="http://schemas.microsoft.com/office/word/2010/wordml" xmlns:w15="http://schemas.microsoft.com/office/word/2012/wordml" xmlns:w16cex="http://schemas.microsoft.com/office/word/2018/wordml/cex" xmlns:w16cid="http://schemas.microsoft.com/office/word/2016/wordml/cid" xmlns:w16="http://schemas.microsoft.com/office/word/2018/wordml" xmlns:w16du="http://schemas.microsoft.com/office/word/2023/wordml/word16du" xmlns:w16sdtdh="http://schemas.microsoft.com/office/word/2020/wordml/sdtdatahash" xmlns:w16sdtfl="http://schemas.microsoft.com/office/word/2024/wordml/sdtformatlock" xmlns:w16se="http://schemas.microsoft.com/office/word/2015/wordml/symex" xmlns:wpg="http://schemas.microsoft.com/office/word/2010/wordprocessingGroup" xmlns:wpi="http://schemas.microsoft.com/office/word/2010/wordprocessingInk" xmlns:wne="http://schemas.microsoft.com/office/word/2006/wordml" xmlns:wps="http://schemas.microsoft.com/office/word/2010/wordprocessingShape" mc:Ignorable="w14 w15 w16se w16cid w16 w16cex w16sdtdh w16sdtfl w16du wp14">
+<w:hdr xmlns:wpc="http://schemas.microsoft.com/office/word/2010/wordprocessingCanvas" xmlns:cx="http://schemas.microsoft.com/office/drawing/2014/chartex" xmlns:cx1="http://schemas.microsoft.com/office/drawing/2015/9/8/chartex" xmlns:cx2="http://schemas.microsoft.com/office/drawing/2015/10/21/chartex" xmlns:cx3="http://schemas.microsoft.com/office/drawing/2016/5/9/chartex" xmlns:cx4="http://schemas.microsoft.com/office/drawing/2016/5/10/chartex" xmlns:cx5="http://schemas.microsoft.com/office/drawing/2016/5/11/chartex" xmlns:cx6="http://schemas.microsoft.com/office/drawing/2016/5/12/chartex" xmlns:cx7="http://schemas.microsoft.com/office/drawing/2016/5/13/chartex" xmlns:cx8="http://schemas.microsoft.com/office/drawing/2016/5/14/chartex" xmlns:mc="http://schemas.openxmlformats.org/markup-compatibility/2006" xmlns:aink="http://schemas.microsoft.com/office/drawing/2016/ink" xmlns:am3d="http://schemas.microsoft.com/office/drawing/2017/model3d" xmlns:o="urn:schemas-microsoft-com:office:office" xmlns:r="http://schemas.openxmlformats.org/officeDocument/2006/relationships" xmlns:m="http://schemas.openxmlformats.org/officeDocument/2006/math" xmlns:v="urn:schemas-microsoft-com:vml" xmlns:wp14="http://schemas.microsoft.com/office/word/2010/wordprocessingDrawing" xmlns:wp="http://schemas.openxmlformats.org/drawingml/2006/wordprocessingDrawing" xmlns:w10="urn:schemas-microsoft-com:office:word" xmlns:w="http://schemas.openxmlformats.org/wordprocessingml/2006/main" xmlns:w14="http://schemas.microsoft.com/office/word/2010/wordml" xmlns:w15="http://schemas.microsoft.com/office/word/2012/wordml" xmlns:w16cid="http://schemas.microsoft.com/office/word/2016/wordml/cid" xmlns:w16se="http://schemas.microsoft.com/office/word/2015/wordml/symex" xmlns:wpg="http://schemas.microsoft.com/office/word/2010/wordprocessingGroup" xmlns:wpi="http://schemas.microsoft.com/office/word/2010/wordprocessingInk" xmlns:wne="http://schemas.microsoft.com/office/word/2006/wordml" xmlns:wps="http://schemas.microsoft.com/office/word/2010/wordprocessingShape" mc:Ignorable="w14 w15 w16se w16cid wp14">
   <w:p>
     <w:pPr>
       <w:pStyle w:val="Header"/>
@@ -9455,7 +10060,7 @@
 </file>
 
 <file path=word/numbering.xml><?xml version="1.0" encoding="utf-8"?>
-<w:numbering xmlns:wpc="http://schemas.microsoft.com/office/word/2010/wordprocessingCanvas" xmlns:cx="http://schemas.microsoft.com/office/drawing/2014/chartex" xmlns:cx1="http://schemas.microsoft.com/office/drawing/2015/9/8/chartex" xmlns:cx2="http://schemas.microsoft.com/office/drawing/2015/10/21/chartex" xmlns:cx3="http://schemas.microsoft.com/office/drawing/2016/5/9/chartex" xmlns:cx4="http://schemas.microsoft.com/office/drawing/2016/5/10/chartex" xmlns:cx5="http://schemas.microsoft.com/office/drawing/2016/5/11/chartex" xmlns:cx6="http://schemas.microsoft.com/office/drawing/2016/5/12/chartex" xmlns:cx7="http://schemas.microsoft.com/office/drawing/2016/5/13/chartex" xmlns:cx8="http://schemas.microsoft.com/office/drawing/2016/5/14/chartex" xmlns:mc="http://schemas.openxmlformats.org/markup-compatibility/2006" xmlns:aink="http://schemas.microsoft.com/office/drawing/2016/ink" xmlns:am3d="http://schemas.microsoft.com/office/drawing/2017/model3d" xmlns:o="urn:schemas-microsoft-com:office:office" xmlns:oel="http://schemas.microsoft.com/office/2019/extlst" xmlns:r="http://schemas.openxmlformats.org/officeDocument/2006/relationships" xmlns:m="http://schemas.openxmlformats.org/officeDocument/2006/math" xmlns:v="urn:schemas-microsoft-com:vml" xmlns:wp14="http://schemas.microsoft.com/office/word/2010/wordprocessingDrawing" xmlns:wp="http://schemas.openxmlformats.org/drawingml/2006/wordprocessingDrawing" xmlns:w10="urn:schemas-microsoft-com:office:word" xmlns:w="http://schemas.openxmlformats.org/wordprocessingml/2006/main" xmlns:w14="http://schemas.microsoft.com/office/word/2010/wordml" xmlns:w15="http://schemas.microsoft.com/office/word/2012/wordml" xmlns:w16cex="http://schemas.microsoft.com/office/word/2018/wordml/cex" xmlns:w16cid="http://schemas.microsoft.com/office/word/2016/wordml/cid" xmlns:w16="http://schemas.microsoft.com/office/word/2018/wordml" xmlns:w16du="http://schemas.microsoft.com/office/word/2023/wordml/word16du" xmlns:w16sdtdh="http://schemas.microsoft.com/office/word/2020/wordml/sdtdatahash" xmlns:w16sdtfl="http://schemas.microsoft.com/office/word/2024/wordml/sdtformatlock" xmlns:w16se="http://schemas.microsoft.com/office/word/2015/wordml/symex" xmlns:wpg="http://schemas.microsoft.com/office/word/2010/wordprocessingGroup" xmlns:wpi="http://schemas.microsoft.com/office/word/2010/wordprocessingInk" xmlns:wne="http://schemas.microsoft.com/office/word/2006/wordml" xmlns:wps="http://schemas.microsoft.com/office/word/2010/wordprocessingShape" mc:Ignorable="w14 w15 w16se w16cid w16 w16cex w16sdtdh w16sdtfl w16du wp14">
+<w:numbering xmlns:wpc="http://schemas.microsoft.com/office/word/2010/wordprocessingCanvas" xmlns:cx="http://schemas.microsoft.com/office/drawing/2014/chartex" xmlns:cx1="http://schemas.microsoft.com/office/drawing/2015/9/8/chartex" xmlns:cx2="http://schemas.microsoft.com/office/drawing/2015/10/21/chartex" xmlns:cx3="http://schemas.microsoft.com/office/drawing/2016/5/9/chartex" xmlns:cx4="http://schemas.microsoft.com/office/drawing/2016/5/10/chartex" xmlns:cx5="http://schemas.microsoft.com/office/drawing/2016/5/11/chartex" xmlns:cx6="http://schemas.microsoft.com/office/drawing/2016/5/12/chartex" xmlns:cx7="http://schemas.microsoft.com/office/drawing/2016/5/13/chartex" xmlns:cx8="http://schemas.microsoft.com/office/drawing/2016/5/14/chartex" xmlns:mc="http://schemas.openxmlformats.org/markup-compatibility/2006" xmlns:aink="http://schemas.microsoft.com/office/drawing/2016/ink" xmlns:am3d="http://schemas.microsoft.com/office/drawing/2017/model3d" xmlns:o="urn:schemas-microsoft-com:office:office" xmlns:r="http://schemas.openxmlformats.org/officeDocument/2006/relationships" xmlns:m="http://schemas.openxmlformats.org/officeDocument/2006/math" xmlns:v="urn:schemas-microsoft-com:vml" xmlns:wp14="http://schemas.microsoft.com/office/word/2010/wordprocessingDrawing" xmlns:wp="http://schemas.openxmlformats.org/drawingml/2006/wordprocessingDrawing" xmlns:w10="urn:schemas-microsoft-com:office:word" xmlns:w="http://schemas.openxmlformats.org/wordprocessingml/2006/main" xmlns:w14="http://schemas.microsoft.com/office/word/2010/wordml" xmlns:w15="http://schemas.microsoft.com/office/word/2012/wordml" xmlns:w16cid="http://schemas.microsoft.com/office/word/2016/wordml/cid" xmlns:w16se="http://schemas.microsoft.com/office/word/2015/wordml/symex" xmlns:wpg="http://schemas.microsoft.com/office/word/2010/wordprocessingGroup" xmlns:wpi="http://schemas.microsoft.com/office/word/2010/wordprocessingInk" xmlns:wne="http://schemas.microsoft.com/office/word/2006/wordml" xmlns:wps="http://schemas.microsoft.com/office/word/2010/wordprocessingShape" mc:Ignorable="w14 w15 w16se w16cid wp14">
   <w:abstractNum w:abstractNumId="0" w15:restartNumberingAfterBreak="0">
     <w:nsid w:val="0C3176C9"/>
     <w:multiLevelType w:val="hybridMultilevel"/>
@@ -11263,13 +11868,13 @@
       </w:rPr>
     </w:lvl>
   </w:abstractNum>
-  <w:num w:numId="1" w16cid:durableId="130832900">
+  <w:num w:numId="1">
     <w:abstractNumId w:val="11"/>
   </w:num>
-  <w:num w:numId="2" w16cid:durableId="1310399806">
+  <w:num w:numId="2">
     <w:abstractNumId w:val="10"/>
   </w:num>
-  <w:num w:numId="3" w16cid:durableId="1886523196">
+  <w:num w:numId="3">
     <w:abstractNumId w:val="11"/>
     <w:lvlOverride w:ilvl="0">
       <w:startOverride w:val="1"/>
@@ -11299,53 +11904,53 @@
       <w:startOverride w:val="1"/>
     </w:lvlOverride>
   </w:num>
-  <w:num w:numId="4" w16cid:durableId="1619340320">
+  <w:num w:numId="4">
     <w:abstractNumId w:val="5"/>
   </w:num>
-  <w:num w:numId="5" w16cid:durableId="1442144842">
+  <w:num w:numId="5">
     <w:abstractNumId w:val="12"/>
   </w:num>
-  <w:num w:numId="6" w16cid:durableId="1000885684">
+  <w:num w:numId="6">
     <w:abstractNumId w:val="6"/>
   </w:num>
-  <w:num w:numId="7" w16cid:durableId="577057012">
+  <w:num w:numId="7">
     <w:abstractNumId w:val="8"/>
   </w:num>
-  <w:num w:numId="8" w16cid:durableId="1508593699">
+  <w:num w:numId="8">
     <w:abstractNumId w:val="2"/>
   </w:num>
-  <w:num w:numId="9" w16cid:durableId="1321428923">
+  <w:num w:numId="9">
     <w:abstractNumId w:val="14"/>
   </w:num>
-  <w:num w:numId="10" w16cid:durableId="1799956066">
+  <w:num w:numId="10">
     <w:abstractNumId w:val="1"/>
   </w:num>
-  <w:num w:numId="11" w16cid:durableId="1346203982">
+  <w:num w:numId="11">
     <w:abstractNumId w:val="15"/>
   </w:num>
-  <w:num w:numId="12" w16cid:durableId="463815608">
+  <w:num w:numId="12">
     <w:abstractNumId w:val="13"/>
   </w:num>
-  <w:num w:numId="13" w16cid:durableId="72824790">
+  <w:num w:numId="13">
     <w:abstractNumId w:val="7"/>
   </w:num>
-  <w:num w:numId="14" w16cid:durableId="432365227">
+  <w:num w:numId="14">
     <w:abstractNumId w:val="3"/>
   </w:num>
-  <w:num w:numId="15" w16cid:durableId="2055621048">
+  <w:num w:numId="15">
     <w:abstractNumId w:val="0"/>
   </w:num>
-  <w:num w:numId="16" w16cid:durableId="2100636631">
+  <w:num w:numId="16">
     <w:abstractNumId w:val="4"/>
   </w:num>
-  <w:num w:numId="17" w16cid:durableId="2103332710">
+  <w:num w:numId="17">
     <w:abstractNumId w:val="9"/>
   </w:num>
 </w:numbering>
 </file>
 
 <file path=word/styles.xml><?xml version="1.0" encoding="utf-8"?>
-<w:styles xmlns:mc="http://schemas.openxmlformats.org/markup-compatibility/2006" xmlns:r="http://schemas.openxmlformats.org/officeDocument/2006/relationships" xmlns:w="http://schemas.openxmlformats.org/wordprocessingml/2006/main" xmlns:w14="http://schemas.microsoft.com/office/word/2010/wordml" xmlns:w15="http://schemas.microsoft.com/office/word/2012/wordml" xmlns:w16cex="http://schemas.microsoft.com/office/word/2018/wordml/cex" xmlns:w16cid="http://schemas.microsoft.com/office/word/2016/wordml/cid" xmlns:w16="http://schemas.microsoft.com/office/word/2018/wordml" xmlns:w16du="http://schemas.microsoft.com/office/word/2023/wordml/word16du" xmlns:w16sdtdh="http://schemas.microsoft.com/office/word/2020/wordml/sdtdatahash" xmlns:w16sdtfl="http://schemas.microsoft.com/office/word/2024/wordml/sdtformatlock" xmlns:w16se="http://schemas.microsoft.com/office/word/2015/wordml/symex" mc:Ignorable="w14 w15 w16se w16cid w16 w16cex w16sdtdh w16sdtfl w16du">
+<w:styles xmlns:mc="http://schemas.openxmlformats.org/markup-compatibility/2006" xmlns:r="http://schemas.openxmlformats.org/officeDocument/2006/relationships" xmlns:w="http://schemas.openxmlformats.org/wordprocessingml/2006/main" xmlns:w14="http://schemas.microsoft.com/office/word/2010/wordml" xmlns:w15="http://schemas.microsoft.com/office/word/2012/wordml" xmlns:w16cid="http://schemas.microsoft.com/office/word/2016/wordml/cid" xmlns:w16se="http://schemas.microsoft.com/office/word/2015/wordml/symex" mc:Ignorable="w14 w15 w16se w16cid">
   <w:docDefaults>
     <w:rPrDefault>
       <w:rPr>
@@ -11361,7 +11966,7 @@
       </w:pPr>
     </w:pPrDefault>
   </w:docDefaults>
-  <w:latentStyles w:defLockedState="0" w:defUIPriority="99" w:defSemiHidden="0" w:defUnhideWhenUsed="0" w:defQFormat="0" w:count="376">
+  <w:latentStyles w:defLockedState="0" w:defUIPriority="99" w:defSemiHidden="0" w:defUnhideWhenUsed="0" w:defQFormat="0" w:count="375">
     <w:lsdException w:name="Normal" w:uiPriority="0" w:qFormat="1"/>
     <w:lsdException w:name="heading 1" w:uiPriority="9" w:qFormat="1"/>
     <w:lsdException w:name="heading 2" w:semiHidden="1" w:uiPriority="9" w:unhideWhenUsed="1" w:qFormat="1"/>
@@ -11737,7 +12342,6 @@
     <w:lsdException w:name="Smart Hyperlink" w:semiHidden="1" w:unhideWhenUsed="1"/>
     <w:lsdException w:name="Hashtag" w:semiHidden="1" w:unhideWhenUsed="1"/>
     <w:lsdException w:name="Unresolved Mention" w:semiHidden="1" w:unhideWhenUsed="1"/>
-    <w:lsdException w:name="Smart Link" w:semiHidden="1" w:unhideWhenUsed="1"/>
   </w:latentStyles>
   <w:style w:type="paragraph" w:default="1" w:styleId="Normal">
     <w:name w:val="Normal"/>
@@ -12667,7 +13271,7 @@
 </file>
 
 <file path=customXml/itemProps1.xml><?xml version="1.0" encoding="utf-8"?>
-<ds:datastoreItem xmlns:ds="http://schemas.openxmlformats.org/officeDocument/2006/customXml" ds:itemID="{DAC84F16-B9CD-4E72-8042-2B0C4FD33192}">
+<ds:datastoreItem xmlns:ds="http://schemas.openxmlformats.org/officeDocument/2006/customXml" ds:itemID="{6A0DD4F9-AF8A-4612-A02D-D07EF6717FAF}">
   <ds:schemaRefs>
     <ds:schemaRef ds:uri="http://schemas.openxmlformats.org/officeDocument/2006/bibliography"/>
   </ds:schemaRefs>

</xml_diff>